<commit_message>
se configura y habilita el redireccionamiento global con unicast
</commit_message>
<xml_diff>
--- a/EscritoLab3_RD.docx
+++ b/EscritoLab3_RD.docx
@@ -1,208 +1,99 @@
 
 <file path=word/document.xml><?xml version="1.0" encoding="utf-8"?>
-<w:document xmlns:wpc="http://schemas.microsoft.com/office/word/2010/wordprocessingCanvas" xmlns:cx="http://schemas.microsoft.com/office/drawing/2014/chartex" xmlns:cx1="http://schemas.microsoft.com/office/drawing/2015/9/8/chartex" xmlns:cx2="http://schemas.microsoft.com/office/drawing/2015/10/21/chartex" xmlns:cx3="http://schemas.microsoft.com/office/drawing/2016/5/9/chartex" xmlns:cx4="http://schemas.microsoft.com/office/drawing/2016/5/10/chartex" xmlns:cx5="http://schemas.microsoft.com/office/drawing/2016/5/11/chartex" xmlns:cx6="http://schemas.microsoft.com/office/drawing/2016/5/12/chartex" xmlns:cx7="http://schemas.microsoft.com/office/drawing/2016/5/13/chartex" xmlns:cx8="http://schemas.microsoft.com/office/drawing/2016/5/14/chartex" xmlns:mc="http://schemas.openxmlformats.org/markup-compatibility/2006" xmlns:aink="http://schemas.microsoft.com/office/drawing/2016/ink" xmlns:am3d="http://schemas.microsoft.com/office/drawing/2017/model3d" xmlns:o="urn:schemas-microsoft-com:office:office" xmlns:r="http://schemas.openxmlformats.org/officeDocument/2006/relationships" xmlns:m="http://schemas.openxmlformats.org/officeDocument/2006/math" xmlns:v="urn:schemas-microsoft-com:vml" xmlns:wp14="http://schemas.microsoft.com/office/word/2010/wordprocessingDrawing" xmlns:wp="http://schemas.openxmlformats.org/drawingml/2006/wordprocessingDrawing" xmlns:w10="urn:schemas-microsoft-com:office:word" xmlns:w="http://schemas.openxmlformats.org/wordprocessingml/2006/main" xmlns:w14="http://schemas.microsoft.com/office/word/2010/wordml" xmlns:w15="http://schemas.microsoft.com/office/word/2012/wordml" xmlns:w16cex="http://schemas.microsoft.com/office/word/2018/wordml/cex" xmlns:w16cid="http://schemas.microsoft.com/office/word/2016/wordml/cid" xmlns:w16="http://schemas.microsoft.com/office/word/2018/wordml" xmlns:w16sdtdh="http://schemas.microsoft.com/office/word/2020/wordml/sdtdatahash" xmlns:w16se="http://schemas.microsoft.com/office/word/2015/wordml/symex" xmlns:wpg="http://schemas.microsoft.com/office/word/2010/wordprocessingGroup" xmlns:wpi="http://schemas.microsoft.com/office/word/2010/wordprocessingInk" xmlns:wne="http://schemas.microsoft.com/office/word/2006/wordml" xmlns:wps="http://schemas.microsoft.com/office/word/2010/wordprocessingShape" mc:Ignorable="w14 w15 w16se w16cid w16 w16cex w16sdtdh wp14">
+<w:document xmlns:wpc="http://schemas.microsoft.com/office/word/2010/wordprocessingCanvas" xmlns:cx="http://schemas.microsoft.com/office/drawing/2014/chartex" xmlns:cx1="http://schemas.microsoft.com/office/drawing/2015/9/8/chartex" xmlns:cx2="http://schemas.microsoft.com/office/drawing/2015/10/21/chartex" xmlns:cx3="http://schemas.microsoft.com/office/drawing/2016/5/9/chartex" xmlns:cx4="http://schemas.microsoft.com/office/drawing/2016/5/10/chartex" xmlns:cx5="http://schemas.microsoft.com/office/drawing/2016/5/11/chartex" xmlns:cx6="http://schemas.microsoft.com/office/drawing/2016/5/12/chartex" xmlns:cx7="http://schemas.microsoft.com/office/drawing/2016/5/13/chartex" xmlns:cx8="http://schemas.microsoft.com/office/drawing/2016/5/14/chartex" xmlns:mc="http://schemas.openxmlformats.org/markup-compatibility/2006" xmlns:aink="http://schemas.microsoft.com/office/drawing/2016/ink" xmlns:am3d="http://schemas.microsoft.com/office/drawing/2017/model3d" xmlns:o="urn:schemas-microsoft-com:office:office" xmlns:oel="http://schemas.microsoft.com/office/2019/extlst" xmlns:r="http://schemas.openxmlformats.org/officeDocument/2006/relationships" xmlns:m="http://schemas.openxmlformats.org/officeDocument/2006/math" xmlns:v="urn:schemas-microsoft-com:vml" xmlns:wp14="http://schemas.microsoft.com/office/word/2010/wordprocessingDrawing" xmlns:wp="http://schemas.openxmlformats.org/drawingml/2006/wordprocessingDrawing" xmlns:w10="urn:schemas-microsoft-com:office:word" xmlns:w="http://schemas.openxmlformats.org/wordprocessingml/2006/main" xmlns:w14="http://schemas.microsoft.com/office/word/2010/wordml" xmlns:w15="http://schemas.microsoft.com/office/word/2012/wordml" xmlns:w16cex="http://schemas.microsoft.com/office/word/2018/wordml/cex" xmlns:w16cid="http://schemas.microsoft.com/office/word/2016/wordml/cid" xmlns:w16="http://schemas.microsoft.com/office/word/2018/wordml" xmlns:w16du="http://schemas.microsoft.com/office/word/2023/wordml/word16du" xmlns:w16sdtdh="http://schemas.microsoft.com/office/word/2020/wordml/sdtdatahash" xmlns:w16sdtfl="http://schemas.microsoft.com/office/word/2024/wordml/sdtformatlock" xmlns:w16se="http://schemas.microsoft.com/office/word/2015/wordml/symex" xmlns:wpg="http://schemas.microsoft.com/office/word/2010/wordprocessingGroup" xmlns:wpi="http://schemas.microsoft.com/office/word/2010/wordprocessingInk" xmlns:wne="http://schemas.microsoft.com/office/word/2006/wordml" xmlns:wps="http://schemas.microsoft.com/office/word/2010/wordprocessingShape" mc:Ignorable="w14 w15 w16se w16cid w16 w16cex w16sdtdh w16sdtfl w16du wp14">
   <w:body>
     <w:p>
-      <w:pPr>
-        <w:rPr>
-          <w:lang w:val="es-CO"/>
-        </w:rPr>
-      </w:pPr>
-      <w:r>
-        <w:rPr>
-          <w:lang w:val="es-CO"/>
-        </w:rPr>
+      <w:r>
         <w:t>SLAAC es un servicio que</w:t>
       </w:r>
       <w:r>
-        <w:rPr>
-          <w:lang w:val="es-CO"/>
-        </w:rPr>
         <w:t>, a diferencia de DHCPv6 (aunque se tiene la posibilidad de usar ambos),</w:t>
       </w:r>
       <w:r>
-        <w:rPr>
-          <w:lang w:val="es-CO"/>
-        </w:rPr>
         <w:t xml:space="preserve"> no requiere el uso de servidores para almacenar información de las direcciones</w:t>
       </w:r>
       <w:r>
-        <w:rPr>
-          <w:lang w:val="es-CO"/>
-        </w:rPr>
         <w:t xml:space="preserve"> de </w:t>
       </w:r>
       <w:proofErr w:type="spellStart"/>
       <w:r>
-        <w:rPr>
-          <w:lang w:val="es-CO"/>
-        </w:rPr>
         <w:t>unidifusion</w:t>
       </w:r>
       <w:proofErr w:type="spellEnd"/>
       <w:r>
-        <w:rPr>
-          <w:lang w:val="es-CO"/>
-        </w:rPr>
         <w:t xml:space="preserve"> globales</w:t>
       </w:r>
       <w:r>
-        <w:rPr>
-          <w:lang w:val="es-CO"/>
-        </w:rPr>
         <w:t xml:space="preserve"> de red con el fin de saber que direcciones IPv6 se están utilizando y cuales están disponibles. Este utiliza mensajes ICMPv6 RA (</w:t>
       </w:r>
       <w:proofErr w:type="spellStart"/>
       <w:r>
-        <w:rPr>
-          <w:lang w:val="es-CO"/>
-        </w:rPr>
         <w:t>Router</w:t>
       </w:r>
       <w:proofErr w:type="spellEnd"/>
       <w:r>
-        <w:rPr>
-          <w:lang w:val="es-CO"/>
-        </w:rPr>
         <w:t xml:space="preserve"> </w:t>
       </w:r>
       <w:proofErr w:type="spellStart"/>
       <w:r>
-        <w:rPr>
-          <w:lang w:val="es-CO"/>
-        </w:rPr>
         <w:t>Advertisement</w:t>
       </w:r>
       <w:proofErr w:type="spellEnd"/>
       <w:r>
-        <w:rPr>
-          <w:lang w:val="es-CO"/>
-        </w:rPr>
         <w:t>) para proporcionar direccionamiento y cualquier otra información de configuración</w:t>
       </w:r>
       <w:r>
-        <w:rPr>
-          <w:lang w:val="es-CO"/>
-        </w:rPr>
-        <w:t xml:space="preserve"> que normalmente proporcionaría un servidor DHCP. </w:t>
-      </w:r>
-      <w:r>
-        <w:rPr>
-          <w:lang w:val="es-CO"/>
-        </w:rPr>
-        <w:t xml:space="preserve">Un host configura su dirección IPv6 en función de la información que se envía en la RA. Los mensajes RA son enviados por un </w:t>
-      </w:r>
-      <w:proofErr w:type="spellStart"/>
-      <w:r>
-        <w:rPr>
-          <w:lang w:val="es-CO"/>
-        </w:rPr>
+        <w:t xml:space="preserve"> que normalmente proporcionaría un servidor DHCP. Un host configura su dirección IPv6 en función de la información que se envía en la RA. Los mensajes RA son enviados por un </w:t>
+      </w:r>
+      <w:proofErr w:type="spellStart"/>
+      <w:r>
         <w:t>router</w:t>
       </w:r>
       <w:proofErr w:type="spellEnd"/>
       <w:r>
-        <w:rPr>
-          <w:lang w:val="es-CO"/>
-        </w:rPr>
-        <w:t xml:space="preserve"> IPv6 cada 200 segundos.</w:t>
-      </w:r>
-      <w:r>
-        <w:rPr>
-          <w:lang w:val="es-CO"/>
-        </w:rPr>
+        <w:t xml:space="preserve"> IPv6 cada 200 segundos. Un host también puede enviar un mensaje </w:t>
+      </w:r>
+      <w:proofErr w:type="spellStart"/>
+      <w:r>
+        <w:t>Router</w:t>
+      </w:r>
+      <w:proofErr w:type="spellEnd"/>
+      <w:r>
         <w:t xml:space="preserve"> </w:t>
       </w:r>
-      <w:r>
-        <w:rPr>
-          <w:lang w:val="es-CO"/>
-        </w:rPr>
-        <w:t xml:space="preserve">Un host también puede enviar un mensaje </w:t>
-      </w:r>
-      <w:proofErr w:type="spellStart"/>
-      <w:r>
-        <w:rPr>
-          <w:lang w:val="es-CO"/>
-        </w:rPr>
-        <w:t>Router</w:t>
-      </w:r>
-      <w:proofErr w:type="spellEnd"/>
-      <w:r>
-        <w:rPr>
-          <w:lang w:val="es-CO"/>
-        </w:rPr>
-        <w:t xml:space="preserve"> </w:t>
-      </w:r>
-      <w:proofErr w:type="spellStart"/>
-      <w:r>
-        <w:rPr>
-          <w:lang w:val="es-CO"/>
-        </w:rPr>
+      <w:proofErr w:type="spellStart"/>
+      <w:r>
         <w:t>Solicitation</w:t>
       </w:r>
       <w:proofErr w:type="spellEnd"/>
       <w:r>
-        <w:rPr>
-          <w:lang w:val="es-CO"/>
-        </w:rPr>
         <w:t xml:space="preserve"> (RS) solicitando que un </w:t>
       </w:r>
       <w:proofErr w:type="spellStart"/>
       <w:r>
-        <w:rPr>
-          <w:lang w:val="es-CO"/>
-        </w:rPr>
         <w:t>router</w:t>
       </w:r>
       <w:proofErr w:type="spellEnd"/>
       <w:r>
-        <w:rPr>
-          <w:lang w:val="es-CO"/>
-        </w:rPr>
         <w:t xml:space="preserve"> habilitado para IPv6 envíe al host un RA.</w:t>
       </w:r>
     </w:p>
     <w:p>
-      <w:pPr>
-        <w:rPr>
-          <w:lang w:val="es-CO"/>
-        </w:rPr>
-      </w:pPr>
-      <w:r>
-        <w:rPr>
-          <w:lang w:val="es-CO"/>
-        </w:rPr>
+      <w:r>
         <w:t xml:space="preserve">En </w:t>
       </w:r>
       <w:r>
-        <w:rPr>
-          <w:lang w:val="es-CO"/>
-        </w:rPr>
         <w:t>sí</w:t>
       </w:r>
       <w:r>
-        <w:rPr>
-          <w:lang w:val="es-CO"/>
-        </w:rPr>
-        <w:t xml:space="preserve">, </w:t>
-      </w:r>
-      <w:r>
-        <w:rPr>
-          <w:lang w:val="es-CO"/>
-        </w:rPr>
-        <w:t xml:space="preserve">es un método que permite que un dispositivo obtenga su prefijo, la longitud de prefijo, la dirección de </w:t>
-      </w:r>
-      <w:proofErr w:type="spellStart"/>
-      <w:r>
-        <w:rPr>
-          <w:lang w:val="es-CO"/>
-        </w:rPr>
+        <w:t xml:space="preserve">, es un método que permite que un dispositivo obtenga su prefijo, la longitud de prefijo, la dirección de </w:t>
+      </w:r>
+      <w:proofErr w:type="spellStart"/>
+      <w:r>
         <w:t>gateway</w:t>
       </w:r>
       <w:proofErr w:type="spellEnd"/>
       <w:r>
-        <w:rPr>
-          <w:lang w:val="es-CO"/>
-        </w:rPr>
         <w:t xml:space="preserve"> predeterminado y otra información de un </w:t>
       </w:r>
       <w:proofErr w:type="spellStart"/>
@@ -210,7 +101,6 @@
         <w:rPr>
           <w:i/>
           <w:iCs/>
-          <w:lang w:val="es-CO"/>
         </w:rPr>
         <w:t>router</w:t>
       </w:r>
@@ -219,110 +109,61 @@
         <w:rPr>
           <w:i/>
           <w:iCs/>
-          <w:lang w:val="es-CO"/>
         </w:rPr>
         <w:t xml:space="preserve"> IPv6</w:t>
       </w:r>
       <w:r>
-        <w:rPr>
-          <w:lang w:val="es-CO"/>
-        </w:rPr>
         <w:t xml:space="preserve">, sin usar un servidor DHCPv6. Mediante SLAAC, los dispositivos dependen de los mensajes de anuncio de </w:t>
       </w:r>
       <w:proofErr w:type="spellStart"/>
       <w:r>
-        <w:rPr>
-          <w:lang w:val="es-CO"/>
-        </w:rPr>
         <w:t>router</w:t>
       </w:r>
       <w:proofErr w:type="spellEnd"/>
       <w:r>
-        <w:rPr>
-          <w:lang w:val="es-CO"/>
-        </w:rPr>
         <w:t xml:space="preserve"> (RA) de ICMPv6 del </w:t>
       </w:r>
       <w:proofErr w:type="spellStart"/>
       <w:r>
-        <w:rPr>
-          <w:lang w:val="es-CO"/>
-        </w:rPr>
         <w:t>router</w:t>
       </w:r>
       <w:proofErr w:type="spellEnd"/>
       <w:r>
-        <w:rPr>
-          <w:lang w:val="es-CO"/>
-        </w:rPr>
         <w:t xml:space="preserve"> local para obtener la información necesaria.</w:t>
       </w:r>
     </w:p>
     <w:p>
-      <w:pPr>
-        <w:rPr>
-          <w:lang w:val="es-CO"/>
-        </w:rPr>
-      </w:pPr>
-      <w:r>
-        <w:rPr>
-          <w:lang w:val="es-CO"/>
-        </w:rPr>
+      <w:r>
         <w:t xml:space="preserve">El </w:t>
       </w:r>
       <w:proofErr w:type="spellStart"/>
       <w:r>
-        <w:rPr>
-          <w:lang w:val="es-CO"/>
-        </w:rPr>
         <w:t>routing</w:t>
       </w:r>
       <w:proofErr w:type="spellEnd"/>
       <w:r>
-        <w:rPr>
-          <w:lang w:val="es-CO"/>
-        </w:rPr>
         <w:t xml:space="preserve"> IPv6 no está habilitado de manera predeterminada. Para habilitar un </w:t>
       </w:r>
       <w:proofErr w:type="spellStart"/>
       <w:r>
-        <w:rPr>
-          <w:lang w:val="es-CO"/>
-        </w:rPr>
         <w:t>router</w:t>
       </w:r>
       <w:proofErr w:type="spellEnd"/>
       <w:r>
-        <w:rPr>
-          <w:lang w:val="es-CO"/>
-        </w:rPr>
         <w:t xml:space="preserve"> como </w:t>
       </w:r>
       <w:proofErr w:type="spellStart"/>
       <w:r>
-        <w:rPr>
-          <w:lang w:val="es-CO"/>
-        </w:rPr>
         <w:t>router</w:t>
       </w:r>
       <w:proofErr w:type="spellEnd"/>
       <w:r>
-        <w:rPr>
-          <w:lang w:val="es-CO"/>
-        </w:rPr>
-        <w:t xml:space="preserve"> IPv6, se debe usar el comando de configuración global </w:t>
-      </w:r>
-      <w:r>
-        <w:rPr>
-          <w:lang w:val="es-CO"/>
-        </w:rPr>
-        <w:t>“</w:t>
-      </w:r>
-      <w:r>
-        <w:rPr>
-          <w:b/>
-          <w:bCs/>
-          <w:lang w:val="es-CO"/>
+        <w:t xml:space="preserve"> IPv6, se debe usar el comando de configuración global “</w:t>
+      </w:r>
+      <w:r>
+        <w:rPr>
+          <w:b/>
+          <w:bCs/>
         </w:rPr>
         <w:t xml:space="preserve">ipv6 </w:t>
       </w:r>
@@ -331,7 +172,6 @@
         <w:rPr>
           <w:b/>
           <w:bCs/>
-          <w:lang w:val="es-CO"/>
         </w:rPr>
         <w:t>unicast-routing</w:t>
       </w:r>
@@ -340,52 +180,38 @@
         <w:rPr>
           <w:b/>
           <w:bCs/>
-          <w:lang w:val="es-CO"/>
         </w:rPr>
         <w:t>”</w:t>
       </w:r>
       <w:r>
-        <w:rPr>
-          <w:lang w:val="es-CO"/>
-        </w:rPr>
         <w:t>.</w:t>
       </w:r>
     </w:p>
     <w:p>
-      <w:pPr>
-        <w:rPr>
-          <w:lang w:val="es-CO"/>
-        </w:rPr>
-      </w:pPr>
-      <w:r>
-        <w:rPr>
-          <w:lang w:val="es-CO"/>
-        </w:rPr>
-        <w:t xml:space="preserve">Como se menciono anteriormente, </w:t>
-      </w:r>
-      <w:r>
-        <w:rPr>
-          <w:lang w:val="es-CO"/>
-        </w:rPr>
-        <w:t>SLAAC utiliza los siguientes mensajes ICMPv6 para proporcionar direccionamiento IPv6:</w:t>
-      </w:r>
-    </w:p>
-    <w:p>
-      <w:pPr>
-        <w:pStyle w:val="ListParagraph"/>
+      <w:r>
+        <w:t xml:space="preserve">Como se </w:t>
+      </w:r>
+      <w:proofErr w:type="spellStart"/>
+      <w:r>
+        <w:t>menciono</w:t>
+      </w:r>
+      <w:proofErr w:type="spellEnd"/>
+      <w:r>
+        <w:t xml:space="preserve"> anteriormente, SLAAC utiliza los siguientes mensajes ICMPv6 para proporcionar direccionamiento IPv6:</w:t>
+      </w:r>
+    </w:p>
+    <w:p>
+      <w:pPr>
+        <w:pStyle w:val="Prrafodelista"/>
         <w:numPr>
           <w:ilvl w:val="0"/>
           <w:numId w:val="1"/>
         </w:numPr>
-        <w:rPr>
-          <w:lang w:val="es-CO"/>
-        </w:rPr>
-      </w:pPr>
-      <w:r>
-        <w:rPr>
-          <w:b/>
-          <w:bCs/>
-          <w:lang w:val="es-CO"/>
+      </w:pPr>
+      <w:r>
+        <w:rPr>
+          <w:b/>
+          <w:bCs/>
         </w:rPr>
         <w:t xml:space="preserve">Mensaje de solicitud del </w:t>
       </w:r>
@@ -394,7 +220,6 @@
         <w:rPr>
           <w:b/>
           <w:bCs/>
-          <w:lang w:val="es-CO"/>
         </w:rPr>
         <w:t>router</w:t>
       </w:r>
@@ -403,23 +228,22 @@
         <w:rPr>
           <w:b/>
           <w:bCs/>
-          <w:lang w:val="es-CO"/>
-        </w:rPr>
-        <w:t xml:space="preserve"> (RS</w:t>
-      </w:r>
-      <w:r>
-        <w:rPr>
-          <w:b/>
-          <w:bCs/>
-          <w:lang w:val="es-CO"/>
-        </w:rPr>
-        <w:t>,</w:t>
-      </w:r>
-      <w:r>
-        <w:rPr>
-          <w:b/>
-          <w:bCs/>
-          <w:lang w:val="es-CO"/>
+        </w:rPr>
+        <w:t xml:space="preserve"> (RS, </w:t>
+      </w:r>
+      <w:proofErr w:type="spellStart"/>
+      <w:r>
+        <w:rPr>
+          <w:b/>
+          <w:bCs/>
+        </w:rPr>
+        <w:t>Router</w:t>
+      </w:r>
+      <w:proofErr w:type="spellEnd"/>
+      <w:r>
+        <w:rPr>
+          <w:b/>
+          <w:bCs/>
         </w:rPr>
         <w:t xml:space="preserve"> </w:t>
       </w:r>
@@ -428,25 +252,6 @@
         <w:rPr>
           <w:b/>
           <w:bCs/>
-          <w:lang w:val="es-CO"/>
-        </w:rPr>
-        <w:t>Router</w:t>
-      </w:r>
-      <w:proofErr w:type="spellEnd"/>
-      <w:r>
-        <w:rPr>
-          <w:b/>
-          <w:bCs/>
-          <w:lang w:val="es-CO"/>
-        </w:rPr>
-        <w:t xml:space="preserve"> </w:t>
-      </w:r>
-      <w:proofErr w:type="spellStart"/>
-      <w:r>
-        <w:rPr>
-          <w:b/>
-          <w:bCs/>
-          <w:lang w:val="es-CO"/>
         </w:rPr>
         <w:t>Solicitation</w:t>
       </w:r>
@@ -455,75 +260,49 @@
         <w:rPr>
           <w:b/>
           <w:bCs/>
-          <w:lang w:val="es-CO"/>
         </w:rPr>
         <w:t>);</w:t>
       </w:r>
       <w:r>
-        <w:rPr>
-          <w:lang w:val="es-CO"/>
-        </w:rPr>
         <w:t xml:space="preserve"> Cuando un cliente se configura para obtener su información de direccionamiento IPv6 automáticamente mediante SLAAC, éste envía un mensaje RS al </w:t>
       </w:r>
       <w:proofErr w:type="spellStart"/>
       <w:r>
-        <w:rPr>
-          <w:lang w:val="es-CO"/>
-        </w:rPr>
         <w:t>router</w:t>
       </w:r>
       <w:proofErr w:type="spellEnd"/>
       <w:r>
-        <w:rPr>
-          <w:lang w:val="es-CO"/>
-        </w:rPr>
         <w:t xml:space="preserve">. El mensaje RS se envía a la dirección </w:t>
       </w:r>
       <w:proofErr w:type="spellStart"/>
       <w:r>
-        <w:rPr>
-          <w:lang w:val="es-CO"/>
-        </w:rPr>
         <w:t>multicast</w:t>
       </w:r>
       <w:proofErr w:type="spellEnd"/>
       <w:r>
-        <w:rPr>
-          <w:lang w:val="es-CO"/>
-        </w:rPr>
         <w:t xml:space="preserve"> de todos los </w:t>
       </w:r>
       <w:proofErr w:type="spellStart"/>
       <w:r>
-        <w:rPr>
-          <w:lang w:val="es-CO"/>
-        </w:rPr>
         <w:t>routers</w:t>
       </w:r>
       <w:proofErr w:type="spellEnd"/>
       <w:r>
-        <w:rPr>
-          <w:lang w:val="es-CO"/>
-        </w:rPr>
         <w:t xml:space="preserve"> IPv6 FF02::2. Es un mensaje ICMPv6 tipo 133.</w:t>
       </w:r>
     </w:p>
     <w:p>
       <w:pPr>
-        <w:pStyle w:val="ListParagraph"/>
+        <w:pStyle w:val="Prrafodelista"/>
         <w:numPr>
           <w:ilvl w:val="0"/>
           <w:numId w:val="1"/>
         </w:numPr>
-        <w:rPr>
-          <w:lang w:val="es-CO"/>
-        </w:rPr>
-      </w:pPr>
-      <w:r>
-        <w:rPr>
-          <w:b/>
-          <w:bCs/>
-          <w:lang w:val="es-CO"/>
+      </w:pPr>
+      <w:r>
+        <w:rPr>
+          <w:b/>
+          <w:bCs/>
         </w:rPr>
         <w:t xml:space="preserve">Mensaje de anuncio del </w:t>
       </w:r>
@@ -532,7 +311,6 @@
         <w:rPr>
           <w:b/>
           <w:bCs/>
-          <w:lang w:val="es-CO"/>
         </w:rPr>
         <w:t>router</w:t>
       </w:r>
@@ -541,23 +319,22 @@
         <w:rPr>
           <w:b/>
           <w:bCs/>
-          <w:lang w:val="es-CO"/>
-        </w:rPr>
-        <w:t xml:space="preserve"> (RA</w:t>
-      </w:r>
-      <w:r>
-        <w:rPr>
-          <w:b/>
-          <w:bCs/>
-          <w:lang w:val="es-CO"/>
-        </w:rPr>
-        <w:t>,</w:t>
-      </w:r>
-      <w:r>
-        <w:rPr>
-          <w:b/>
-          <w:bCs/>
-          <w:lang w:val="es-CO"/>
+        </w:rPr>
+        <w:t xml:space="preserve"> (RA, </w:t>
+      </w:r>
+      <w:proofErr w:type="spellStart"/>
+      <w:r>
+        <w:rPr>
+          <w:b/>
+          <w:bCs/>
+        </w:rPr>
+        <w:t>Router</w:t>
+      </w:r>
+      <w:proofErr w:type="spellEnd"/>
+      <w:r>
+        <w:rPr>
+          <w:b/>
+          <w:bCs/>
         </w:rPr>
         <w:t xml:space="preserve"> </w:t>
       </w:r>
@@ -566,25 +343,6 @@
         <w:rPr>
           <w:b/>
           <w:bCs/>
-          <w:lang w:val="es-CO"/>
-        </w:rPr>
-        <w:t>Router</w:t>
-      </w:r>
-      <w:proofErr w:type="spellEnd"/>
-      <w:r>
-        <w:rPr>
-          <w:b/>
-          <w:bCs/>
-          <w:lang w:val="es-CO"/>
-        </w:rPr>
-        <w:t xml:space="preserve"> </w:t>
-      </w:r>
-      <w:proofErr w:type="spellStart"/>
-      <w:r>
-        <w:rPr>
-          <w:b/>
-          <w:bCs/>
-          <w:lang w:val="es-CO"/>
         </w:rPr>
         <w:t>Advertisement</w:t>
       </w:r>
@@ -593,70 +351,42 @@
         <w:rPr>
           <w:b/>
           <w:bCs/>
-          <w:lang w:val="es-CO"/>
         </w:rPr>
         <w:t>);</w:t>
       </w:r>
       <w:r>
-        <w:rPr>
-          <w:lang w:val="es-CO"/>
-        </w:rPr>
         <w:t xml:space="preserve"> Los </w:t>
       </w:r>
       <w:proofErr w:type="spellStart"/>
       <w:r>
-        <w:rPr>
-          <w:lang w:val="es-CO"/>
-        </w:rPr>
         <w:t>routers</w:t>
       </w:r>
       <w:proofErr w:type="spellEnd"/>
       <w:r>
-        <w:rPr>
-          <w:lang w:val="es-CO"/>
-        </w:rPr>
         <w:t xml:space="preserve"> envían mensajes RA para proporcionar información de direccionamiento IPv6 a los clientes. El mensaje RA incluye el prefijo y la longitud del prefijo del segmento local. Un </w:t>
       </w:r>
       <w:proofErr w:type="spellStart"/>
       <w:r>
-        <w:rPr>
-          <w:lang w:val="es-CO"/>
-        </w:rPr>
         <w:t>router</w:t>
       </w:r>
       <w:proofErr w:type="spellEnd"/>
       <w:r>
-        <w:rPr>
-          <w:lang w:val="es-CO"/>
-        </w:rPr>
         <w:t xml:space="preserve"> envía un mensaje RA periódicamente (configurable entre 4 y 1800 segundos) o en respuesta a un mensaje RS. Por defecto, los </w:t>
       </w:r>
       <w:proofErr w:type="spellStart"/>
       <w:r>
-        <w:rPr>
-          <w:lang w:val="es-CO"/>
-        </w:rPr>
         <w:t>routers</w:t>
       </w:r>
       <w:proofErr w:type="spellEnd"/>
       <w:r>
-        <w:rPr>
-          <w:lang w:val="es-CO"/>
-        </w:rPr>
         <w:t xml:space="preserve"> Cisco envían mensajes RA cada 200 segundos. Los mensajes RA siempre se envían a la dirección </w:t>
       </w:r>
       <w:proofErr w:type="spellStart"/>
       <w:r>
-        <w:rPr>
-          <w:lang w:val="es-CO"/>
-        </w:rPr>
         <w:t>multicast</w:t>
       </w:r>
       <w:proofErr w:type="spellEnd"/>
       <w:r>
-        <w:rPr>
-          <w:lang w:val="es-CO"/>
-        </w:rPr>
         <w:t xml:space="preserve"> de todos los nodos IPv6 FF02::1. Es un mensaje ICMPv6 tipo 134.</w:t>
       </w:r>
     </w:p>
@@ -665,138 +395,1385 @@
         <w:rPr>
           <w:b/>
           <w:bCs/>
-          <w:lang w:val="es-CO"/>
-        </w:rPr>
-      </w:pPr>
-      <w:r>
-        <w:rPr>
-          <w:b/>
-          <w:bCs/>
-          <w:lang w:val="es-CO"/>
+        </w:rPr>
+      </w:pPr>
+      <w:r>
+        <w:rPr>
+          <w:b/>
+          <w:bCs/>
         </w:rPr>
         <w:t>FUENTES UTILIZADOS:</w:t>
       </w:r>
     </w:p>
     <w:p>
-      <w:pPr>
-        <w:rPr>
-          <w:lang w:val="es-CO"/>
-        </w:rPr>
-      </w:pPr>
-      <w:r>
-        <w:rPr>
-          <w:lang w:val="es-CO"/>
-        </w:rPr>
+      <w:r>
         <w:t>https://ccnadesdecero.es/slaac/</w:t>
       </w:r>
     </w:p>
     <w:p>
-      <w:pPr>
-        <w:rPr>
-          <w:lang w:val="es-CO"/>
-        </w:rPr>
-      </w:pPr>
-      <w:r>
-        <w:rPr>
-          <w:lang w:val="es-CO"/>
-        </w:rPr>
+      <w:r>
         <w:t>https://elhacker.info/Cursos/Curso%20de%20Certificacion%20CCNA%20completo/ccna1/course/module7/7.2.4.3/7.2.4.3.html</w:t>
       </w:r>
     </w:p>
     <w:p>
-      <w:pPr>
-        <w:rPr>
-          <w:lang w:val="es-CO"/>
-        </w:rPr>
-      </w:pPr>
       <w:hyperlink r:id="rId5" w:history="1">
         <w:r>
           <w:rPr>
-            <w:rStyle w:val="Hyperlink"/>
-            <w:lang w:val="es-CO"/>
+            <w:rStyle w:val="Hipervnculo"/>
           </w:rPr>
           <w:t>https://learningnetwork.cisco.com/s/article/Analizando-DHCPv6-con-estado-y-sin-estado</w:t>
         </w:r>
       </w:hyperlink>
     </w:p>
     <w:p>
-      <w:pPr>
-        <w:rPr>
-          <w:lang w:val="es-CO"/>
-        </w:rPr>
-      </w:pPr>
-      <w:r>
-        <w:rPr>
-          <w:lang w:val="es-CO"/>
-        </w:rPr>
+      <w:r>
         <w:t>---</w:t>
       </w:r>
     </w:p>
     <w:p>
-      <w:pPr>
-        <w:rPr>
-          <w:lang w:val="es-CO"/>
-        </w:rPr>
-      </w:pPr>
-      <w:r>
-        <w:rPr>
-          <w:lang w:val="es-CO"/>
-        </w:rPr>
+      <w:r>
         <w:t xml:space="preserve">En </w:t>
       </w:r>
       <w:proofErr w:type="spellStart"/>
       <w:r>
-        <w:rPr>
-          <w:lang w:val="es-CO"/>
-        </w:rPr>
         <w:t>si</w:t>
       </w:r>
       <w:proofErr w:type="spellEnd"/>
       <w:r>
-        <w:rPr>
-          <w:lang w:val="es-CO"/>
-        </w:rPr>
         <w:t xml:space="preserve">, </w:t>
       </w:r>
       <w:r>
-        <w:rPr>
-          <w:lang w:val="es-CO"/>
-        </w:rPr>
-        <w:t>una de las diferencias clave entre IPv4 y IPv6 es el formato de sus direcciones, el IPv4 utilizando números decimales de 0-255 en forma X.X.X.X, mientras que IPv6 utiliza números hexadecimales de 0-</w:t>
-      </w:r>
-      <w:r>
-        <w:rPr>
-          <w:lang w:val="es-CO"/>
-        </w:rPr>
-        <w:t>65535</w:t>
-      </w:r>
-      <w:r>
-        <w:rPr>
-          <w:lang w:val="es-CO"/>
-        </w:rPr>
-        <w:t xml:space="preserve">, lo cual permite que las direcciones IPv6 tengan una cantidad considerablemente mayor que </w:t>
-      </w:r>
-      <w:r>
-        <w:rPr>
-          <w:lang w:val="es-CO"/>
-        </w:rPr>
+        <w:t xml:space="preserve">una de las diferencias clave entre IPv4 y IPv6 es el formato de sus direcciones, el IPv4 utilizando números decimales de 0-255 en forma X.X.X.X, mientras que IPv6 utiliza números hexadecimales de 0-65535, lo cual permite que las direcciones IPv6 tengan una cantidad considerablemente mayor que </w:t>
+      </w:r>
+      <w:r>
         <w:t>lo que permite el IPv4.</w:t>
       </w:r>
     </w:p>
     <w:p>
       <w:pPr>
         <w:rPr>
-          <w:lang w:val="es-CO"/>
-        </w:rPr>
-      </w:pPr>
-      <w:r>
-        <w:rPr>
-          <w:lang w:val="es-CO"/>
-        </w:rPr>
+          <w:b/>
+          <w:bCs/>
+        </w:rPr>
+      </w:pPr>
+      <w:r>
         <w:lastRenderedPageBreak/>
         <w:t>En nuestro caso, vimos que</w:t>
       </w:r>
-    </w:p>
+      <w:r>
+        <w:br/>
+      </w:r>
+      <w:r>
+        <w:br/>
+      </w:r>
+      <w:r>
+        <w:rPr>
+          <w:b/>
+          <w:bCs/>
+        </w:rPr>
+        <w:t>Implementación y Verificación de SLAAC</w:t>
+      </w:r>
+    </w:p>
+    <w:p>
+      <w:r>
+        <w:t xml:space="preserve">Para la puesta en marcha de la autoconfiguración sin estado (SLAAC), se procedió a la configuración de los </w:t>
+      </w:r>
+      <w:proofErr w:type="spellStart"/>
+      <w:r>
+        <w:t>routers</w:t>
+      </w:r>
+      <w:proofErr w:type="spellEnd"/>
+      <w:r>
+        <w:t xml:space="preserve"> extremos para que actuaran como fuentes de anuncios de red. El proceso se detalla a continuación:</w:t>
+      </w:r>
+    </w:p>
+    <w:p>
+      <w:pPr>
+        <w:rPr>
+          <w:b/>
+          <w:bCs/>
+        </w:rPr>
+      </w:pPr>
+      <w:r>
+        <w:rPr>
+          <w:b/>
+          <w:bCs/>
+        </w:rPr>
+        <w:t xml:space="preserve">5.1. Configuración del </w:t>
+      </w:r>
+      <w:proofErr w:type="spellStart"/>
+      <w:r>
+        <w:rPr>
+          <w:b/>
+          <w:bCs/>
+        </w:rPr>
+        <w:t>Router</w:t>
+      </w:r>
+      <w:proofErr w:type="spellEnd"/>
+      <w:r>
+        <w:rPr>
+          <w:b/>
+          <w:bCs/>
+        </w:rPr>
+        <w:t xml:space="preserve"> (Lado Servidor)</w:t>
+      </w:r>
+    </w:p>
+    <w:p>
+      <w:r>
+        <w:t xml:space="preserve">Se habilitó el enrutamiento de unidifusión IPv6 y se configuraron las interfaces LAN con sus respectivos prefijos globales. Esto permite que el </w:t>
+      </w:r>
+      <w:proofErr w:type="spellStart"/>
+      <w:r>
+        <w:t>router</w:t>
+      </w:r>
+      <w:proofErr w:type="spellEnd"/>
+      <w:r>
+        <w:t xml:space="preserve"> envíe mensajes </w:t>
+      </w:r>
+      <w:r>
+        <w:rPr>
+          <w:b/>
+          <w:bCs/>
+        </w:rPr>
+        <w:t>ICMPv6 Tipo 134 (</w:t>
+      </w:r>
+      <w:proofErr w:type="spellStart"/>
+      <w:r>
+        <w:rPr>
+          <w:b/>
+          <w:bCs/>
+        </w:rPr>
+        <w:t>Router</w:t>
+      </w:r>
+      <w:proofErr w:type="spellEnd"/>
+      <w:r>
+        <w:rPr>
+          <w:b/>
+          <w:bCs/>
+        </w:rPr>
+        <w:t xml:space="preserve"> </w:t>
+      </w:r>
+      <w:proofErr w:type="spellStart"/>
+      <w:r>
+        <w:rPr>
+          <w:b/>
+          <w:bCs/>
+        </w:rPr>
+        <w:t>Advertisement</w:t>
+      </w:r>
+      <w:proofErr w:type="spellEnd"/>
+      <w:r>
+        <w:rPr>
+          <w:b/>
+          <w:bCs/>
+        </w:rPr>
+        <w:t>)</w:t>
+      </w:r>
+      <w:r>
+        <w:t>.</w:t>
+      </w:r>
+    </w:p>
+    <w:p>
+      <w:pPr>
+        <w:rPr>
+          <w:b/>
+          <w:bCs/>
+        </w:rPr>
+      </w:pPr>
+      <w:r>
+        <w:rPr>
+          <w:b/>
+          <w:bCs/>
+        </w:rPr>
+        <w:t xml:space="preserve">Comandos aplicados (Ejemplo </w:t>
+      </w:r>
+      <w:proofErr w:type="spellStart"/>
+      <w:r>
+        <w:rPr>
+          <w:b/>
+          <w:bCs/>
+        </w:rPr>
+        <w:t>Router</w:t>
+      </w:r>
+      <w:proofErr w:type="spellEnd"/>
+      <w:r>
+        <w:rPr>
+          <w:b/>
+          <w:bCs/>
+        </w:rPr>
+        <w:t xml:space="preserve"> 1):</w:t>
+      </w:r>
+    </w:p>
+    <w:p>
+      <w:pPr>
+        <w:shd w:val="clear" w:color="auto" w:fill="F2F2F2" w:themeFill="background1" w:themeFillShade="F2"/>
+        <w:rPr>
+          <w:rFonts w:ascii="Times New Roman" w:hAnsi="Times New Roman" w:cs="Times New Roman"/>
+        </w:rPr>
+      </w:pPr>
+      <w:r>
+        <w:rPr>
+          <w:b/>
+          <w:bCs/>
+        </w:rPr>
+        <w:br/>
+      </w:r>
+      <w:r>
+        <w:rPr>
+          <w:rFonts w:ascii="Times New Roman" w:hAnsi="Times New Roman" w:cs="Times New Roman"/>
+        </w:rPr>
+        <w:t>Router-1(</w:t>
+      </w:r>
+      <w:proofErr w:type="spellStart"/>
+      <w:r>
+        <w:rPr>
+          <w:rFonts w:ascii="Times New Roman" w:hAnsi="Times New Roman" w:cs="Times New Roman"/>
+        </w:rPr>
+        <w:t>config</w:t>
+      </w:r>
+      <w:proofErr w:type="spellEnd"/>
+      <w:r>
+        <w:rPr>
+          <w:rFonts w:ascii="Times New Roman" w:hAnsi="Times New Roman" w:cs="Times New Roman"/>
+        </w:rPr>
+        <w:t xml:space="preserve">)# ipv6 </w:t>
+      </w:r>
+      <w:proofErr w:type="spellStart"/>
+      <w:r>
+        <w:rPr>
+          <w:rFonts w:ascii="Times New Roman" w:hAnsi="Times New Roman" w:cs="Times New Roman"/>
+        </w:rPr>
+        <w:t>unicast-routing</w:t>
+      </w:r>
+      <w:proofErr w:type="spellEnd"/>
+    </w:p>
+    <w:p>
+      <w:pPr>
+        <w:shd w:val="clear" w:color="auto" w:fill="F2F2F2" w:themeFill="background1" w:themeFillShade="F2"/>
+        <w:rPr>
+          <w:rFonts w:ascii="Times New Roman" w:hAnsi="Times New Roman" w:cs="Times New Roman"/>
+        </w:rPr>
+      </w:pPr>
+      <w:r>
+        <w:rPr>
+          <w:rFonts w:ascii="Times New Roman" w:hAnsi="Times New Roman" w:cs="Times New Roman"/>
+        </w:rPr>
+        <w:t>Router-1(</w:t>
+      </w:r>
+      <w:proofErr w:type="spellStart"/>
+      <w:r>
+        <w:rPr>
+          <w:rFonts w:ascii="Times New Roman" w:hAnsi="Times New Roman" w:cs="Times New Roman"/>
+        </w:rPr>
+        <w:t>config</w:t>
+      </w:r>
+      <w:proofErr w:type="spellEnd"/>
+      <w:r>
+        <w:rPr>
+          <w:rFonts w:ascii="Times New Roman" w:hAnsi="Times New Roman" w:cs="Times New Roman"/>
+        </w:rPr>
+        <w:t xml:space="preserve">)# </w:t>
+      </w:r>
+      <w:proofErr w:type="gramStart"/>
+      <w:r>
+        <w:rPr>
+          <w:rFonts w:ascii="Times New Roman" w:hAnsi="Times New Roman" w:cs="Times New Roman"/>
+        </w:rPr>
+        <w:t>interface</w:t>
+      </w:r>
+      <w:proofErr w:type="gramEnd"/>
+      <w:r>
+        <w:rPr>
+          <w:rFonts w:ascii="Times New Roman" w:hAnsi="Times New Roman" w:cs="Times New Roman"/>
+        </w:rPr>
+        <w:t xml:space="preserve"> GigabitEthernet0/0</w:t>
+      </w:r>
+    </w:p>
+    <w:p>
+      <w:pPr>
+        <w:shd w:val="clear" w:color="auto" w:fill="F2F2F2" w:themeFill="background1" w:themeFillShade="F2"/>
+        <w:rPr>
+          <w:rFonts w:ascii="Times New Roman" w:hAnsi="Times New Roman" w:cs="Times New Roman"/>
+        </w:rPr>
+      </w:pPr>
+      <w:r>
+        <w:rPr>
+          <w:rFonts w:ascii="Times New Roman" w:hAnsi="Times New Roman" w:cs="Times New Roman"/>
+        </w:rPr>
+        <w:t>Router-1(</w:t>
+      </w:r>
+      <w:proofErr w:type="spellStart"/>
+      <w:r>
+        <w:rPr>
+          <w:rFonts w:ascii="Times New Roman" w:hAnsi="Times New Roman" w:cs="Times New Roman"/>
+        </w:rPr>
+        <w:t>config-</w:t>
+      </w:r>
+      <w:proofErr w:type="gramStart"/>
+      <w:r>
+        <w:rPr>
+          <w:rFonts w:ascii="Times New Roman" w:hAnsi="Times New Roman" w:cs="Times New Roman"/>
+        </w:rPr>
+        <w:t>if</w:t>
+      </w:r>
+      <w:proofErr w:type="spellEnd"/>
+      <w:r>
+        <w:rPr>
+          <w:rFonts w:ascii="Times New Roman" w:hAnsi="Times New Roman" w:cs="Times New Roman"/>
+        </w:rPr>
+        <w:t>)#</w:t>
+      </w:r>
+      <w:proofErr w:type="gramEnd"/>
+      <w:r>
+        <w:rPr>
+          <w:rFonts w:ascii="Times New Roman" w:hAnsi="Times New Roman" w:cs="Times New Roman"/>
+        </w:rPr>
+        <w:t xml:space="preserve"> ipv6 </w:t>
+      </w:r>
+      <w:proofErr w:type="spellStart"/>
+      <w:r>
+        <w:rPr>
+          <w:rFonts w:ascii="Times New Roman" w:hAnsi="Times New Roman" w:cs="Times New Roman"/>
+        </w:rPr>
+        <w:t>address</w:t>
+      </w:r>
+      <w:proofErr w:type="spellEnd"/>
+      <w:r>
+        <w:rPr>
+          <w:rFonts w:ascii="Times New Roman" w:hAnsi="Times New Roman" w:cs="Times New Roman"/>
+        </w:rPr>
+        <w:t xml:space="preserve"> </w:t>
+      </w:r>
+      <w:proofErr w:type="gramStart"/>
+      <w:r>
+        <w:rPr>
+          <w:rFonts w:ascii="Times New Roman" w:hAnsi="Times New Roman" w:cs="Times New Roman"/>
+        </w:rPr>
+        <w:t>2001:DB8:CC1A</w:t>
+      </w:r>
+      <w:proofErr w:type="gramEnd"/>
+      <w:r>
+        <w:rPr>
+          <w:rFonts w:ascii="Times New Roman" w:hAnsi="Times New Roman" w:cs="Times New Roman"/>
+        </w:rPr>
+        <w:t>:1::1/64</w:t>
+      </w:r>
+    </w:p>
+    <w:p>
+      <w:pPr>
+        <w:shd w:val="clear" w:color="auto" w:fill="F2F2F2" w:themeFill="background1" w:themeFillShade="F2"/>
+        <w:rPr>
+          <w:rFonts w:ascii="Times New Roman" w:hAnsi="Times New Roman" w:cs="Times New Roman"/>
+        </w:rPr>
+      </w:pPr>
+      <w:r>
+        <w:rPr>
+          <w:rFonts w:ascii="Times New Roman" w:hAnsi="Times New Roman" w:cs="Times New Roman"/>
+        </w:rPr>
+        <w:t>Router-1(</w:t>
+      </w:r>
+      <w:proofErr w:type="spellStart"/>
+      <w:r>
+        <w:rPr>
+          <w:rFonts w:ascii="Times New Roman" w:hAnsi="Times New Roman" w:cs="Times New Roman"/>
+        </w:rPr>
+        <w:t>config-</w:t>
+      </w:r>
+      <w:proofErr w:type="gramStart"/>
+      <w:r>
+        <w:rPr>
+          <w:rFonts w:ascii="Times New Roman" w:hAnsi="Times New Roman" w:cs="Times New Roman"/>
+        </w:rPr>
+        <w:t>if</w:t>
+      </w:r>
+      <w:proofErr w:type="spellEnd"/>
+      <w:r>
+        <w:rPr>
+          <w:rFonts w:ascii="Times New Roman" w:hAnsi="Times New Roman" w:cs="Times New Roman"/>
+        </w:rPr>
+        <w:t>)#</w:t>
+      </w:r>
+      <w:proofErr w:type="gramEnd"/>
+      <w:r>
+        <w:rPr>
+          <w:rFonts w:ascii="Times New Roman" w:hAnsi="Times New Roman" w:cs="Times New Roman"/>
+        </w:rPr>
+        <w:t xml:space="preserve"> ipv6 </w:t>
+      </w:r>
+      <w:proofErr w:type="spellStart"/>
+      <w:r>
+        <w:rPr>
+          <w:rFonts w:ascii="Times New Roman" w:hAnsi="Times New Roman" w:cs="Times New Roman"/>
+        </w:rPr>
+        <w:t>address</w:t>
+      </w:r>
+      <w:proofErr w:type="spellEnd"/>
+      <w:r>
+        <w:rPr>
+          <w:rFonts w:ascii="Times New Roman" w:hAnsi="Times New Roman" w:cs="Times New Roman"/>
+        </w:rPr>
+        <w:t xml:space="preserve"> FE80::1 </w:t>
+      </w:r>
+      <w:proofErr w:type="gramStart"/>
+      <w:r>
+        <w:rPr>
+          <w:rFonts w:ascii="Times New Roman" w:hAnsi="Times New Roman" w:cs="Times New Roman"/>
+        </w:rPr>
+        <w:t>link</w:t>
+      </w:r>
+      <w:proofErr w:type="gramEnd"/>
+      <w:r>
+        <w:rPr>
+          <w:rFonts w:ascii="Times New Roman" w:hAnsi="Times New Roman" w:cs="Times New Roman"/>
+        </w:rPr>
+        <w:t>-local</w:t>
+      </w:r>
+    </w:p>
+    <w:p>
+      <w:pPr>
+        <w:shd w:val="clear" w:color="auto" w:fill="F2F2F2" w:themeFill="background1" w:themeFillShade="F2"/>
+        <w:rPr>
+          <w:rFonts w:ascii="Times New Roman" w:hAnsi="Times New Roman" w:cs="Times New Roman"/>
+        </w:rPr>
+      </w:pPr>
+      <w:r>
+        <w:rPr>
+          <w:rFonts w:ascii="Times New Roman" w:hAnsi="Times New Roman" w:cs="Times New Roman"/>
+        </w:rPr>
+        <w:t>Router-1(</w:t>
+      </w:r>
+      <w:proofErr w:type="spellStart"/>
+      <w:r>
+        <w:rPr>
+          <w:rFonts w:ascii="Times New Roman" w:hAnsi="Times New Roman" w:cs="Times New Roman"/>
+        </w:rPr>
+        <w:t>config-</w:t>
+      </w:r>
+      <w:proofErr w:type="gramStart"/>
+      <w:r>
+        <w:rPr>
+          <w:rFonts w:ascii="Times New Roman" w:hAnsi="Times New Roman" w:cs="Times New Roman"/>
+        </w:rPr>
+        <w:t>if</w:t>
+      </w:r>
+      <w:proofErr w:type="spellEnd"/>
+      <w:r>
+        <w:rPr>
+          <w:rFonts w:ascii="Times New Roman" w:hAnsi="Times New Roman" w:cs="Times New Roman"/>
+        </w:rPr>
+        <w:t>)#</w:t>
+      </w:r>
+      <w:proofErr w:type="gramEnd"/>
+      <w:r>
+        <w:rPr>
+          <w:rFonts w:ascii="Times New Roman" w:hAnsi="Times New Roman" w:cs="Times New Roman"/>
+        </w:rPr>
+        <w:t xml:space="preserve"> no shutdown</w:t>
+      </w:r>
+    </w:p>
+    <w:p>
+      <w:pPr>
+        <w:rPr>
+          <w:b/>
+          <w:bCs/>
+        </w:rPr>
+      </w:pPr>
+      <w:r>
+        <w:br/>
+      </w:r>
+      <w:r>
+        <w:rPr>
+          <w:b/>
+          <w:bCs/>
+        </w:rPr>
+        <w:t xml:space="preserve">Habilitación del Enrutamiento </w:t>
+      </w:r>
+      <w:proofErr w:type="spellStart"/>
+      <w:r>
+        <w:rPr>
+          <w:b/>
+          <w:bCs/>
+        </w:rPr>
+        <w:t>Unicast</w:t>
+      </w:r>
+      <w:proofErr w:type="spellEnd"/>
+      <w:r>
+        <w:rPr>
+          <w:b/>
+          <w:bCs/>
+        </w:rPr>
+        <w:t xml:space="preserve"> IPv6</w:t>
+      </w:r>
+    </w:p>
+    <w:p>
+      <w:r>
+        <w:t xml:space="preserve">Un paso crítico identificado durante la práctica fue la activación global del enrutamiento IPv6. Por defecto, los </w:t>
+      </w:r>
+      <w:proofErr w:type="spellStart"/>
+      <w:r>
+        <w:t>routers</w:t>
+      </w:r>
+      <w:proofErr w:type="spellEnd"/>
+      <w:r>
+        <w:t xml:space="preserve"> Cisco actúan como nodos finales y no reenvían paquetes IPv6 ni envían mensajes de anuncio (RA) a menos que se habilite explícitamente esta función. </w:t>
+      </w:r>
+    </w:p>
+    <w:p>
+      <w:r>
+        <w:t xml:space="preserve">Como se observa en la evidencia técnica del </w:t>
+      </w:r>
+      <w:proofErr w:type="spellStart"/>
+      <w:r>
+        <w:t>Router</w:t>
+      </w:r>
+      <w:proofErr w:type="spellEnd"/>
+      <w:r>
+        <w:t xml:space="preserve"> 1:</w:t>
+      </w:r>
+    </w:p>
+    <w:p>
+      <w:pPr>
+        <w:numPr>
+          <w:ilvl w:val="0"/>
+          <w:numId w:val="4"/>
+        </w:numPr>
+      </w:pPr>
+      <w:r>
+        <w:t xml:space="preserve">Validación Inicial: Al ejecutar </w:t>
+      </w:r>
+      <w:proofErr w:type="gramStart"/>
+      <w:r>
+        <w:t>show</w:t>
+      </w:r>
+      <w:proofErr w:type="gramEnd"/>
+      <w:r>
+        <w:t xml:space="preserve"> ipv6 </w:t>
+      </w:r>
+      <w:proofErr w:type="spellStart"/>
+      <w:r>
+        <w:t>protocols</w:t>
+      </w:r>
+      <w:proofErr w:type="spellEnd"/>
+      <w:r>
+        <w:t xml:space="preserve">, el </w:t>
+      </w:r>
+      <w:proofErr w:type="spellStart"/>
+      <w:r>
+        <w:t>router</w:t>
+      </w:r>
+      <w:proofErr w:type="spellEnd"/>
+      <w:r>
+        <w:t xml:space="preserve"> solo mostraba protocolos conectados y de descubrimiento (ND), indicando que el enrutamiento dinámico y el reenvío estaban inactivos.</w:t>
+      </w:r>
+    </w:p>
+    <w:p>
+      <w:pPr>
+        <w:numPr>
+          <w:ilvl w:val="0"/>
+          <w:numId w:val="4"/>
+        </w:numPr>
+      </w:pPr>
+      <w:r>
+        <w:t xml:space="preserve">Activación: Se ejecutó el comando de configuración global ipv6 </w:t>
+      </w:r>
+      <w:proofErr w:type="spellStart"/>
+      <w:r>
+        <w:t>unicast-routing</w:t>
+      </w:r>
+      <w:proofErr w:type="spellEnd"/>
+      <w:r>
+        <w:t xml:space="preserve">. </w:t>
+      </w:r>
+    </w:p>
+    <w:p>
+      <w:pPr>
+        <w:numPr>
+          <w:ilvl w:val="0"/>
+          <w:numId w:val="4"/>
+        </w:numPr>
+      </w:pPr>
+      <w:r>
+        <w:t xml:space="preserve">Impacto: Este comando permitió que el </w:t>
+      </w:r>
+      <w:proofErr w:type="spellStart"/>
+      <w:r>
+        <w:t>router</w:t>
+      </w:r>
+      <w:proofErr w:type="spellEnd"/>
+      <w:r>
+        <w:t xml:space="preserve"> comenzara a procesar el direccionamiento IPv6 en todas sus interfaces up/up y habilitó la capacidad de participar en el proceso de enrutamiento OSPFv3</w:t>
+      </w:r>
+    </w:p>
+    <w:p>
+      <w:pPr>
+        <w:rPr>
+          <w:b/>
+          <w:bCs/>
+        </w:rPr>
+      </w:pPr>
+      <w:r>
+        <w:rPr>
+          <w:b/>
+          <w:bCs/>
+        </w:rPr>
+        <w:br/>
+      </w:r>
+      <w:r>
+        <w:rPr>
+          <w:b/>
+          <w:bCs/>
+        </w:rPr>
+        <w:br/>
+      </w:r>
+      <w:r>
+        <w:rPr>
+          <w:b/>
+          <w:bCs/>
+        </w:rPr>
+        <w:t>Verificación en los Hosts</w:t>
+      </w:r>
+    </w:p>
+    <w:p>
+      <w:r>
+        <w:t xml:space="preserve">Una vez configurado el </w:t>
+      </w:r>
+      <w:proofErr w:type="spellStart"/>
+      <w:r>
+        <w:t>router</w:t>
+      </w:r>
+      <w:proofErr w:type="spellEnd"/>
+      <w:r>
+        <w:t>, se validó en los dispositivos finales (</w:t>
+      </w:r>
+      <w:r>
+        <w:rPr>
+          <w:b/>
+          <w:bCs/>
+        </w:rPr>
+        <w:t>PC00, PC01, PC02 y PC03</w:t>
+      </w:r>
+      <w:r>
+        <w:t xml:space="preserve">) el cambio de configuración de IP estática a </w:t>
+      </w:r>
+      <w:proofErr w:type="spellStart"/>
+      <w:r>
+        <w:rPr>
+          <w:b/>
+          <w:bCs/>
+        </w:rPr>
+        <w:t>Automatic</w:t>
+      </w:r>
+      <w:proofErr w:type="spellEnd"/>
+      <w:r>
+        <w:t>.</w:t>
+      </w:r>
+    </w:p>
+    <w:p>
+      <w:r>
+        <w:rPr>
+          <w:b/>
+          <w:bCs/>
+        </w:rPr>
+        <w:lastRenderedPageBreak/>
+        <w:t>Resultados obtenidos:</w:t>
+      </w:r>
+    </w:p>
+    <w:p>
+      <w:pPr>
+        <w:numPr>
+          <w:ilvl w:val="0"/>
+          <w:numId w:val="3"/>
+        </w:numPr>
+      </w:pPr>
+      <w:r>
+        <w:rPr>
+          <w:b/>
+          <w:bCs/>
+        </w:rPr>
+        <w:t>Asignación Exitosa:</w:t>
+      </w:r>
+      <w:r>
+        <w:t xml:space="preserve"> Los hosts recibieron el prefijo /64 correspondiente a su segmento y generaron su propia Identificación de Interfaz (</w:t>
+      </w:r>
+      <w:proofErr w:type="gramStart"/>
+      <w:r>
+        <w:t>Interface</w:t>
+      </w:r>
+      <w:proofErr w:type="gramEnd"/>
+      <w:r>
+        <w:t xml:space="preserve"> ID).</w:t>
+      </w:r>
+    </w:p>
+    <w:p>
+      <w:pPr>
+        <w:numPr>
+          <w:ilvl w:val="0"/>
+          <w:numId w:val="3"/>
+        </w:numPr>
+      </w:pPr>
+      <w:r>
+        <w:rPr>
+          <w:b/>
+          <w:bCs/>
+        </w:rPr>
+        <w:t>Gateway Predeterminado:</w:t>
+      </w:r>
+      <w:r>
+        <w:t xml:space="preserve"> Se verificó mediante el comando </w:t>
+      </w:r>
+      <w:proofErr w:type="spellStart"/>
+      <w:r>
+        <w:t>ipconfig</w:t>
+      </w:r>
+      <w:proofErr w:type="spellEnd"/>
+      <w:r>
+        <w:t xml:space="preserve"> que los </w:t>
+      </w:r>
+      <w:proofErr w:type="spellStart"/>
+      <w:r>
+        <w:t>PCs</w:t>
+      </w:r>
+      <w:proofErr w:type="spellEnd"/>
+      <w:r>
+        <w:t xml:space="preserve"> tomaron automáticamente la dirección </w:t>
+      </w:r>
+      <w:proofErr w:type="gramStart"/>
+      <w:r>
+        <w:rPr>
+          <w:b/>
+          <w:bCs/>
+        </w:rPr>
+        <w:t>Link</w:t>
+      </w:r>
+      <w:proofErr w:type="gramEnd"/>
+      <w:r>
+        <w:rPr>
+          <w:b/>
+          <w:bCs/>
+        </w:rPr>
+        <w:t>-Local</w:t>
+      </w:r>
+      <w:r>
+        <w:t xml:space="preserve"> del </w:t>
+      </w:r>
+      <w:proofErr w:type="spellStart"/>
+      <w:r>
+        <w:t>router</w:t>
+      </w:r>
+      <w:proofErr w:type="spellEnd"/>
+      <w:r>
+        <w:t xml:space="preserve"> (FE</w:t>
+      </w:r>
+      <w:proofErr w:type="gramStart"/>
+      <w:r>
+        <w:t>80::X</w:t>
+      </w:r>
+      <w:proofErr w:type="gramEnd"/>
+      <w:r>
+        <w:t>) como su puerta de enlace, validando así el intercambio de mensajes RS/RA.</w:t>
+      </w:r>
+    </w:p>
+    <w:p>
+      <w:pPr>
+        <w:numPr>
+          <w:ilvl w:val="0"/>
+          <w:numId w:val="3"/>
+        </w:numPr>
+      </w:pPr>
+      <w:r>
+        <w:rPr>
+          <w:b/>
+          <w:bCs/>
+        </w:rPr>
+        <w:t>Confirmación visual:</w:t>
+      </w:r>
+      <w:r>
+        <w:t xml:space="preserve"> En la interfaz de </w:t>
+      </w:r>
+      <w:proofErr w:type="spellStart"/>
+      <w:r>
+        <w:t>Packet</w:t>
+      </w:r>
+      <w:proofErr w:type="spellEnd"/>
+      <w:r>
+        <w:t xml:space="preserve"> Tracer, se confirmó el mensaje </w:t>
+      </w:r>
+      <w:r>
+        <w:rPr>
+          <w:i/>
+          <w:iCs/>
+        </w:rPr>
+        <w:t xml:space="preserve">"IPv6 </w:t>
+      </w:r>
+      <w:proofErr w:type="spellStart"/>
+      <w:r>
+        <w:rPr>
+          <w:i/>
+          <w:iCs/>
+        </w:rPr>
+        <w:t>request</w:t>
+      </w:r>
+      <w:proofErr w:type="spellEnd"/>
+      <w:r>
+        <w:rPr>
+          <w:i/>
+          <w:iCs/>
+        </w:rPr>
+        <w:t xml:space="preserve"> </w:t>
+      </w:r>
+      <w:proofErr w:type="spellStart"/>
+      <w:r>
+        <w:rPr>
+          <w:i/>
+          <w:iCs/>
+        </w:rPr>
+        <w:t>successful</w:t>
+      </w:r>
+      <w:proofErr w:type="spellEnd"/>
+      <w:r>
+        <w:rPr>
+          <w:i/>
+          <w:iCs/>
+        </w:rPr>
+        <w:t>"</w:t>
+      </w:r>
+      <w:r>
+        <w:t xml:space="preserve">, lo que indica que el proceso NDP (Neighbor Discovery </w:t>
+      </w:r>
+      <w:proofErr w:type="spellStart"/>
+      <w:r>
+        <w:t>Protocol</w:t>
+      </w:r>
+      <w:proofErr w:type="spellEnd"/>
+      <w:r>
+        <w:t>) completó el ciclo de direccionamiento sin errores.</w:t>
+      </w:r>
+    </w:p>
+    <w:tbl>
+      <w:tblPr>
+        <w:tblW w:w="0" w:type="auto"/>
+        <w:tblCellSpacing w:w="15" w:type="dxa"/>
+        <w:tblCellMar>
+          <w:left w:w="0" w:type="dxa"/>
+          <w:right w:w="0" w:type="dxa"/>
+        </w:tblCellMar>
+        <w:tblLook w:val="04A0" w:firstRow="1" w:lastRow="0" w:firstColumn="1" w:lastColumn="0" w:noHBand="0" w:noVBand="1"/>
+      </w:tblPr>
+      <w:tblGrid>
+        <w:gridCol w:w="1262"/>
+        <w:gridCol w:w="2058"/>
+        <w:gridCol w:w="1971"/>
+        <w:gridCol w:w="662"/>
+      </w:tblGrid>
+      <w:tr>
+        <w:trPr>
+          <w:tblHeader/>
+          <w:tblCellSpacing w:w="15" w:type="dxa"/>
+        </w:trPr>
+        <w:tc>
+          <w:tcPr>
+            <w:tcW w:w="0" w:type="auto"/>
+            <w:tcBorders>
+              <w:top w:val="single" w:sz="6" w:space="0" w:color="auto"/>
+              <w:left w:val="single" w:sz="6" w:space="0" w:color="auto"/>
+              <w:bottom w:val="single" w:sz="6" w:space="0" w:color="auto"/>
+              <w:right w:val="single" w:sz="6" w:space="0" w:color="auto"/>
+            </w:tcBorders>
+            <w:tcMar>
+              <w:top w:w="240" w:type="dxa"/>
+              <w:left w:w="0" w:type="dxa"/>
+              <w:bottom w:w="240" w:type="dxa"/>
+              <w:right w:w="180" w:type="dxa"/>
+            </w:tcMar>
+            <w:vAlign w:val="center"/>
+            <w:hideMark/>
+          </w:tcPr>
+          <w:p>
+            <w:pPr>
+              <w:rPr>
+                <w:sz w:val="20"/>
+                <w:szCs w:val="20"/>
+              </w:rPr>
+            </w:pPr>
+            <w:r>
+              <w:rPr>
+                <w:b/>
+                <w:bCs/>
+                <w:sz w:val="20"/>
+                <w:szCs w:val="20"/>
+              </w:rPr>
+              <w:t>Dispositivo</w:t>
+            </w:r>
+          </w:p>
+        </w:tc>
+        <w:tc>
+          <w:tcPr>
+            <w:tcW w:w="0" w:type="auto"/>
+            <w:tcBorders>
+              <w:top w:val="single" w:sz="6" w:space="0" w:color="auto"/>
+              <w:left w:val="single" w:sz="6" w:space="0" w:color="auto"/>
+              <w:bottom w:val="single" w:sz="6" w:space="0" w:color="auto"/>
+              <w:right w:val="single" w:sz="6" w:space="0" w:color="auto"/>
+            </w:tcBorders>
+            <w:tcMar>
+              <w:top w:w="240" w:type="dxa"/>
+              <w:left w:w="0" w:type="dxa"/>
+              <w:bottom w:w="240" w:type="dxa"/>
+              <w:right w:w="180" w:type="dxa"/>
+            </w:tcMar>
+            <w:vAlign w:val="center"/>
+            <w:hideMark/>
+          </w:tcPr>
+          <w:p>
+            <w:pPr>
+              <w:rPr>
+                <w:sz w:val="20"/>
+                <w:szCs w:val="20"/>
+              </w:rPr>
+            </w:pPr>
+            <w:r>
+              <w:rPr>
+                <w:b/>
+                <w:bCs/>
+                <w:sz w:val="20"/>
+                <w:szCs w:val="20"/>
+              </w:rPr>
+              <w:t>Prefijo Recibido</w:t>
+            </w:r>
+          </w:p>
+        </w:tc>
+        <w:tc>
+          <w:tcPr>
+            <w:tcW w:w="0" w:type="auto"/>
+            <w:tcBorders>
+              <w:top w:val="single" w:sz="6" w:space="0" w:color="auto"/>
+              <w:left w:val="single" w:sz="6" w:space="0" w:color="auto"/>
+              <w:bottom w:val="single" w:sz="6" w:space="0" w:color="auto"/>
+              <w:right w:val="single" w:sz="6" w:space="0" w:color="auto"/>
+            </w:tcBorders>
+            <w:tcMar>
+              <w:top w:w="240" w:type="dxa"/>
+              <w:left w:w="0" w:type="dxa"/>
+              <w:bottom w:w="240" w:type="dxa"/>
+              <w:right w:w="180" w:type="dxa"/>
+            </w:tcMar>
+            <w:vAlign w:val="center"/>
+            <w:hideMark/>
+          </w:tcPr>
+          <w:p>
+            <w:pPr>
+              <w:rPr>
+                <w:sz w:val="20"/>
+                <w:szCs w:val="20"/>
+              </w:rPr>
+            </w:pPr>
+            <w:r>
+              <w:rPr>
+                <w:b/>
+                <w:bCs/>
+                <w:sz w:val="20"/>
+                <w:szCs w:val="20"/>
+              </w:rPr>
+              <w:t>Gateway (</w:t>
+            </w:r>
+            <w:proofErr w:type="gramStart"/>
+            <w:r>
+              <w:rPr>
+                <w:b/>
+                <w:bCs/>
+                <w:sz w:val="20"/>
+                <w:szCs w:val="20"/>
+              </w:rPr>
+              <w:t>Link</w:t>
+            </w:r>
+            <w:proofErr w:type="gramEnd"/>
+            <w:r>
+              <w:rPr>
+                <w:b/>
+                <w:bCs/>
+                <w:sz w:val="20"/>
+                <w:szCs w:val="20"/>
+              </w:rPr>
+              <w:t>-Local)</w:t>
+            </w:r>
+          </w:p>
+        </w:tc>
+        <w:tc>
+          <w:tcPr>
+            <w:tcW w:w="0" w:type="auto"/>
+            <w:tcBorders>
+              <w:top w:val="single" w:sz="6" w:space="0" w:color="auto"/>
+              <w:left w:val="single" w:sz="6" w:space="0" w:color="auto"/>
+              <w:bottom w:val="single" w:sz="6" w:space="0" w:color="auto"/>
+              <w:right w:val="single" w:sz="6" w:space="0" w:color="auto"/>
+            </w:tcBorders>
+            <w:tcMar>
+              <w:top w:w="240" w:type="dxa"/>
+              <w:left w:w="0" w:type="dxa"/>
+              <w:bottom w:w="240" w:type="dxa"/>
+              <w:right w:w="0" w:type="dxa"/>
+            </w:tcMar>
+            <w:vAlign w:val="center"/>
+            <w:hideMark/>
+          </w:tcPr>
+          <w:p>
+            <w:pPr>
+              <w:rPr>
+                <w:sz w:val="20"/>
+                <w:szCs w:val="20"/>
+              </w:rPr>
+            </w:pPr>
+            <w:r>
+              <w:rPr>
+                <w:b/>
+                <w:bCs/>
+                <w:sz w:val="20"/>
+                <w:szCs w:val="20"/>
+              </w:rPr>
+              <w:t>Estado</w:t>
+            </w:r>
+          </w:p>
+        </w:tc>
+      </w:tr>
+      <w:tr>
+        <w:trPr>
+          <w:tblCellSpacing w:w="15" w:type="dxa"/>
+        </w:trPr>
+        <w:tc>
+          <w:tcPr>
+            <w:tcW w:w="0" w:type="auto"/>
+            <w:tcBorders>
+              <w:top w:val="single" w:sz="6" w:space="0" w:color="auto"/>
+              <w:left w:val="single" w:sz="6" w:space="0" w:color="auto"/>
+              <w:bottom w:val="single" w:sz="6" w:space="0" w:color="auto"/>
+              <w:right w:val="single" w:sz="6" w:space="0" w:color="auto"/>
+            </w:tcBorders>
+            <w:tcMar>
+              <w:top w:w="240" w:type="dxa"/>
+              <w:left w:w="0" w:type="dxa"/>
+              <w:bottom w:w="240" w:type="dxa"/>
+              <w:right w:w="180" w:type="dxa"/>
+            </w:tcMar>
+            <w:vAlign w:val="center"/>
+            <w:hideMark/>
+          </w:tcPr>
+          <w:p>
+            <w:pPr>
+              <w:rPr>
+                <w:sz w:val="20"/>
+                <w:szCs w:val="20"/>
+              </w:rPr>
+            </w:pPr>
+            <w:r>
+              <w:rPr>
+                <w:b/>
+                <w:bCs/>
+                <w:sz w:val="20"/>
+                <w:szCs w:val="20"/>
+              </w:rPr>
+              <w:t>PC00 / PC01</w:t>
+            </w:r>
+          </w:p>
+        </w:tc>
+        <w:tc>
+          <w:tcPr>
+            <w:tcW w:w="0" w:type="auto"/>
+            <w:tcBorders>
+              <w:top w:val="single" w:sz="6" w:space="0" w:color="auto"/>
+              <w:left w:val="single" w:sz="6" w:space="0" w:color="auto"/>
+              <w:bottom w:val="single" w:sz="6" w:space="0" w:color="auto"/>
+              <w:right w:val="single" w:sz="6" w:space="0" w:color="auto"/>
+            </w:tcBorders>
+            <w:tcMar>
+              <w:top w:w="240" w:type="dxa"/>
+              <w:left w:w="0" w:type="dxa"/>
+              <w:bottom w:w="240" w:type="dxa"/>
+              <w:right w:w="180" w:type="dxa"/>
+            </w:tcMar>
+            <w:vAlign w:val="center"/>
+            <w:hideMark/>
+          </w:tcPr>
+          <w:p>
+            <w:pPr>
+              <w:rPr>
+                <w:sz w:val="20"/>
+                <w:szCs w:val="20"/>
+              </w:rPr>
+            </w:pPr>
+            <w:proofErr w:type="gramStart"/>
+            <w:r>
+              <w:rPr>
+                <w:sz w:val="20"/>
+                <w:szCs w:val="20"/>
+              </w:rPr>
+              <w:t>2001:DB8:CC1A</w:t>
+            </w:r>
+            <w:proofErr w:type="gramEnd"/>
+            <w:r>
+              <w:rPr>
+                <w:sz w:val="20"/>
+                <w:szCs w:val="20"/>
+              </w:rPr>
+              <w:t>:</w:t>
+            </w:r>
+            <w:proofErr w:type="gramStart"/>
+            <w:r>
+              <w:rPr>
+                <w:sz w:val="20"/>
+                <w:szCs w:val="20"/>
+              </w:rPr>
+              <w:t>1::/</w:t>
+            </w:r>
+            <w:proofErr w:type="gramEnd"/>
+            <w:r>
+              <w:rPr>
+                <w:sz w:val="20"/>
+                <w:szCs w:val="20"/>
+              </w:rPr>
+              <w:t>64</w:t>
+            </w:r>
+          </w:p>
+        </w:tc>
+        <w:tc>
+          <w:tcPr>
+            <w:tcW w:w="0" w:type="auto"/>
+            <w:tcBorders>
+              <w:top w:val="single" w:sz="6" w:space="0" w:color="auto"/>
+              <w:left w:val="single" w:sz="6" w:space="0" w:color="auto"/>
+              <w:bottom w:val="single" w:sz="6" w:space="0" w:color="auto"/>
+              <w:right w:val="single" w:sz="6" w:space="0" w:color="auto"/>
+            </w:tcBorders>
+            <w:tcMar>
+              <w:top w:w="240" w:type="dxa"/>
+              <w:left w:w="0" w:type="dxa"/>
+              <w:bottom w:w="240" w:type="dxa"/>
+              <w:right w:w="180" w:type="dxa"/>
+            </w:tcMar>
+            <w:vAlign w:val="center"/>
+            <w:hideMark/>
+          </w:tcPr>
+          <w:p>
+            <w:pPr>
+              <w:rPr>
+                <w:sz w:val="20"/>
+                <w:szCs w:val="20"/>
+              </w:rPr>
+            </w:pPr>
+            <w:r>
+              <w:rPr>
+                <w:sz w:val="20"/>
+                <w:szCs w:val="20"/>
+              </w:rPr>
+              <w:t>FE80::1 (R1)</w:t>
+            </w:r>
+          </w:p>
+        </w:tc>
+        <w:tc>
+          <w:tcPr>
+            <w:tcW w:w="0" w:type="auto"/>
+            <w:tcBorders>
+              <w:top w:val="single" w:sz="6" w:space="0" w:color="auto"/>
+              <w:left w:val="single" w:sz="6" w:space="0" w:color="auto"/>
+              <w:bottom w:val="single" w:sz="6" w:space="0" w:color="auto"/>
+              <w:right w:val="single" w:sz="6" w:space="0" w:color="auto"/>
+            </w:tcBorders>
+            <w:tcMar>
+              <w:top w:w="240" w:type="dxa"/>
+              <w:left w:w="0" w:type="dxa"/>
+              <w:bottom w:w="240" w:type="dxa"/>
+              <w:right w:w="0" w:type="dxa"/>
+            </w:tcMar>
+            <w:vAlign w:val="center"/>
+            <w:hideMark/>
+          </w:tcPr>
+          <w:p>
+            <w:pPr>
+              <w:rPr>
+                <w:sz w:val="20"/>
+                <w:szCs w:val="20"/>
+              </w:rPr>
+            </w:pPr>
+            <w:r>
+              <w:rPr>
+                <w:sz w:val="20"/>
+                <w:szCs w:val="20"/>
+              </w:rPr>
+              <w:t>Exitoso</w:t>
+            </w:r>
+          </w:p>
+        </w:tc>
+      </w:tr>
+      <w:tr>
+        <w:trPr>
+          <w:trHeight w:val="191"/>
+          <w:tblCellSpacing w:w="15" w:type="dxa"/>
+        </w:trPr>
+        <w:tc>
+          <w:tcPr>
+            <w:tcW w:w="0" w:type="auto"/>
+            <w:tcBorders>
+              <w:top w:val="single" w:sz="6" w:space="0" w:color="auto"/>
+              <w:left w:val="single" w:sz="6" w:space="0" w:color="auto"/>
+              <w:bottom w:val="single" w:sz="6" w:space="0" w:color="auto"/>
+              <w:right w:val="single" w:sz="6" w:space="0" w:color="auto"/>
+            </w:tcBorders>
+            <w:tcMar>
+              <w:top w:w="240" w:type="dxa"/>
+              <w:left w:w="0" w:type="dxa"/>
+              <w:bottom w:w="240" w:type="dxa"/>
+              <w:right w:w="180" w:type="dxa"/>
+            </w:tcMar>
+            <w:vAlign w:val="center"/>
+            <w:hideMark/>
+          </w:tcPr>
+          <w:p>
+            <w:pPr>
+              <w:rPr>
+                <w:sz w:val="20"/>
+                <w:szCs w:val="20"/>
+              </w:rPr>
+            </w:pPr>
+            <w:r>
+              <w:rPr>
+                <w:b/>
+                <w:bCs/>
+                <w:sz w:val="20"/>
+                <w:szCs w:val="20"/>
+              </w:rPr>
+              <w:t>PC02 / PC03</w:t>
+            </w:r>
+          </w:p>
+        </w:tc>
+        <w:tc>
+          <w:tcPr>
+            <w:tcW w:w="0" w:type="auto"/>
+            <w:tcBorders>
+              <w:top w:val="single" w:sz="6" w:space="0" w:color="auto"/>
+              <w:left w:val="single" w:sz="6" w:space="0" w:color="auto"/>
+              <w:bottom w:val="single" w:sz="6" w:space="0" w:color="auto"/>
+              <w:right w:val="single" w:sz="6" w:space="0" w:color="auto"/>
+            </w:tcBorders>
+            <w:tcMar>
+              <w:top w:w="240" w:type="dxa"/>
+              <w:left w:w="0" w:type="dxa"/>
+              <w:bottom w:w="240" w:type="dxa"/>
+              <w:right w:w="180" w:type="dxa"/>
+            </w:tcMar>
+            <w:vAlign w:val="center"/>
+            <w:hideMark/>
+          </w:tcPr>
+          <w:p>
+            <w:pPr>
+              <w:rPr>
+                <w:sz w:val="20"/>
+                <w:szCs w:val="20"/>
+              </w:rPr>
+            </w:pPr>
+            <w:proofErr w:type="gramStart"/>
+            <w:r>
+              <w:rPr>
+                <w:sz w:val="20"/>
+                <w:szCs w:val="20"/>
+              </w:rPr>
+              <w:t>2001:DB8:CC1A</w:t>
+            </w:r>
+            <w:proofErr w:type="gramEnd"/>
+            <w:r>
+              <w:rPr>
+                <w:sz w:val="20"/>
+                <w:szCs w:val="20"/>
+              </w:rPr>
+              <w:t>:</w:t>
+            </w:r>
+            <w:proofErr w:type="gramStart"/>
+            <w:r>
+              <w:rPr>
+                <w:sz w:val="20"/>
+                <w:szCs w:val="20"/>
+              </w:rPr>
+              <w:t>2::/</w:t>
+            </w:r>
+            <w:proofErr w:type="gramEnd"/>
+            <w:r>
+              <w:rPr>
+                <w:sz w:val="20"/>
+                <w:szCs w:val="20"/>
+              </w:rPr>
+              <w:t>64</w:t>
+            </w:r>
+          </w:p>
+        </w:tc>
+        <w:tc>
+          <w:tcPr>
+            <w:tcW w:w="0" w:type="auto"/>
+            <w:tcBorders>
+              <w:top w:val="single" w:sz="6" w:space="0" w:color="auto"/>
+              <w:left w:val="single" w:sz="6" w:space="0" w:color="auto"/>
+              <w:bottom w:val="single" w:sz="6" w:space="0" w:color="auto"/>
+              <w:right w:val="single" w:sz="6" w:space="0" w:color="auto"/>
+            </w:tcBorders>
+            <w:tcMar>
+              <w:top w:w="240" w:type="dxa"/>
+              <w:left w:w="0" w:type="dxa"/>
+              <w:bottom w:w="240" w:type="dxa"/>
+              <w:right w:w="180" w:type="dxa"/>
+            </w:tcMar>
+            <w:vAlign w:val="center"/>
+            <w:hideMark/>
+          </w:tcPr>
+          <w:p>
+            <w:pPr>
+              <w:rPr>
+                <w:sz w:val="20"/>
+                <w:szCs w:val="20"/>
+              </w:rPr>
+            </w:pPr>
+            <w:r>
+              <w:rPr>
+                <w:sz w:val="20"/>
+                <w:szCs w:val="20"/>
+              </w:rPr>
+              <w:t>FE80::3 (R3)</w:t>
+            </w:r>
+          </w:p>
+        </w:tc>
+        <w:tc>
+          <w:tcPr>
+            <w:tcW w:w="0" w:type="auto"/>
+            <w:tcBorders>
+              <w:top w:val="single" w:sz="6" w:space="0" w:color="auto"/>
+              <w:left w:val="single" w:sz="6" w:space="0" w:color="auto"/>
+              <w:bottom w:val="single" w:sz="6" w:space="0" w:color="auto"/>
+              <w:right w:val="single" w:sz="6" w:space="0" w:color="auto"/>
+            </w:tcBorders>
+            <w:tcMar>
+              <w:top w:w="240" w:type="dxa"/>
+              <w:left w:w="0" w:type="dxa"/>
+              <w:bottom w:w="240" w:type="dxa"/>
+              <w:right w:w="0" w:type="dxa"/>
+            </w:tcMar>
+            <w:vAlign w:val="center"/>
+            <w:hideMark/>
+          </w:tcPr>
+          <w:p>
+            <w:pPr>
+              <w:rPr>
+                <w:sz w:val="20"/>
+                <w:szCs w:val="20"/>
+              </w:rPr>
+            </w:pPr>
+            <w:r>
+              <w:rPr>
+                <w:sz w:val="20"/>
+                <w:szCs w:val="20"/>
+              </w:rPr>
+              <w:t>Exitoso</w:t>
+            </w:r>
+          </w:p>
+        </w:tc>
+      </w:tr>
+    </w:tbl>
+    <w:p/>
     <w:sectPr>
       <w:pgSz w:w="12240" w:h="15840"/>
       <w:pgMar w:top="1417" w:right="1701" w:bottom="1417" w:left="1701" w:header="708" w:footer="708" w:gutter="0"/>
@@ -808,7 +1785,7 @@
 </file>
 
 <file path=word/numbering.xml><?xml version="1.0" encoding="utf-8"?>
-<w:numbering xmlns:wpc="http://schemas.microsoft.com/office/word/2010/wordprocessingCanvas" xmlns:cx="http://schemas.microsoft.com/office/drawing/2014/chartex" xmlns:cx1="http://schemas.microsoft.com/office/drawing/2015/9/8/chartex" xmlns:cx2="http://schemas.microsoft.com/office/drawing/2015/10/21/chartex" xmlns:cx3="http://schemas.microsoft.com/office/drawing/2016/5/9/chartex" xmlns:cx4="http://schemas.microsoft.com/office/drawing/2016/5/10/chartex" xmlns:cx5="http://schemas.microsoft.com/office/drawing/2016/5/11/chartex" xmlns:cx6="http://schemas.microsoft.com/office/drawing/2016/5/12/chartex" xmlns:cx7="http://schemas.microsoft.com/office/drawing/2016/5/13/chartex" xmlns:cx8="http://schemas.microsoft.com/office/drawing/2016/5/14/chartex" xmlns:mc="http://schemas.openxmlformats.org/markup-compatibility/2006" xmlns:aink="http://schemas.microsoft.com/office/drawing/2016/ink" xmlns:am3d="http://schemas.microsoft.com/office/drawing/2017/model3d" xmlns:o="urn:schemas-microsoft-com:office:office" xmlns:r="http://schemas.openxmlformats.org/officeDocument/2006/relationships" xmlns:m="http://schemas.openxmlformats.org/officeDocument/2006/math" xmlns:v="urn:schemas-microsoft-com:vml" xmlns:wp14="http://schemas.microsoft.com/office/word/2010/wordprocessingDrawing" xmlns:wp="http://schemas.openxmlformats.org/drawingml/2006/wordprocessingDrawing" xmlns:w10="urn:schemas-microsoft-com:office:word" xmlns:w="http://schemas.openxmlformats.org/wordprocessingml/2006/main" xmlns:w14="http://schemas.microsoft.com/office/word/2010/wordml" xmlns:w15="http://schemas.microsoft.com/office/word/2012/wordml" xmlns:w16cex="http://schemas.microsoft.com/office/word/2018/wordml/cex" xmlns:w16cid="http://schemas.microsoft.com/office/word/2016/wordml/cid" xmlns:w16="http://schemas.microsoft.com/office/word/2018/wordml" xmlns:w16sdtdh="http://schemas.microsoft.com/office/word/2020/wordml/sdtdatahash" xmlns:w16se="http://schemas.microsoft.com/office/word/2015/wordml/symex" xmlns:wpg="http://schemas.microsoft.com/office/word/2010/wordprocessingGroup" xmlns:wpi="http://schemas.microsoft.com/office/word/2010/wordprocessingInk" xmlns:wne="http://schemas.microsoft.com/office/word/2006/wordml" xmlns:wps="http://schemas.microsoft.com/office/word/2010/wordprocessingShape" mc:Ignorable="w14 w15 w16se w16cid w16 w16cex w16sdtdh wp14">
+<w:numbering xmlns:wpc="http://schemas.microsoft.com/office/word/2010/wordprocessingCanvas" xmlns:cx="http://schemas.microsoft.com/office/drawing/2014/chartex" xmlns:cx1="http://schemas.microsoft.com/office/drawing/2015/9/8/chartex" xmlns:cx2="http://schemas.microsoft.com/office/drawing/2015/10/21/chartex" xmlns:cx3="http://schemas.microsoft.com/office/drawing/2016/5/9/chartex" xmlns:cx4="http://schemas.microsoft.com/office/drawing/2016/5/10/chartex" xmlns:cx5="http://schemas.microsoft.com/office/drawing/2016/5/11/chartex" xmlns:cx6="http://schemas.microsoft.com/office/drawing/2016/5/12/chartex" xmlns:cx7="http://schemas.microsoft.com/office/drawing/2016/5/13/chartex" xmlns:cx8="http://schemas.microsoft.com/office/drawing/2016/5/14/chartex" xmlns:mc="http://schemas.openxmlformats.org/markup-compatibility/2006" xmlns:aink="http://schemas.microsoft.com/office/drawing/2016/ink" xmlns:am3d="http://schemas.microsoft.com/office/drawing/2017/model3d" xmlns:o="urn:schemas-microsoft-com:office:office" xmlns:oel="http://schemas.microsoft.com/office/2019/extlst" xmlns:r="http://schemas.openxmlformats.org/officeDocument/2006/relationships" xmlns:m="http://schemas.openxmlformats.org/officeDocument/2006/math" xmlns:v="urn:schemas-microsoft-com:vml" xmlns:wp14="http://schemas.microsoft.com/office/word/2010/wordprocessingDrawing" xmlns:wp="http://schemas.openxmlformats.org/drawingml/2006/wordprocessingDrawing" xmlns:w10="urn:schemas-microsoft-com:office:word" xmlns:w="http://schemas.openxmlformats.org/wordprocessingml/2006/main" xmlns:w14="http://schemas.microsoft.com/office/word/2010/wordml" xmlns:w15="http://schemas.microsoft.com/office/word/2012/wordml" xmlns:w16cex="http://schemas.microsoft.com/office/word/2018/wordml/cex" xmlns:w16cid="http://schemas.microsoft.com/office/word/2016/wordml/cid" xmlns:w16="http://schemas.microsoft.com/office/word/2018/wordml" xmlns:w16du="http://schemas.microsoft.com/office/word/2023/wordml/word16du" xmlns:w16sdtdh="http://schemas.microsoft.com/office/word/2020/wordml/sdtdatahash" xmlns:w16sdtfl="http://schemas.microsoft.com/office/word/2024/wordml/sdtformatlock" xmlns:w16se="http://schemas.microsoft.com/office/word/2015/wordml/symex" xmlns:wpg="http://schemas.microsoft.com/office/word/2010/wordprocessingGroup" xmlns:wpi="http://schemas.microsoft.com/office/word/2010/wordprocessingInk" xmlns:wne="http://schemas.microsoft.com/office/word/2006/wordml" xmlns:wps="http://schemas.microsoft.com/office/word/2010/wordprocessingShape" mc:Ignorable="w14 w15 w16se w16cid w16 w16cex w16sdtdh w16sdtfl w16du wp14">
   <w:abstractNum w:abstractNumId="0" w15:restartNumberingAfterBreak="0">
     <w:nsid w:val="2B03417D"/>
     <w:multiLevelType w:val="hybridMultilevel"/>
@@ -1011,17 +1988,285 @@
       </w:pPr>
     </w:lvl>
   </w:abstractNum>
-  <w:num w:numId="1">
+  <w:abstractNum w:abstractNumId="2" w15:restartNumberingAfterBreak="0">
+    <w:nsid w:val="695123E2"/>
+    <w:multiLevelType w:val="multilevel"/>
+    <w:tmpl w:val="B574CB48"/>
+    <w:lvl w:ilvl="0">
+      <w:start w:val="1"/>
+      <w:numFmt w:val="bullet"/>
+      <w:lvlText w:val=""/>
+      <w:lvlJc w:val="left"/>
+      <w:pPr>
+        <w:tabs>
+          <w:tab w:val="num" w:pos="720"/>
+        </w:tabs>
+        <w:ind w:left="720" w:hanging="360"/>
+      </w:pPr>
+      <w:rPr>
+        <w:rFonts w:ascii="Symbol" w:hAnsi="Symbol" w:hint="default"/>
+        <w:sz w:val="20"/>
+      </w:rPr>
+    </w:lvl>
+    <w:lvl w:ilvl="1" w:tentative="1">
+      <w:start w:val="1"/>
+      <w:numFmt w:val="bullet"/>
+      <w:lvlText w:val="o"/>
+      <w:lvlJc w:val="left"/>
+      <w:pPr>
+        <w:tabs>
+          <w:tab w:val="num" w:pos="1440"/>
+        </w:tabs>
+        <w:ind w:left="1440" w:hanging="360"/>
+      </w:pPr>
+      <w:rPr>
+        <w:rFonts w:ascii="Courier New" w:hAnsi="Courier New" w:hint="default"/>
+        <w:sz w:val="20"/>
+      </w:rPr>
+    </w:lvl>
+    <w:lvl w:ilvl="2" w:tentative="1">
+      <w:start w:val="1"/>
+      <w:numFmt w:val="bullet"/>
+      <w:lvlText w:val=""/>
+      <w:lvlJc w:val="left"/>
+      <w:pPr>
+        <w:tabs>
+          <w:tab w:val="num" w:pos="2160"/>
+        </w:tabs>
+        <w:ind w:left="2160" w:hanging="360"/>
+      </w:pPr>
+      <w:rPr>
+        <w:rFonts w:ascii="Wingdings" w:hAnsi="Wingdings" w:hint="default"/>
+        <w:sz w:val="20"/>
+      </w:rPr>
+    </w:lvl>
+    <w:lvl w:ilvl="3" w:tentative="1">
+      <w:start w:val="1"/>
+      <w:numFmt w:val="bullet"/>
+      <w:lvlText w:val=""/>
+      <w:lvlJc w:val="left"/>
+      <w:pPr>
+        <w:tabs>
+          <w:tab w:val="num" w:pos="2880"/>
+        </w:tabs>
+        <w:ind w:left="2880" w:hanging="360"/>
+      </w:pPr>
+      <w:rPr>
+        <w:rFonts w:ascii="Wingdings" w:hAnsi="Wingdings" w:hint="default"/>
+        <w:sz w:val="20"/>
+      </w:rPr>
+    </w:lvl>
+    <w:lvl w:ilvl="4" w:tentative="1">
+      <w:start w:val="1"/>
+      <w:numFmt w:val="bullet"/>
+      <w:lvlText w:val=""/>
+      <w:lvlJc w:val="left"/>
+      <w:pPr>
+        <w:tabs>
+          <w:tab w:val="num" w:pos="3600"/>
+        </w:tabs>
+        <w:ind w:left="3600" w:hanging="360"/>
+      </w:pPr>
+      <w:rPr>
+        <w:rFonts w:ascii="Wingdings" w:hAnsi="Wingdings" w:hint="default"/>
+        <w:sz w:val="20"/>
+      </w:rPr>
+    </w:lvl>
+    <w:lvl w:ilvl="5" w:tentative="1">
+      <w:start w:val="1"/>
+      <w:numFmt w:val="bullet"/>
+      <w:lvlText w:val=""/>
+      <w:lvlJc w:val="left"/>
+      <w:pPr>
+        <w:tabs>
+          <w:tab w:val="num" w:pos="4320"/>
+        </w:tabs>
+        <w:ind w:left="4320" w:hanging="360"/>
+      </w:pPr>
+      <w:rPr>
+        <w:rFonts w:ascii="Wingdings" w:hAnsi="Wingdings" w:hint="default"/>
+        <w:sz w:val="20"/>
+      </w:rPr>
+    </w:lvl>
+    <w:lvl w:ilvl="6" w:tentative="1">
+      <w:start w:val="1"/>
+      <w:numFmt w:val="bullet"/>
+      <w:lvlText w:val=""/>
+      <w:lvlJc w:val="left"/>
+      <w:pPr>
+        <w:tabs>
+          <w:tab w:val="num" w:pos="5040"/>
+        </w:tabs>
+        <w:ind w:left="5040" w:hanging="360"/>
+      </w:pPr>
+      <w:rPr>
+        <w:rFonts w:ascii="Wingdings" w:hAnsi="Wingdings" w:hint="default"/>
+        <w:sz w:val="20"/>
+      </w:rPr>
+    </w:lvl>
+    <w:lvl w:ilvl="7" w:tentative="1">
+      <w:start w:val="1"/>
+      <w:numFmt w:val="bullet"/>
+      <w:lvlText w:val=""/>
+      <w:lvlJc w:val="left"/>
+      <w:pPr>
+        <w:tabs>
+          <w:tab w:val="num" w:pos="5760"/>
+        </w:tabs>
+        <w:ind w:left="5760" w:hanging="360"/>
+      </w:pPr>
+      <w:rPr>
+        <w:rFonts w:ascii="Wingdings" w:hAnsi="Wingdings" w:hint="default"/>
+        <w:sz w:val="20"/>
+      </w:rPr>
+    </w:lvl>
+    <w:lvl w:ilvl="8" w:tentative="1">
+      <w:start w:val="1"/>
+      <w:numFmt w:val="bullet"/>
+      <w:lvlText w:val=""/>
+      <w:lvlJc w:val="left"/>
+      <w:pPr>
+        <w:tabs>
+          <w:tab w:val="num" w:pos="6480"/>
+        </w:tabs>
+        <w:ind w:left="6480" w:hanging="360"/>
+      </w:pPr>
+      <w:rPr>
+        <w:rFonts w:ascii="Wingdings" w:hAnsi="Wingdings" w:hint="default"/>
+        <w:sz w:val="20"/>
+      </w:rPr>
+    </w:lvl>
+  </w:abstractNum>
+  <w:abstractNum w:abstractNumId="3" w15:restartNumberingAfterBreak="0">
+    <w:nsid w:val="7EF26C7D"/>
+    <w:multiLevelType w:val="multilevel"/>
+    <w:tmpl w:val="A04645C8"/>
+    <w:lvl w:ilvl="0">
+      <w:start w:val="1"/>
+      <w:numFmt w:val="decimal"/>
+      <w:lvlText w:val="%1."/>
+      <w:lvlJc w:val="left"/>
+      <w:pPr>
+        <w:tabs>
+          <w:tab w:val="num" w:pos="720"/>
+        </w:tabs>
+        <w:ind w:left="720" w:hanging="360"/>
+      </w:pPr>
+    </w:lvl>
+    <w:lvl w:ilvl="1" w:tentative="1">
+      <w:start w:val="1"/>
+      <w:numFmt w:val="decimal"/>
+      <w:lvlText w:val="%2."/>
+      <w:lvlJc w:val="left"/>
+      <w:pPr>
+        <w:tabs>
+          <w:tab w:val="num" w:pos="1440"/>
+        </w:tabs>
+        <w:ind w:left="1440" w:hanging="360"/>
+      </w:pPr>
+    </w:lvl>
+    <w:lvl w:ilvl="2" w:tentative="1">
+      <w:start w:val="1"/>
+      <w:numFmt w:val="decimal"/>
+      <w:lvlText w:val="%3."/>
+      <w:lvlJc w:val="left"/>
+      <w:pPr>
+        <w:tabs>
+          <w:tab w:val="num" w:pos="2160"/>
+        </w:tabs>
+        <w:ind w:left="2160" w:hanging="360"/>
+      </w:pPr>
+    </w:lvl>
+    <w:lvl w:ilvl="3" w:tentative="1">
+      <w:start w:val="1"/>
+      <w:numFmt w:val="decimal"/>
+      <w:lvlText w:val="%4."/>
+      <w:lvlJc w:val="left"/>
+      <w:pPr>
+        <w:tabs>
+          <w:tab w:val="num" w:pos="2880"/>
+        </w:tabs>
+        <w:ind w:left="2880" w:hanging="360"/>
+      </w:pPr>
+    </w:lvl>
+    <w:lvl w:ilvl="4" w:tentative="1">
+      <w:start w:val="1"/>
+      <w:numFmt w:val="decimal"/>
+      <w:lvlText w:val="%5."/>
+      <w:lvlJc w:val="left"/>
+      <w:pPr>
+        <w:tabs>
+          <w:tab w:val="num" w:pos="3600"/>
+        </w:tabs>
+        <w:ind w:left="3600" w:hanging="360"/>
+      </w:pPr>
+    </w:lvl>
+    <w:lvl w:ilvl="5" w:tentative="1">
+      <w:start w:val="1"/>
+      <w:numFmt w:val="decimal"/>
+      <w:lvlText w:val="%6."/>
+      <w:lvlJc w:val="left"/>
+      <w:pPr>
+        <w:tabs>
+          <w:tab w:val="num" w:pos="4320"/>
+        </w:tabs>
+        <w:ind w:left="4320" w:hanging="360"/>
+      </w:pPr>
+    </w:lvl>
+    <w:lvl w:ilvl="6" w:tentative="1">
+      <w:start w:val="1"/>
+      <w:numFmt w:val="decimal"/>
+      <w:lvlText w:val="%7."/>
+      <w:lvlJc w:val="left"/>
+      <w:pPr>
+        <w:tabs>
+          <w:tab w:val="num" w:pos="5040"/>
+        </w:tabs>
+        <w:ind w:left="5040" w:hanging="360"/>
+      </w:pPr>
+    </w:lvl>
+    <w:lvl w:ilvl="7" w:tentative="1">
+      <w:start w:val="1"/>
+      <w:numFmt w:val="decimal"/>
+      <w:lvlText w:val="%8."/>
+      <w:lvlJc w:val="left"/>
+      <w:pPr>
+        <w:tabs>
+          <w:tab w:val="num" w:pos="5760"/>
+        </w:tabs>
+        <w:ind w:left="5760" w:hanging="360"/>
+      </w:pPr>
+    </w:lvl>
+    <w:lvl w:ilvl="8" w:tentative="1">
+      <w:start w:val="1"/>
+      <w:numFmt w:val="decimal"/>
+      <w:lvlText w:val="%9."/>
+      <w:lvlJc w:val="left"/>
+      <w:pPr>
+        <w:tabs>
+          <w:tab w:val="num" w:pos="6480"/>
+        </w:tabs>
+        <w:ind w:left="6480" w:hanging="360"/>
+      </w:pPr>
+    </w:lvl>
+  </w:abstractNum>
+  <w:num w:numId="1" w16cid:durableId="400563392">
     <w:abstractNumId w:val="0"/>
   </w:num>
-  <w:num w:numId="2">
+  <w:num w:numId="2" w16cid:durableId="1076561358">
     <w:abstractNumId w:val="1"/>
+  </w:num>
+  <w:num w:numId="3" w16cid:durableId="132330012">
+    <w:abstractNumId w:val="2"/>
+  </w:num>
+  <w:num w:numId="4" w16cid:durableId="1051541165">
+    <w:abstractNumId w:val="3"/>
   </w:num>
 </w:numbering>
 </file>
 
 <file path=word/styles.xml><?xml version="1.0" encoding="utf-8"?>
-<w:styles xmlns:mc="http://schemas.openxmlformats.org/markup-compatibility/2006" xmlns:r="http://schemas.openxmlformats.org/officeDocument/2006/relationships" xmlns:w="http://schemas.openxmlformats.org/wordprocessingml/2006/main" xmlns:w14="http://schemas.microsoft.com/office/word/2010/wordml" xmlns:w15="http://schemas.microsoft.com/office/word/2012/wordml" xmlns:w16cex="http://schemas.microsoft.com/office/word/2018/wordml/cex" xmlns:w16cid="http://schemas.microsoft.com/office/word/2016/wordml/cid" xmlns:w16="http://schemas.microsoft.com/office/word/2018/wordml" xmlns:w16sdtdh="http://schemas.microsoft.com/office/word/2020/wordml/sdtdatahash" xmlns:w16se="http://schemas.microsoft.com/office/word/2015/wordml/symex" mc:Ignorable="w14 w15 w16se w16cid w16 w16cex w16sdtdh">
+<w:styles xmlns:mc="http://schemas.openxmlformats.org/markup-compatibility/2006" xmlns:r="http://schemas.openxmlformats.org/officeDocument/2006/relationships" xmlns:w="http://schemas.openxmlformats.org/wordprocessingml/2006/main" xmlns:w14="http://schemas.microsoft.com/office/word/2010/wordml" xmlns:w15="http://schemas.microsoft.com/office/word/2012/wordml" xmlns:w16cex="http://schemas.microsoft.com/office/word/2018/wordml/cex" xmlns:w16cid="http://schemas.microsoft.com/office/word/2016/wordml/cid" xmlns:w16="http://schemas.microsoft.com/office/word/2018/wordml" xmlns:w16du="http://schemas.microsoft.com/office/word/2023/wordml/word16du" xmlns:w16sdtdh="http://schemas.microsoft.com/office/word/2020/wordml/sdtdatahash" xmlns:w16sdtfl="http://schemas.microsoft.com/office/word/2024/wordml/sdtformatlock" xmlns:w16se="http://schemas.microsoft.com/office/word/2015/wordml/symex" mc:Ignorable="w14 w15 w16se w16cid w16 w16cex w16sdtdh w16sdtfl w16du">
   <w:docDefaults>
     <w:rPrDefault>
       <w:rPr>
@@ -1418,14 +2663,62 @@
   <w:style w:type="paragraph" w:default="1" w:styleId="Normal">
     <w:name w:val="Normal"/>
     <w:qFormat/>
+    <w:rPr>
+      <w:lang w:val="es-CO"/>
+    </w:rPr>
   </w:style>
-  <w:style w:type="character" w:default="1" w:styleId="DefaultParagraphFont">
+  <w:style w:type="paragraph" w:styleId="Ttulo3">
+    <w:name w:val="heading 3"/>
+    <w:basedOn w:val="Normal"/>
+    <w:next w:val="Normal"/>
+    <w:link w:val="Ttulo3Car"/>
+    <w:uiPriority w:val="9"/>
+    <w:semiHidden/>
+    <w:unhideWhenUsed/>
+    <w:qFormat/>
+    <w:rsid w:val="00C218BD"/>
+    <w:pPr>
+      <w:keepNext/>
+      <w:keepLines/>
+      <w:spacing w:before="40" w:after="0"/>
+      <w:outlineLvl w:val="2"/>
+    </w:pPr>
+    <w:rPr>
+      <w:rFonts w:asciiTheme="majorHAnsi" w:eastAsiaTheme="majorEastAsia" w:hAnsiTheme="majorHAnsi" w:cstheme="majorBidi"/>
+      <w:color w:val="1F3763" w:themeColor="accent1" w:themeShade="7F"/>
+      <w:sz w:val="24"/>
+      <w:szCs w:val="24"/>
+    </w:rPr>
+  </w:style>
+  <w:style w:type="paragraph" w:styleId="Ttulo4">
+    <w:name w:val="heading 4"/>
+    <w:basedOn w:val="Normal"/>
+    <w:next w:val="Normal"/>
+    <w:link w:val="Ttulo4Car"/>
+    <w:uiPriority w:val="9"/>
+    <w:semiHidden/>
+    <w:unhideWhenUsed/>
+    <w:qFormat/>
+    <w:rsid w:val="00C218BD"/>
+    <w:pPr>
+      <w:keepNext/>
+      <w:keepLines/>
+      <w:spacing w:before="40" w:after="0"/>
+      <w:outlineLvl w:val="3"/>
+    </w:pPr>
+    <w:rPr>
+      <w:rFonts w:asciiTheme="majorHAnsi" w:eastAsiaTheme="majorEastAsia" w:hAnsiTheme="majorHAnsi" w:cstheme="majorBidi"/>
+      <w:i/>
+      <w:iCs/>
+      <w:color w:val="2F5496" w:themeColor="accent1" w:themeShade="BF"/>
+    </w:rPr>
+  </w:style>
+  <w:style w:type="character" w:default="1" w:styleId="Fuentedeprrafopredeter">
     <w:name w:val="Default Paragraph Font"/>
     <w:uiPriority w:val="1"/>
-    <w:semiHidden/>
     <w:unhideWhenUsed/>
   </w:style>
-  <w:style w:type="table" w:default="1" w:styleId="TableNormal">
+  <w:style w:type="table" w:default="1" w:styleId="Tablanormal">
     <w:name w:val="Normal Table"/>
     <w:uiPriority w:val="99"/>
     <w:semiHidden/>
@@ -1440,13 +2733,13 @@
       </w:tblCellMar>
     </w:tblPr>
   </w:style>
-  <w:style w:type="numbering" w:default="1" w:styleId="NoList">
+  <w:style w:type="numbering" w:default="1" w:styleId="Sinlista">
     <w:name w:val="No List"/>
     <w:uiPriority w:val="99"/>
     <w:semiHidden/>
     <w:unhideWhenUsed/>
   </w:style>
-  <w:style w:type="paragraph" w:styleId="ListParagraph">
+  <w:style w:type="paragraph" w:styleId="Prrafodelista">
     <w:name w:val="List Paragraph"/>
     <w:basedOn w:val="Normal"/>
     <w:uiPriority w:val="34"/>
@@ -1457,9 +2750,9 @@
       <w:contextualSpacing/>
     </w:pPr>
   </w:style>
-  <w:style w:type="character" w:styleId="Hyperlink">
+  <w:style w:type="character" w:styleId="Hipervnculo">
     <w:name w:val="Hyperlink"/>
-    <w:basedOn w:val="DefaultParagraphFont"/>
+    <w:basedOn w:val="Fuentedeprrafopredeter"/>
     <w:uiPriority w:val="99"/>
     <w:unhideWhenUsed/>
     <w:rsid w:val="00F970A9"/>
@@ -1468,9 +2761,9 @@
       <w:u w:val="single"/>
     </w:rPr>
   </w:style>
-  <w:style w:type="character" w:styleId="UnresolvedMention">
+  <w:style w:type="character" w:styleId="Mencinsinresolver">
     <w:name w:val="Unresolved Mention"/>
-    <w:basedOn w:val="DefaultParagraphFont"/>
+    <w:basedOn w:val="Fuentedeprrafopredeter"/>
     <w:uiPriority w:val="99"/>
     <w:semiHidden/>
     <w:unhideWhenUsed/>
@@ -1478,6 +2771,34 @@
     <w:rPr>
       <w:color w:val="605E5C"/>
       <w:shd w:val="clear" w:color="auto" w:fill="E1DFDD"/>
+    </w:rPr>
+  </w:style>
+  <w:style w:type="character" w:customStyle="1" w:styleId="Ttulo3Car">
+    <w:name w:val="Título 3 Car"/>
+    <w:basedOn w:val="Fuentedeprrafopredeter"/>
+    <w:link w:val="Ttulo3"/>
+    <w:uiPriority w:val="9"/>
+    <w:semiHidden/>
+    <w:rsid w:val="00C218BD"/>
+    <w:rPr>
+      <w:rFonts w:asciiTheme="majorHAnsi" w:eastAsiaTheme="majorEastAsia" w:hAnsiTheme="majorHAnsi" w:cstheme="majorBidi"/>
+      <w:color w:val="1F3763" w:themeColor="accent1" w:themeShade="7F"/>
+      <w:sz w:val="24"/>
+      <w:szCs w:val="24"/>
+    </w:rPr>
+  </w:style>
+  <w:style w:type="character" w:customStyle="1" w:styleId="Ttulo4Car">
+    <w:name w:val="Título 4 Car"/>
+    <w:basedOn w:val="Fuentedeprrafopredeter"/>
+    <w:link w:val="Ttulo4"/>
+    <w:uiPriority w:val="9"/>
+    <w:semiHidden/>
+    <w:rsid w:val="00C218BD"/>
+    <w:rPr>
+      <w:rFonts w:asciiTheme="majorHAnsi" w:eastAsiaTheme="majorEastAsia" w:hAnsiTheme="majorHAnsi" w:cstheme="majorBidi"/>
+      <w:i/>
+      <w:iCs/>
+      <w:color w:val="2F5496" w:themeColor="accent1" w:themeShade="BF"/>
     </w:rPr>
   </w:style>
 </w:styles>

</xml_diff>

<commit_message>
se configura el direccionamiento dinamico ospf, se agregan imagenes y se actualiza el archivo de laboratorio
</commit_message>
<xml_diff>
--- a/EscritoLab3_RD.docx
+++ b/EscritoLab3_RD.docx
@@ -13,69 +13,13 @@
         <w:t xml:space="preserve"> no requiere el uso de servidores para almacenar información de las direcciones</w:t>
       </w:r>
       <w:r>
-        <w:t xml:space="preserve"> de </w:t>
-      </w:r>
-      <w:proofErr w:type="spellStart"/>
-      <w:r>
-        <w:t>unidifusion</w:t>
-      </w:r>
-      <w:proofErr w:type="spellEnd"/>
-      <w:r>
-        <w:t xml:space="preserve"> globales</w:t>
-      </w:r>
-      <w:r>
-        <w:t xml:space="preserve"> de red con el fin de saber que direcciones IPv6 se están utilizando y cuales están disponibles. Este utiliza mensajes ICMPv6 RA (</w:t>
-      </w:r>
-      <w:proofErr w:type="spellStart"/>
-      <w:r>
-        <w:t>Router</w:t>
-      </w:r>
-      <w:proofErr w:type="spellEnd"/>
-      <w:r>
-        <w:t xml:space="preserve"> </w:t>
-      </w:r>
-      <w:proofErr w:type="spellStart"/>
-      <w:r>
-        <w:t>Advertisement</w:t>
-      </w:r>
-      <w:proofErr w:type="spellEnd"/>
-      <w:r>
-        <w:t>) para proporcionar direccionamiento y cualquier otra información de configuración</w:t>
-      </w:r>
-      <w:r>
-        <w:t xml:space="preserve"> que normalmente proporcionaría un servidor DHCP. Un host configura su dirección IPv6 en función de la información que se envía en la RA. Los mensajes RA son enviados por un </w:t>
-      </w:r>
-      <w:proofErr w:type="spellStart"/>
-      <w:r>
-        <w:t>router</w:t>
-      </w:r>
-      <w:proofErr w:type="spellEnd"/>
-      <w:r>
-        <w:t xml:space="preserve"> IPv6 cada 200 segundos. Un host también puede enviar un mensaje </w:t>
-      </w:r>
-      <w:proofErr w:type="spellStart"/>
-      <w:r>
-        <w:t>Router</w:t>
-      </w:r>
-      <w:proofErr w:type="spellEnd"/>
-      <w:r>
-        <w:t xml:space="preserve"> </w:t>
-      </w:r>
-      <w:proofErr w:type="spellStart"/>
-      <w:r>
-        <w:t>Solicitation</w:t>
-      </w:r>
-      <w:proofErr w:type="spellEnd"/>
-      <w:r>
-        <w:t xml:space="preserve"> (RS) solicitando que un </w:t>
-      </w:r>
-      <w:proofErr w:type="spellStart"/>
-      <w:r>
-        <w:t>router</w:t>
-      </w:r>
-      <w:proofErr w:type="spellEnd"/>
-      <w:r>
-        <w:t xml:space="preserve"> habilitado para IPv6 envíe al host un RA.</w:t>
+        <w:t xml:space="preserve"> de unidifusion globales</w:t>
+      </w:r>
+      <w:r>
+        <w:t xml:space="preserve"> de red con el fin de saber que direcciones IPv6 se están utilizando y cuales están disponibles. Este utiliza mensajes ICMPv6 RA (Router Advertisement) para proporcionar direccionamiento y cualquier otra información de configuración</w:t>
+      </w:r>
+      <w:r>
+        <w:t xml:space="preserve"> que normalmente proporcionaría un servidor DHCP. Un host configura su dirección IPv6 en función de la información que se envía en la RA. Los mensajes RA son enviados por un router IPv6 cada 200 segundos. Un host también puede enviar un mensaje Router Solicitation (RS) solicitando que un router habilitado para IPv6 envíe al host un RA.</w:t>
       </w:r>
     </w:p>
     <w:p>
@@ -86,102 +30,29 @@
         <w:t>sí</w:t>
       </w:r>
       <w:r>
-        <w:t xml:space="preserve">, es un método que permite que un dispositivo obtenga su prefijo, la longitud de prefijo, la dirección de </w:t>
-      </w:r>
-      <w:proofErr w:type="spellStart"/>
-      <w:r>
-        <w:t>gateway</w:t>
-      </w:r>
-      <w:proofErr w:type="spellEnd"/>
-      <w:r>
-        <w:t xml:space="preserve"> predeterminado y otra información de un </w:t>
-      </w:r>
-      <w:proofErr w:type="spellStart"/>
+        <w:t xml:space="preserve">, es un método que permite que un dispositivo obtenga su prefijo, la longitud de prefijo, la dirección de gateway predeterminado y otra información de un </w:t>
+      </w:r>
       <w:r>
         <w:rPr>
           <w:i/>
           <w:iCs/>
         </w:rPr>
-        <w:t>router</w:t>
-      </w:r>
-      <w:proofErr w:type="spellEnd"/>
-      <w:r>
-        <w:rPr>
-          <w:i/>
-          <w:iCs/>
-        </w:rPr>
-        <w:t xml:space="preserve"> IPv6</w:t>
-      </w:r>
-      <w:r>
-        <w:t xml:space="preserve">, sin usar un servidor DHCPv6. Mediante SLAAC, los dispositivos dependen de los mensajes de anuncio de </w:t>
-      </w:r>
-      <w:proofErr w:type="spellStart"/>
-      <w:r>
-        <w:t>router</w:t>
-      </w:r>
-      <w:proofErr w:type="spellEnd"/>
-      <w:r>
-        <w:t xml:space="preserve"> (RA) de ICMPv6 del </w:t>
-      </w:r>
-      <w:proofErr w:type="spellStart"/>
-      <w:r>
-        <w:t>router</w:t>
-      </w:r>
-      <w:proofErr w:type="spellEnd"/>
-      <w:r>
-        <w:t xml:space="preserve"> local para obtener la información necesaria.</w:t>
-      </w:r>
-    </w:p>
-    <w:p>
-      <w:r>
-        <w:t xml:space="preserve">El </w:t>
-      </w:r>
-      <w:proofErr w:type="spellStart"/>
-      <w:r>
-        <w:t>routing</w:t>
-      </w:r>
-      <w:proofErr w:type="spellEnd"/>
-      <w:r>
-        <w:t xml:space="preserve"> IPv6 no está habilitado de manera predeterminada. Para habilitar un </w:t>
-      </w:r>
-      <w:proofErr w:type="spellStart"/>
-      <w:r>
-        <w:t>router</w:t>
-      </w:r>
-      <w:proofErr w:type="spellEnd"/>
-      <w:r>
-        <w:t xml:space="preserve"> como </w:t>
-      </w:r>
-      <w:proofErr w:type="spellStart"/>
-      <w:r>
-        <w:t>router</w:t>
-      </w:r>
-      <w:proofErr w:type="spellEnd"/>
-      <w:r>
-        <w:t xml:space="preserve"> IPv6, se debe usar el comando de configuración global “</w:t>
-      </w:r>
-      <w:r>
-        <w:rPr>
-          <w:b/>
-          <w:bCs/>
-        </w:rPr>
-        <w:t xml:space="preserve">ipv6 </w:t>
-      </w:r>
-      <w:proofErr w:type="spellStart"/>
-      <w:r>
-        <w:rPr>
-          <w:b/>
-          <w:bCs/>
-        </w:rPr>
-        <w:t>unicast-routing</w:t>
-      </w:r>
-      <w:proofErr w:type="spellEnd"/>
-      <w:r>
-        <w:rPr>
-          <w:b/>
-          <w:bCs/>
-        </w:rPr>
-        <w:t>”</w:t>
+        <w:t>router IPv6</w:t>
+      </w:r>
+      <w:r>
+        <w:t>, sin usar un servidor DHCPv6. Mediante SLAAC, los dispositivos dependen de los mensajes de anuncio de router (RA) de ICMPv6 del router local para obtener la información necesaria.</w:t>
+      </w:r>
+    </w:p>
+    <w:p>
+      <w:r>
+        <w:t>El routing IPv6 no está habilitado de manera predeterminada. Para habilitar un router como router IPv6, se debe usar el comando de configuración global “</w:t>
+      </w:r>
+      <w:r>
+        <w:rPr>
+          <w:b/>
+          <w:bCs/>
+        </w:rPr>
+        <w:t>ipv6 unicast-routing”</w:t>
       </w:r>
       <w:r>
         <w:t>.</w:t>
@@ -189,15 +60,7 @@
     </w:p>
     <w:p>
       <w:r>
-        <w:t xml:space="preserve">Como se </w:t>
-      </w:r>
-      <w:proofErr w:type="spellStart"/>
-      <w:r>
-        <w:t>menciono</w:t>
-      </w:r>
-      <w:proofErr w:type="spellEnd"/>
-      <w:r>
-        <w:t xml:space="preserve"> anteriormente, SLAAC utiliza los siguientes mensajes ICMPv6 para proporcionar direccionamiento IPv6:</w:t>
+        <w:t>Como se menciono anteriormente, SLAAC utiliza los siguientes mensajes ICMPv6 para proporcionar direccionamiento IPv6:</w:t>
       </w:r>
     </w:p>
     <w:p>
@@ -213,82 +76,10 @@
           <w:b/>
           <w:bCs/>
         </w:rPr>
-        <w:t xml:space="preserve">Mensaje de solicitud del </w:t>
-      </w:r>
-      <w:proofErr w:type="spellStart"/>
-      <w:r>
-        <w:rPr>
-          <w:b/>
-          <w:bCs/>
-        </w:rPr>
-        <w:t>router</w:t>
-      </w:r>
-      <w:proofErr w:type="spellEnd"/>
-      <w:r>
-        <w:rPr>
-          <w:b/>
-          <w:bCs/>
-        </w:rPr>
-        <w:t xml:space="preserve"> (RS, </w:t>
-      </w:r>
-      <w:proofErr w:type="spellStart"/>
-      <w:r>
-        <w:rPr>
-          <w:b/>
-          <w:bCs/>
-        </w:rPr>
-        <w:t>Router</w:t>
-      </w:r>
-      <w:proofErr w:type="spellEnd"/>
-      <w:r>
-        <w:rPr>
-          <w:b/>
-          <w:bCs/>
-        </w:rPr>
-        <w:t xml:space="preserve"> </w:t>
-      </w:r>
-      <w:proofErr w:type="spellStart"/>
-      <w:r>
-        <w:rPr>
-          <w:b/>
-          <w:bCs/>
-        </w:rPr>
-        <w:t>Solicitation</w:t>
-      </w:r>
-      <w:proofErr w:type="spellEnd"/>
-      <w:r>
-        <w:rPr>
-          <w:b/>
-          <w:bCs/>
-        </w:rPr>
-        <w:t>);</w:t>
-      </w:r>
-      <w:r>
-        <w:t xml:space="preserve"> Cuando un cliente se configura para obtener su información de direccionamiento IPv6 automáticamente mediante SLAAC, éste envía un mensaje RS al </w:t>
-      </w:r>
-      <w:proofErr w:type="spellStart"/>
-      <w:r>
-        <w:t>router</w:t>
-      </w:r>
-      <w:proofErr w:type="spellEnd"/>
-      <w:r>
-        <w:t xml:space="preserve">. El mensaje RS se envía a la dirección </w:t>
-      </w:r>
-      <w:proofErr w:type="spellStart"/>
-      <w:r>
-        <w:t>multicast</w:t>
-      </w:r>
-      <w:proofErr w:type="spellEnd"/>
-      <w:r>
-        <w:t xml:space="preserve"> de todos los </w:t>
-      </w:r>
-      <w:proofErr w:type="spellStart"/>
-      <w:r>
-        <w:t>routers</w:t>
-      </w:r>
-      <w:proofErr w:type="spellEnd"/>
-      <w:r>
-        <w:t xml:space="preserve"> IPv6 FF02::2. Es un mensaje ICMPv6 tipo 133.</w:t>
+        <w:t>Mensaje de solicitud del router (RS, Router Solicitation);</w:t>
+      </w:r>
+      <w:r>
+        <w:t xml:space="preserve"> Cuando un cliente se configura para obtener su información de direccionamiento IPv6 automáticamente mediante SLAAC, éste envía un mensaje RS al router. El mensaje RS se envía a la dirección multicast de todos los routers IPv6 FF02::2. Es un mensaje ICMPv6 tipo 133.</w:t>
       </w:r>
     </w:p>
     <w:p>
@@ -304,90 +95,10 @@
           <w:b/>
           <w:bCs/>
         </w:rPr>
-        <w:t xml:space="preserve">Mensaje de anuncio del </w:t>
-      </w:r>
-      <w:proofErr w:type="spellStart"/>
-      <w:r>
-        <w:rPr>
-          <w:b/>
-          <w:bCs/>
-        </w:rPr>
-        <w:t>router</w:t>
-      </w:r>
-      <w:proofErr w:type="spellEnd"/>
-      <w:r>
-        <w:rPr>
-          <w:b/>
-          <w:bCs/>
-        </w:rPr>
-        <w:t xml:space="preserve"> (RA, </w:t>
-      </w:r>
-      <w:proofErr w:type="spellStart"/>
-      <w:r>
-        <w:rPr>
-          <w:b/>
-          <w:bCs/>
-        </w:rPr>
-        <w:t>Router</w:t>
-      </w:r>
-      <w:proofErr w:type="spellEnd"/>
-      <w:r>
-        <w:rPr>
-          <w:b/>
-          <w:bCs/>
-        </w:rPr>
-        <w:t xml:space="preserve"> </w:t>
-      </w:r>
-      <w:proofErr w:type="spellStart"/>
-      <w:r>
-        <w:rPr>
-          <w:b/>
-          <w:bCs/>
-        </w:rPr>
-        <w:t>Advertisement</w:t>
-      </w:r>
-      <w:proofErr w:type="spellEnd"/>
-      <w:r>
-        <w:rPr>
-          <w:b/>
-          <w:bCs/>
-        </w:rPr>
-        <w:t>);</w:t>
-      </w:r>
-      <w:r>
-        <w:t xml:space="preserve"> Los </w:t>
-      </w:r>
-      <w:proofErr w:type="spellStart"/>
-      <w:r>
-        <w:t>routers</w:t>
-      </w:r>
-      <w:proofErr w:type="spellEnd"/>
-      <w:r>
-        <w:t xml:space="preserve"> envían mensajes RA para proporcionar información de direccionamiento IPv6 a los clientes. El mensaje RA incluye el prefijo y la longitud del prefijo del segmento local. Un </w:t>
-      </w:r>
-      <w:proofErr w:type="spellStart"/>
-      <w:r>
-        <w:t>router</w:t>
-      </w:r>
-      <w:proofErr w:type="spellEnd"/>
-      <w:r>
-        <w:t xml:space="preserve"> envía un mensaje RA periódicamente (configurable entre 4 y 1800 segundos) o en respuesta a un mensaje RS. Por defecto, los </w:t>
-      </w:r>
-      <w:proofErr w:type="spellStart"/>
-      <w:r>
-        <w:t>routers</w:t>
-      </w:r>
-      <w:proofErr w:type="spellEnd"/>
-      <w:r>
-        <w:t xml:space="preserve"> Cisco envían mensajes RA cada 200 segundos. Los mensajes RA siempre se envían a la dirección </w:t>
-      </w:r>
-      <w:proofErr w:type="spellStart"/>
-      <w:r>
-        <w:t>multicast</w:t>
-      </w:r>
-      <w:proofErr w:type="spellEnd"/>
-      <w:r>
-        <w:t xml:space="preserve"> de todos los nodos IPv6 FF02::1. Es un mensaje ICMPv6 tipo 134.</w:t>
+        <w:t>Mensaje de anuncio del router (RA, Router Advertisement);</w:t>
+      </w:r>
+      <w:r>
+        <w:t xml:space="preserve"> Los routers envían mensajes RA para proporcionar información de direccionamiento IPv6 a los clientes. El mensaje RA incluye el prefijo y la longitud del prefijo del segmento local. Un router envía un mensaje RA periódicamente (configurable entre 4 y 1800 segundos) o en respuesta a un mensaje RS. Por defecto, los routers Cisco envían mensajes RA cada 200 segundos. Los mensajes RA siempre se envían a la dirección multicast de todos los nodos IPv6 FF02::1. Es un mensaje ICMPv6 tipo 134.</w:t>
       </w:r>
     </w:p>
     <w:p>
@@ -432,15 +143,7 @@
     </w:p>
     <w:p>
       <w:r>
-        <w:t xml:space="preserve">En </w:t>
-      </w:r>
-      <w:proofErr w:type="spellStart"/>
-      <w:r>
-        <w:t>si</w:t>
-      </w:r>
-      <w:proofErr w:type="spellEnd"/>
-      <w:r>
-        <w:t xml:space="preserve">, </w:t>
+        <w:t xml:space="preserve">En si, </w:t>
       </w:r>
       <w:r>
         <w:t xml:space="preserve">una de las diferencias clave entre IPv4 y IPv6 es el formato de sus direcciones, el IPv4 utilizando números decimales de 0-255 en forma X.X.X.X, mientras que IPv6 utiliza números hexadecimales de 0-65535, lo cual permite que las direcciones IPv6 tengan una cantidad considerablemente mayor que </w:t>
@@ -476,98 +179,34 @@
     </w:p>
     <w:p>
       <w:r>
-        <w:t xml:space="preserve">Para la puesta en marcha de la autoconfiguración sin estado (SLAAC), se procedió a la configuración de los </w:t>
-      </w:r>
-      <w:proofErr w:type="spellStart"/>
-      <w:r>
-        <w:t>routers</w:t>
-      </w:r>
-      <w:proofErr w:type="spellEnd"/>
-      <w:r>
-        <w:t xml:space="preserve"> extremos para que actuaran como fuentes de anuncios de red. El proceso se detalla a continuación:</w:t>
-      </w:r>
-    </w:p>
-    <w:p>
-      <w:pPr>
-        <w:rPr>
-          <w:b/>
-          <w:bCs/>
-        </w:rPr>
-      </w:pPr>
-      <w:r>
-        <w:rPr>
-          <w:b/>
-          <w:bCs/>
-        </w:rPr>
-        <w:t xml:space="preserve">5.1. Configuración del </w:t>
-      </w:r>
-      <w:proofErr w:type="spellStart"/>
-      <w:r>
-        <w:rPr>
-          <w:b/>
-          <w:bCs/>
-        </w:rPr>
-        <w:t>Router</w:t>
-      </w:r>
-      <w:proofErr w:type="spellEnd"/>
-      <w:r>
-        <w:rPr>
-          <w:b/>
-          <w:bCs/>
-        </w:rPr>
-        <w:t xml:space="preserve"> (Lado Servidor)</w:t>
-      </w:r>
-    </w:p>
-    <w:p>
-      <w:r>
-        <w:t xml:space="preserve">Se habilitó el enrutamiento de unidifusión IPv6 y se configuraron las interfaces LAN con sus respectivos prefijos globales. Esto permite que el </w:t>
-      </w:r>
-      <w:proofErr w:type="spellStart"/>
-      <w:r>
-        <w:t>router</w:t>
-      </w:r>
-      <w:proofErr w:type="spellEnd"/>
-      <w:r>
-        <w:t xml:space="preserve"> envíe mensajes </w:t>
-      </w:r>
-      <w:r>
-        <w:rPr>
-          <w:b/>
-          <w:bCs/>
-        </w:rPr>
-        <w:t>ICMPv6 Tipo 134 (</w:t>
-      </w:r>
-      <w:proofErr w:type="spellStart"/>
-      <w:r>
-        <w:rPr>
-          <w:b/>
-          <w:bCs/>
-        </w:rPr>
-        <w:t>Router</w:t>
-      </w:r>
-      <w:proofErr w:type="spellEnd"/>
-      <w:r>
-        <w:rPr>
-          <w:b/>
-          <w:bCs/>
-        </w:rPr>
-        <w:t xml:space="preserve"> </w:t>
-      </w:r>
-      <w:proofErr w:type="spellStart"/>
-      <w:r>
-        <w:rPr>
-          <w:b/>
-          <w:bCs/>
-        </w:rPr>
-        <w:t>Advertisement</w:t>
-      </w:r>
-      <w:proofErr w:type="spellEnd"/>
-      <w:r>
-        <w:rPr>
-          <w:b/>
-          <w:bCs/>
-        </w:rPr>
-        <w:t>)</w:t>
+        <w:t>Para la puesta en marcha de la autoconfiguración sin estado (SLAAC), se procedió a la configuración de los routers extremos para que actuaran como fuentes de anuncios de red. El proceso se detalla a continuación:</w:t>
+      </w:r>
+    </w:p>
+    <w:p>
+      <w:pPr>
+        <w:rPr>
+          <w:b/>
+          <w:bCs/>
+        </w:rPr>
+      </w:pPr>
+      <w:r>
+        <w:rPr>
+          <w:b/>
+          <w:bCs/>
+        </w:rPr>
+        <w:t>5.1. Configuración del Router (Lado Servidor)</w:t>
+      </w:r>
+    </w:p>
+    <w:p>
+      <w:r>
+        <w:t xml:space="preserve">Se habilitó el enrutamiento de unidifusión IPv6 y se configuraron las interfaces LAN con sus respectivos prefijos globales. Esto permite que el router envíe mensajes </w:t>
+      </w:r>
+      <w:r>
+        <w:rPr>
+          <w:b/>
+          <w:bCs/>
+        </w:rPr>
+        <w:t>ICMPv6 Tipo 134 (Router Advertisement)</w:t>
       </w:r>
       <w:r>
         <w:t>.</w:t>
@@ -585,23 +224,7 @@
           <w:b/>
           <w:bCs/>
         </w:rPr>
-        <w:t xml:space="preserve">Comandos aplicados (Ejemplo </w:t>
-      </w:r>
-      <w:proofErr w:type="spellStart"/>
-      <w:r>
-        <w:rPr>
-          <w:b/>
-          <w:bCs/>
-        </w:rPr>
-        <w:t>Router</w:t>
-      </w:r>
-      <w:proofErr w:type="spellEnd"/>
-      <w:r>
-        <w:rPr>
-          <w:b/>
-          <w:bCs/>
-        </w:rPr>
-        <w:t xml:space="preserve"> 1):</w:t>
+        <w:t>Comandos aplicados (Ejemplo Router 1):</w:t>
       </w:r>
     </w:p>
     <w:p>
@@ -622,253 +245,69 @@
         <w:rPr>
           <w:rFonts w:ascii="Times New Roman" w:hAnsi="Times New Roman" w:cs="Times New Roman"/>
         </w:rPr>
-        <w:t>Router-1(</w:t>
-      </w:r>
-      <w:proofErr w:type="spellStart"/>
-      <w:r>
+        <w:t>Router-1(config)# ipv6 unicast-routing</w:t>
+      </w:r>
+    </w:p>
+    <w:p>
+      <w:pPr>
+        <w:shd w:val="clear" w:color="auto" w:fill="F2F2F2" w:themeFill="background1" w:themeFillShade="F2"/>
         <w:rPr>
           <w:rFonts w:ascii="Times New Roman" w:hAnsi="Times New Roman" w:cs="Times New Roman"/>
-        </w:rPr>
-        <w:t>config</w:t>
-      </w:r>
-      <w:proofErr w:type="spellEnd"/>
+          <w:lang w:val="en-GB"/>
+        </w:rPr>
+      </w:pPr>
       <w:r>
         <w:rPr>
           <w:rFonts w:ascii="Times New Roman" w:hAnsi="Times New Roman" w:cs="Times New Roman"/>
-        </w:rPr>
-        <w:t xml:space="preserve">)# ipv6 </w:t>
-      </w:r>
-      <w:proofErr w:type="spellStart"/>
-      <w:r>
+          <w:lang w:val="en-GB"/>
+        </w:rPr>
+        <w:t>Router-1(config)# interface GigabitEthernet0/0</w:t>
+      </w:r>
+    </w:p>
+    <w:p>
+      <w:pPr>
+        <w:shd w:val="clear" w:color="auto" w:fill="F2F2F2" w:themeFill="background1" w:themeFillShade="F2"/>
         <w:rPr>
           <w:rFonts w:ascii="Times New Roman" w:hAnsi="Times New Roman" w:cs="Times New Roman"/>
-        </w:rPr>
-        <w:t>unicast-routing</w:t>
-      </w:r>
-      <w:proofErr w:type="spellEnd"/>
+          <w:lang w:val="en-GB"/>
+        </w:rPr>
+      </w:pPr>
+      <w:r>
+        <w:rPr>
+          <w:rFonts w:ascii="Times New Roman" w:hAnsi="Times New Roman" w:cs="Times New Roman"/>
+          <w:lang w:val="en-GB"/>
+        </w:rPr>
+        <w:t>Router-1(config-if)# ipv6 address 2001:DB8:CC1A:1::1/64</w:t>
+      </w:r>
     </w:p>
     <w:p>
       <w:pPr>
         <w:shd w:val="clear" w:color="auto" w:fill="F2F2F2" w:themeFill="background1" w:themeFillShade="F2"/>
         <w:rPr>
           <w:rFonts w:ascii="Times New Roman" w:hAnsi="Times New Roman" w:cs="Times New Roman"/>
+          <w:lang w:val="en-GB"/>
         </w:rPr>
       </w:pPr>
       <w:r>
         <w:rPr>
           <w:rFonts w:ascii="Times New Roman" w:hAnsi="Times New Roman" w:cs="Times New Roman"/>
-        </w:rPr>
-        <w:t>Router-1(</w:t>
-      </w:r>
-      <w:proofErr w:type="spellStart"/>
-      <w:r>
+          <w:lang w:val="en-GB"/>
+        </w:rPr>
+        <w:t>Router-1(config-if)# ipv6 address FE80::1 link-local</w:t>
+      </w:r>
+    </w:p>
+    <w:p>
+      <w:pPr>
+        <w:shd w:val="clear" w:color="auto" w:fill="F2F2F2" w:themeFill="background1" w:themeFillShade="F2"/>
         <w:rPr>
           <w:rFonts w:ascii="Times New Roman" w:hAnsi="Times New Roman" w:cs="Times New Roman"/>
         </w:rPr>
-        <w:t>config</w:t>
-      </w:r>
-      <w:proofErr w:type="spellEnd"/>
+      </w:pPr>
       <w:r>
         <w:rPr>
           <w:rFonts w:ascii="Times New Roman" w:hAnsi="Times New Roman" w:cs="Times New Roman"/>
         </w:rPr>
-        <w:t xml:space="preserve">)# </w:t>
-      </w:r>
-      <w:proofErr w:type="gramStart"/>
-      <w:r>
-        <w:rPr>
-          <w:rFonts w:ascii="Times New Roman" w:hAnsi="Times New Roman" w:cs="Times New Roman"/>
-        </w:rPr>
-        <w:t>interface</w:t>
-      </w:r>
-      <w:proofErr w:type="gramEnd"/>
-      <w:r>
-        <w:rPr>
-          <w:rFonts w:ascii="Times New Roman" w:hAnsi="Times New Roman" w:cs="Times New Roman"/>
-        </w:rPr>
-        <w:t xml:space="preserve"> GigabitEthernet0/0</w:t>
-      </w:r>
-    </w:p>
-    <w:p>
-      <w:pPr>
-        <w:shd w:val="clear" w:color="auto" w:fill="F2F2F2" w:themeFill="background1" w:themeFillShade="F2"/>
-        <w:rPr>
-          <w:rFonts w:ascii="Times New Roman" w:hAnsi="Times New Roman" w:cs="Times New Roman"/>
-        </w:rPr>
-      </w:pPr>
-      <w:r>
-        <w:rPr>
-          <w:rFonts w:ascii="Times New Roman" w:hAnsi="Times New Roman" w:cs="Times New Roman"/>
-        </w:rPr>
-        <w:t>Router-1(</w:t>
-      </w:r>
-      <w:proofErr w:type="spellStart"/>
-      <w:r>
-        <w:rPr>
-          <w:rFonts w:ascii="Times New Roman" w:hAnsi="Times New Roman" w:cs="Times New Roman"/>
-        </w:rPr>
-        <w:t>config-</w:t>
-      </w:r>
-      <w:proofErr w:type="gramStart"/>
-      <w:r>
-        <w:rPr>
-          <w:rFonts w:ascii="Times New Roman" w:hAnsi="Times New Roman" w:cs="Times New Roman"/>
-        </w:rPr>
-        <w:t>if</w:t>
-      </w:r>
-      <w:proofErr w:type="spellEnd"/>
-      <w:r>
-        <w:rPr>
-          <w:rFonts w:ascii="Times New Roman" w:hAnsi="Times New Roman" w:cs="Times New Roman"/>
-        </w:rPr>
-        <w:t>)#</w:t>
-      </w:r>
-      <w:proofErr w:type="gramEnd"/>
-      <w:r>
-        <w:rPr>
-          <w:rFonts w:ascii="Times New Roman" w:hAnsi="Times New Roman" w:cs="Times New Roman"/>
-        </w:rPr>
-        <w:t xml:space="preserve"> ipv6 </w:t>
-      </w:r>
-      <w:proofErr w:type="spellStart"/>
-      <w:r>
-        <w:rPr>
-          <w:rFonts w:ascii="Times New Roman" w:hAnsi="Times New Roman" w:cs="Times New Roman"/>
-        </w:rPr>
-        <w:t>address</w:t>
-      </w:r>
-      <w:proofErr w:type="spellEnd"/>
-      <w:r>
-        <w:rPr>
-          <w:rFonts w:ascii="Times New Roman" w:hAnsi="Times New Roman" w:cs="Times New Roman"/>
-        </w:rPr>
-        <w:t xml:space="preserve"> </w:t>
-      </w:r>
-      <w:proofErr w:type="gramStart"/>
-      <w:r>
-        <w:rPr>
-          <w:rFonts w:ascii="Times New Roman" w:hAnsi="Times New Roman" w:cs="Times New Roman"/>
-        </w:rPr>
-        <w:t>2001:DB8:CC1A</w:t>
-      </w:r>
-      <w:proofErr w:type="gramEnd"/>
-      <w:r>
-        <w:rPr>
-          <w:rFonts w:ascii="Times New Roman" w:hAnsi="Times New Roman" w:cs="Times New Roman"/>
-        </w:rPr>
-        <w:t>:1::1/64</w:t>
-      </w:r>
-    </w:p>
-    <w:p>
-      <w:pPr>
-        <w:shd w:val="clear" w:color="auto" w:fill="F2F2F2" w:themeFill="background1" w:themeFillShade="F2"/>
-        <w:rPr>
-          <w:rFonts w:ascii="Times New Roman" w:hAnsi="Times New Roman" w:cs="Times New Roman"/>
-        </w:rPr>
-      </w:pPr>
-      <w:r>
-        <w:rPr>
-          <w:rFonts w:ascii="Times New Roman" w:hAnsi="Times New Roman" w:cs="Times New Roman"/>
-        </w:rPr>
-        <w:t>Router-1(</w:t>
-      </w:r>
-      <w:proofErr w:type="spellStart"/>
-      <w:r>
-        <w:rPr>
-          <w:rFonts w:ascii="Times New Roman" w:hAnsi="Times New Roman" w:cs="Times New Roman"/>
-        </w:rPr>
-        <w:t>config-</w:t>
-      </w:r>
-      <w:proofErr w:type="gramStart"/>
-      <w:r>
-        <w:rPr>
-          <w:rFonts w:ascii="Times New Roman" w:hAnsi="Times New Roman" w:cs="Times New Roman"/>
-        </w:rPr>
-        <w:t>if</w:t>
-      </w:r>
-      <w:proofErr w:type="spellEnd"/>
-      <w:r>
-        <w:rPr>
-          <w:rFonts w:ascii="Times New Roman" w:hAnsi="Times New Roman" w:cs="Times New Roman"/>
-        </w:rPr>
-        <w:t>)#</w:t>
-      </w:r>
-      <w:proofErr w:type="gramEnd"/>
-      <w:r>
-        <w:rPr>
-          <w:rFonts w:ascii="Times New Roman" w:hAnsi="Times New Roman" w:cs="Times New Roman"/>
-        </w:rPr>
-        <w:t xml:space="preserve"> ipv6 </w:t>
-      </w:r>
-      <w:proofErr w:type="spellStart"/>
-      <w:r>
-        <w:rPr>
-          <w:rFonts w:ascii="Times New Roman" w:hAnsi="Times New Roman" w:cs="Times New Roman"/>
-        </w:rPr>
-        <w:t>address</w:t>
-      </w:r>
-      <w:proofErr w:type="spellEnd"/>
-      <w:r>
-        <w:rPr>
-          <w:rFonts w:ascii="Times New Roman" w:hAnsi="Times New Roman" w:cs="Times New Roman"/>
-        </w:rPr>
-        <w:t xml:space="preserve"> FE80::1 </w:t>
-      </w:r>
-      <w:proofErr w:type="gramStart"/>
-      <w:r>
-        <w:rPr>
-          <w:rFonts w:ascii="Times New Roman" w:hAnsi="Times New Roman" w:cs="Times New Roman"/>
-        </w:rPr>
-        <w:t>link</w:t>
-      </w:r>
-      <w:proofErr w:type="gramEnd"/>
-      <w:r>
-        <w:rPr>
-          <w:rFonts w:ascii="Times New Roman" w:hAnsi="Times New Roman" w:cs="Times New Roman"/>
-        </w:rPr>
-        <w:t>-local</w:t>
-      </w:r>
-    </w:p>
-    <w:p>
-      <w:pPr>
-        <w:shd w:val="clear" w:color="auto" w:fill="F2F2F2" w:themeFill="background1" w:themeFillShade="F2"/>
-        <w:rPr>
-          <w:rFonts w:ascii="Times New Roman" w:hAnsi="Times New Roman" w:cs="Times New Roman"/>
-        </w:rPr>
-      </w:pPr>
-      <w:r>
-        <w:rPr>
-          <w:rFonts w:ascii="Times New Roman" w:hAnsi="Times New Roman" w:cs="Times New Roman"/>
-        </w:rPr>
-        <w:t>Router-1(</w:t>
-      </w:r>
-      <w:proofErr w:type="spellStart"/>
-      <w:r>
-        <w:rPr>
-          <w:rFonts w:ascii="Times New Roman" w:hAnsi="Times New Roman" w:cs="Times New Roman"/>
-        </w:rPr>
-        <w:t>config-</w:t>
-      </w:r>
-      <w:proofErr w:type="gramStart"/>
-      <w:r>
-        <w:rPr>
-          <w:rFonts w:ascii="Times New Roman" w:hAnsi="Times New Roman" w:cs="Times New Roman"/>
-        </w:rPr>
-        <w:t>if</w:t>
-      </w:r>
-      <w:proofErr w:type="spellEnd"/>
-      <w:r>
-        <w:rPr>
-          <w:rFonts w:ascii="Times New Roman" w:hAnsi="Times New Roman" w:cs="Times New Roman"/>
-        </w:rPr>
-        <w:t>)#</w:t>
-      </w:r>
-      <w:proofErr w:type="gramEnd"/>
-      <w:r>
-        <w:rPr>
-          <w:rFonts w:ascii="Times New Roman" w:hAnsi="Times New Roman" w:cs="Times New Roman"/>
-        </w:rPr>
-        <w:t xml:space="preserve"> no shutdown</w:t>
+        <w:t>Router-1(config-if)# no shutdown</w:t>
       </w:r>
     </w:p>
     <w:p>
@@ -886,49 +325,17 @@
           <w:b/>
           <w:bCs/>
         </w:rPr>
-        <w:t xml:space="preserve">Habilitación del Enrutamiento </w:t>
-      </w:r>
-      <w:proofErr w:type="spellStart"/>
-      <w:r>
-        <w:rPr>
-          <w:b/>
-          <w:bCs/>
-        </w:rPr>
-        <w:t>Unicast</w:t>
-      </w:r>
-      <w:proofErr w:type="spellEnd"/>
-      <w:r>
-        <w:rPr>
-          <w:b/>
-          <w:bCs/>
-        </w:rPr>
-        <w:t xml:space="preserve"> IPv6</w:t>
-      </w:r>
-    </w:p>
-    <w:p>
-      <w:r>
-        <w:t xml:space="preserve">Un paso crítico identificado durante la práctica fue la activación global del enrutamiento IPv6. Por defecto, los </w:t>
-      </w:r>
-      <w:proofErr w:type="spellStart"/>
-      <w:r>
-        <w:t>routers</w:t>
-      </w:r>
-      <w:proofErr w:type="spellEnd"/>
-      <w:r>
-        <w:t xml:space="preserve"> Cisco actúan como nodos finales y no reenvían paquetes IPv6 ni envían mensajes de anuncio (RA) a menos que se habilite explícitamente esta función. </w:t>
-      </w:r>
-    </w:p>
-    <w:p>
-      <w:r>
-        <w:t xml:space="preserve">Como se observa en la evidencia técnica del </w:t>
-      </w:r>
-      <w:proofErr w:type="spellStart"/>
-      <w:r>
-        <w:t>Router</w:t>
-      </w:r>
-      <w:proofErr w:type="spellEnd"/>
-      <w:r>
-        <w:t xml:space="preserve"> 1:</w:t>
+        <w:t>Habilitación del Enrutamiento Unicast IPv6</w:t>
+      </w:r>
+    </w:p>
+    <w:p>
+      <w:r>
+        <w:t xml:space="preserve">Un paso crítico identificado durante la práctica fue la activación global del enrutamiento IPv6. Por defecto, los routers Cisco actúan como nodos finales y no reenvían paquetes IPv6 ni envían mensajes de anuncio (RA) a menos que se habilite explícitamente esta función. </w:t>
+      </w:r>
+    </w:p>
+    <w:p>
+      <w:r>
+        <w:t>Como se observa en la evidencia técnica del Router 1:</w:t>
       </w:r>
     </w:p>
     <w:p>
@@ -939,31 +346,7 @@
         </w:numPr>
       </w:pPr>
       <w:r>
-        <w:t xml:space="preserve">Validación Inicial: Al ejecutar </w:t>
-      </w:r>
-      <w:proofErr w:type="gramStart"/>
-      <w:r>
-        <w:t>show</w:t>
-      </w:r>
-      <w:proofErr w:type="gramEnd"/>
-      <w:r>
-        <w:t xml:space="preserve"> ipv6 </w:t>
-      </w:r>
-      <w:proofErr w:type="spellStart"/>
-      <w:r>
-        <w:t>protocols</w:t>
-      </w:r>
-      <w:proofErr w:type="spellEnd"/>
-      <w:r>
-        <w:t xml:space="preserve">, el </w:t>
-      </w:r>
-      <w:proofErr w:type="spellStart"/>
-      <w:r>
-        <w:t>router</w:t>
-      </w:r>
-      <w:proofErr w:type="spellEnd"/>
-      <w:r>
-        <w:t xml:space="preserve"> solo mostraba protocolos conectados y de descubrimiento (ND), indicando que el enrutamiento dinámico y el reenvío estaban inactivos.</w:t>
+        <w:t>Validación Inicial: Al ejecutar show ipv6 protocols, el router solo mostraba protocolos conectados y de descubrimiento (ND), indicando que el enrutamiento dinámico y el reenvío estaban inactivos.</w:t>
       </w:r>
     </w:p>
     <w:p>
@@ -974,15 +357,7 @@
         </w:numPr>
       </w:pPr>
       <w:r>
-        <w:t xml:space="preserve">Activación: Se ejecutó el comando de configuración global ipv6 </w:t>
-      </w:r>
-      <w:proofErr w:type="spellStart"/>
-      <w:r>
-        <w:t>unicast-routing</w:t>
-      </w:r>
-      <w:proofErr w:type="spellEnd"/>
-      <w:r>
-        <w:t xml:space="preserve">. </w:t>
+        <w:t xml:space="preserve">Activación: Se ejecutó el comando de configuración global ipv6 unicast-routing. </w:t>
       </w:r>
     </w:p>
     <w:p>
@@ -993,15 +368,7 @@
         </w:numPr>
       </w:pPr>
       <w:r>
-        <w:t xml:space="preserve">Impacto: Este comando permitió que el </w:t>
-      </w:r>
-      <w:proofErr w:type="spellStart"/>
-      <w:r>
-        <w:t>router</w:t>
-      </w:r>
-      <w:proofErr w:type="spellEnd"/>
-      <w:r>
-        <w:t xml:space="preserve"> comenzara a procesar el direccionamiento IPv6 en todas sus interfaces up/up y habilitó la capacidad de participar en el proceso de enrutamiento OSPFv3</w:t>
+        <w:t>Impacto: Este comando permitió que el router comenzara a procesar el direccionamiento IPv6 en todas sus interfaces up/up y habilitó la capacidad de participar en el proceso de enrutamiento OSPFv3</w:t>
       </w:r>
     </w:p>
     <w:p>
@@ -1024,26 +391,12 @@
           <w:bCs/>
         </w:rPr>
         <w:br/>
-      </w:r>
-      <w:r>
-        <w:rPr>
-          <w:b/>
-          <w:bCs/>
-        </w:rPr>
         <w:t>Verificación en los Hosts</w:t>
       </w:r>
     </w:p>
     <w:p>
       <w:r>
-        <w:t xml:space="preserve">Una vez configurado el </w:t>
-      </w:r>
-      <w:proofErr w:type="spellStart"/>
-      <w:r>
-        <w:t>router</w:t>
-      </w:r>
-      <w:proofErr w:type="spellEnd"/>
-      <w:r>
-        <w:t>, se validó en los dispositivos finales (</w:t>
+        <w:t>Una vez configurado el router, se validó en los dispositivos finales (</w:t>
       </w:r>
       <w:r>
         <w:rPr>
@@ -1055,7 +408,6 @@
       <w:r>
         <w:t xml:space="preserve">) el cambio de configuración de IP estática a </w:t>
       </w:r>
-      <w:proofErr w:type="spellStart"/>
       <w:r>
         <w:rPr>
           <w:b/>
@@ -1063,7 +415,6 @@
         </w:rPr>
         <w:t>Automatic</w:t>
       </w:r>
-      <w:proofErr w:type="spellEnd"/>
       <w:r>
         <w:t>.</w:t>
       </w:r>
@@ -1093,15 +444,7 @@
         <w:t>Asignación Exitosa:</w:t>
       </w:r>
       <w:r>
-        <w:t xml:space="preserve"> Los hosts recibieron el prefijo /64 correspondiente a su segmento y generaron su propia Identificación de Interfaz (</w:t>
-      </w:r>
-      <w:proofErr w:type="gramStart"/>
-      <w:r>
-        <w:t>Interface</w:t>
-      </w:r>
-      <w:proofErr w:type="gramEnd"/>
-      <w:r>
-        <w:t xml:space="preserve"> ID).</w:t>
+        <w:t xml:space="preserve"> Los hosts recibieron el prefijo /64 correspondiente a su segmento y generaron su propia Identificación de Interfaz (Interface ID).</w:t>
       </w:r>
     </w:p>
     <w:p>
@@ -1119,58 +462,17 @@
         <w:t>Gateway Predeterminado:</w:t>
       </w:r>
       <w:r>
-        <w:t xml:space="preserve"> Se verificó mediante el comando </w:t>
-      </w:r>
-      <w:proofErr w:type="spellStart"/>
-      <w:r>
-        <w:t>ipconfig</w:t>
-      </w:r>
-      <w:proofErr w:type="spellEnd"/>
-      <w:r>
-        <w:t xml:space="preserve"> que los </w:t>
-      </w:r>
-      <w:proofErr w:type="spellStart"/>
-      <w:r>
-        <w:t>PCs</w:t>
-      </w:r>
-      <w:proofErr w:type="spellEnd"/>
-      <w:r>
-        <w:t xml:space="preserve"> tomaron automáticamente la dirección </w:t>
-      </w:r>
-      <w:proofErr w:type="gramStart"/>
-      <w:r>
-        <w:rPr>
-          <w:b/>
-          <w:bCs/>
-        </w:rPr>
-        <w:t>Link</w:t>
-      </w:r>
-      <w:proofErr w:type="gramEnd"/>
-      <w:r>
-        <w:rPr>
-          <w:b/>
-          <w:bCs/>
-        </w:rPr>
-        <w:t>-Local</w:t>
-      </w:r>
-      <w:r>
-        <w:t xml:space="preserve"> del </w:t>
-      </w:r>
-      <w:proofErr w:type="spellStart"/>
-      <w:r>
-        <w:t>router</w:t>
-      </w:r>
-      <w:proofErr w:type="spellEnd"/>
-      <w:r>
-        <w:t xml:space="preserve"> (FE</w:t>
-      </w:r>
-      <w:proofErr w:type="gramStart"/>
-      <w:r>
-        <w:t>80::X</w:t>
-      </w:r>
-      <w:proofErr w:type="gramEnd"/>
-      <w:r>
-        <w:t>) como su puerta de enlace, validando así el intercambio de mensajes RS/RA.</w:t>
+        <w:t xml:space="preserve"> Se verificó mediante el comando ipconfig que los PCs tomaron automáticamente la dirección </w:t>
+      </w:r>
+      <w:r>
+        <w:rPr>
+          <w:b/>
+          <w:bCs/>
+        </w:rPr>
+        <w:t>Link-Local</w:t>
+      </w:r>
+      <w:r>
+        <w:t xml:space="preserve"> del router (FE80::X) como su puerta de enlace, validando así el intercambio de mensajes RS/RA.</w:t>
       </w:r>
     </w:p>
     <w:p>
@@ -1188,65 +490,17 @@
         <w:t>Confirmación visual:</w:t>
       </w:r>
       <w:r>
-        <w:t xml:space="preserve"> En la interfaz de </w:t>
-      </w:r>
-      <w:proofErr w:type="spellStart"/>
-      <w:r>
-        <w:t>Packet</w:t>
-      </w:r>
-      <w:proofErr w:type="spellEnd"/>
-      <w:r>
-        <w:t xml:space="preserve"> Tracer, se confirmó el mensaje </w:t>
+        <w:t xml:space="preserve"> En la interfaz de Packet Tracer, se confirmó el mensaje </w:t>
       </w:r>
       <w:r>
         <w:rPr>
           <w:i/>
           <w:iCs/>
         </w:rPr>
-        <w:t xml:space="preserve">"IPv6 </w:t>
-      </w:r>
-      <w:proofErr w:type="spellStart"/>
-      <w:r>
-        <w:rPr>
-          <w:i/>
-          <w:iCs/>
-        </w:rPr>
-        <w:t>request</w:t>
-      </w:r>
-      <w:proofErr w:type="spellEnd"/>
-      <w:r>
-        <w:rPr>
-          <w:i/>
-          <w:iCs/>
-        </w:rPr>
-        <w:t xml:space="preserve"> </w:t>
-      </w:r>
-      <w:proofErr w:type="spellStart"/>
-      <w:r>
-        <w:rPr>
-          <w:i/>
-          <w:iCs/>
-        </w:rPr>
-        <w:t>successful</w:t>
-      </w:r>
-      <w:proofErr w:type="spellEnd"/>
-      <w:r>
-        <w:rPr>
-          <w:i/>
-          <w:iCs/>
-        </w:rPr>
-        <w:t>"</w:t>
-      </w:r>
-      <w:r>
-        <w:t xml:space="preserve">, lo que indica que el proceso NDP (Neighbor Discovery </w:t>
-      </w:r>
-      <w:proofErr w:type="spellStart"/>
-      <w:r>
-        <w:t>Protocol</w:t>
-      </w:r>
-      <w:proofErr w:type="spellEnd"/>
-      <w:r>
-        <w:t>) completó el ciclo de direccionamiento sin errores.</w:t>
+        <w:t>"IPv6 request successful"</w:t>
+      </w:r>
+      <w:r>
+        <w:t>, lo que indica que el proceso NDP (Neighbor Discovery Protocol) completó el ciclo de direccionamiento sin errores.</w:t>
       </w:r>
     </w:p>
     <w:tbl>
@@ -1374,27 +628,7 @@
                 <w:sz w:val="20"/>
                 <w:szCs w:val="20"/>
               </w:rPr>
-              <w:t>Gateway (</w:t>
-            </w:r>
-            <w:proofErr w:type="gramStart"/>
-            <w:r>
-              <w:rPr>
-                <w:b/>
-                <w:bCs/>
-                <w:sz w:val="20"/>
-                <w:szCs w:val="20"/>
-              </w:rPr>
-              <w:t>Link</w:t>
-            </w:r>
-            <w:proofErr w:type="gramEnd"/>
-            <w:r>
-              <w:rPr>
-                <w:b/>
-                <w:bCs/>
-                <w:sz w:val="20"/>
-                <w:szCs w:val="20"/>
-              </w:rPr>
-              <w:t>-Local)</w:t>
+              <w:t>Gateway (Link-Local)</w:t>
             </w:r>
           </w:p>
         </w:tc>
@@ -1500,37 +734,12 @@
                 <w:szCs w:val="20"/>
               </w:rPr>
             </w:pPr>
-            <w:proofErr w:type="gramStart"/>
             <w:r>
               <w:rPr>
                 <w:sz w:val="20"/>
                 <w:szCs w:val="20"/>
               </w:rPr>
-              <w:t>2001:DB8:CC1A</w:t>
-            </w:r>
-            <w:proofErr w:type="gramEnd"/>
-            <w:r>
-              <w:rPr>
-                <w:sz w:val="20"/>
-                <w:szCs w:val="20"/>
-              </w:rPr>
-              <w:t>:</w:t>
-            </w:r>
-            <w:proofErr w:type="gramStart"/>
-            <w:r>
-              <w:rPr>
-                <w:sz w:val="20"/>
-                <w:szCs w:val="20"/>
-              </w:rPr>
-              <w:t>1::/</w:t>
-            </w:r>
-            <w:proofErr w:type="gramEnd"/>
-            <w:r>
-              <w:rPr>
-                <w:sz w:val="20"/>
-                <w:szCs w:val="20"/>
-              </w:rPr>
-              <w:t>64</w:t>
+              <w:t>2001:DB8:CC1A:1::/64</w:t>
             </w:r>
           </w:p>
         </w:tc>
@@ -1669,37 +878,12 @@
                 <w:szCs w:val="20"/>
               </w:rPr>
             </w:pPr>
-            <w:proofErr w:type="gramStart"/>
             <w:r>
               <w:rPr>
                 <w:sz w:val="20"/>
                 <w:szCs w:val="20"/>
               </w:rPr>
-              <w:t>2001:DB8:CC1A</w:t>
-            </w:r>
-            <w:proofErr w:type="gramEnd"/>
-            <w:r>
-              <w:rPr>
-                <w:sz w:val="20"/>
-                <w:szCs w:val="20"/>
-              </w:rPr>
-              <w:t>:</w:t>
-            </w:r>
-            <w:proofErr w:type="gramStart"/>
-            <w:r>
-              <w:rPr>
-                <w:sz w:val="20"/>
-                <w:szCs w:val="20"/>
-              </w:rPr>
-              <w:t>2::/</w:t>
-            </w:r>
-            <w:proofErr w:type="gramEnd"/>
-            <w:r>
-              <w:rPr>
-                <w:sz w:val="20"/>
-                <w:szCs w:val="20"/>
-              </w:rPr>
-              <w:t>64</w:t>
+              <w:t>2001:DB8:CC1A:2::/64</w:t>
             </w:r>
           </w:p>
         </w:tc>
@@ -1773,6 +957,332 @@
         </w:tc>
       </w:tr>
     </w:tbl>
+    <w:p>
+      <w:pPr>
+        <w:rPr>
+          <w:b/>
+          <w:bCs/>
+        </w:rPr>
+      </w:pPr>
+      <w:r>
+        <w:br/>
+      </w:r>
+      <w:r>
+        <w:rPr>
+          <w:b/>
+          <w:bCs/>
+        </w:rPr>
+        <w:t xml:space="preserve">Configuración de Enrutamiento Dinámico OSPFv3 </w:t>
+      </w:r>
+    </w:p>
+    <w:p>
+      <w:r>
+        <w:t xml:space="preserve">Tras establecer la conectividad local mediante SLAAC, se implementó el protocolo </w:t>
+      </w:r>
+      <w:r>
+        <w:rPr>
+          <w:b/>
+          <w:bCs/>
+        </w:rPr>
+        <w:t>OSPFv3 (Open Shortest Path First versión 3)</w:t>
+      </w:r>
+      <w:r>
+        <w:t xml:space="preserve"> para habilitar el intercambio de rutas IPv6 entre las distintas constelaciones de la topología. A diferencia de IPv4, este protocolo se configuró bajo la lógica de "habilitación por interfaz".</w:t>
+      </w:r>
+    </w:p>
+    <w:p>
+      <w:pPr>
+        <w:rPr>
+          <w:b/>
+          <w:bCs/>
+        </w:rPr>
+      </w:pPr>
+      <w:r>
+        <w:rPr>
+          <w:b/>
+          <w:bCs/>
+        </w:rPr>
+        <w:t>Proceso de Configuración Técnica</w:t>
+      </w:r>
+    </w:p>
+    <w:p>
+      <w:r>
+        <w:t>La implementación se realizó siguiendo tres pasos críticos en cada router:</w:t>
+      </w:r>
+    </w:p>
+    <w:p>
+      <w:pPr>
+        <w:numPr>
+          <w:ilvl w:val="0"/>
+          <w:numId w:val="5"/>
+        </w:numPr>
+      </w:pPr>
+      <w:r>
+        <w:rPr>
+          <w:b/>
+          <w:bCs/>
+        </w:rPr>
+        <w:t>Activación del Proceso:</w:t>
+      </w:r>
+      <w:r>
+        <w:t xml:space="preserve"> Se creó el proceso OSPFv3 y se asignó un </w:t>
+      </w:r>
+      <w:r>
+        <w:rPr>
+          <w:b/>
+          <w:bCs/>
+        </w:rPr>
+        <w:t>Router-ID</w:t>
+      </w:r>
+      <w:r>
+        <w:t xml:space="preserve"> de 32 bits (en formato decimal), requisito indispensable ya que el protocolo no puede autogenerar este ID en un entorno puramente IPv6.</w:t>
+      </w:r>
+    </w:p>
+    <w:p>
+      <w:pPr>
+        <w:numPr>
+          <w:ilvl w:val="0"/>
+          <w:numId w:val="5"/>
+        </w:numPr>
+      </w:pPr>
+      <w:r>
+        <w:rPr>
+          <w:b/>
+          <w:bCs/>
+        </w:rPr>
+        <w:t>Habilitación en Interfaces:</w:t>
+      </w:r>
+      <w:r>
+        <w:t xml:space="preserve"> Se asociaron tanto las interfaces LAN (GigabitEthernet0/0) como las interfaces de enlace (WAN) al </w:t>
+      </w:r>
+      <w:r>
+        <w:rPr>
+          <w:b/>
+          <w:bCs/>
+        </w:rPr>
+        <w:t>Área 0 (Backbone)</w:t>
+      </w:r>
+      <w:r>
+        <w:t>.</w:t>
+      </w:r>
+    </w:p>
+    <w:p>
+      <w:pPr>
+        <w:numPr>
+          <w:ilvl w:val="0"/>
+          <w:numId w:val="5"/>
+        </w:numPr>
+      </w:pPr>
+      <w:r>
+        <w:rPr>
+          <w:b/>
+          <w:bCs/>
+        </w:rPr>
+        <w:t>Uso de Link-Local:</w:t>
+      </w:r>
+      <w:r>
+        <w:t xml:space="preserve"> Se verificó que las adyacencias se formaran utilizando las direcciones de enlace local (FE80::/10), garantizando que el tráfico de control de enrutamiento permanezca dentro del segmento físico.</w:t>
+      </w:r>
+    </w:p>
+    <w:p>
+      <w:r>
+        <w:rPr>
+          <w:b/>
+          <w:bCs/>
+        </w:rPr>
+        <w:t>Comandos de ejemplo aplicados:</w:t>
+      </w:r>
+    </w:p>
+    <w:p/>
+    <w:p>
+      <w:pPr>
+        <w:shd w:val="clear" w:color="auto" w:fill="F2F2F2" w:themeFill="background1" w:themeFillShade="F2"/>
+        <w:rPr>
+          <w:rFonts w:ascii="Times New Roman" w:hAnsi="Times New Roman" w:cs="Times New Roman"/>
+          <w:lang w:val="en-GB"/>
+        </w:rPr>
+      </w:pPr>
+      <w:r>
+        <w:rPr>
+          <w:rFonts w:ascii="Times New Roman" w:hAnsi="Times New Roman" w:cs="Times New Roman"/>
+          <w:lang w:val="en-GB"/>
+        </w:rPr>
+        <w:lastRenderedPageBreak/>
+        <w:t>Router(config)# ipv6 router ospf 1</w:t>
+      </w:r>
+    </w:p>
+    <w:p>
+      <w:pPr>
+        <w:shd w:val="clear" w:color="auto" w:fill="F2F2F2" w:themeFill="background1" w:themeFillShade="F2"/>
+        <w:rPr>
+          <w:rFonts w:ascii="Times New Roman" w:hAnsi="Times New Roman" w:cs="Times New Roman"/>
+          <w:lang w:val="en-GB"/>
+        </w:rPr>
+      </w:pPr>
+      <w:r>
+        <w:rPr>
+          <w:rFonts w:ascii="Times New Roman" w:hAnsi="Times New Roman" w:cs="Times New Roman"/>
+          <w:lang w:val="en-GB"/>
+        </w:rPr>
+        <w:t>Router(config-rtr)# router-id 1.1.1.1</w:t>
+      </w:r>
+    </w:p>
+    <w:p>
+      <w:pPr>
+        <w:shd w:val="clear" w:color="auto" w:fill="F2F2F2" w:themeFill="background1" w:themeFillShade="F2"/>
+        <w:rPr>
+          <w:rFonts w:ascii="Times New Roman" w:hAnsi="Times New Roman" w:cs="Times New Roman"/>
+          <w:lang w:val="en-GB"/>
+        </w:rPr>
+      </w:pPr>
+      <w:r>
+        <w:rPr>
+          <w:rFonts w:ascii="Times New Roman" w:hAnsi="Times New Roman" w:cs="Times New Roman"/>
+          <w:lang w:val="en-GB"/>
+        </w:rPr>
+        <w:t>Router(config)# interface GigabitEthernet0/2/0</w:t>
+      </w:r>
+    </w:p>
+    <w:p>
+      <w:pPr>
+        <w:shd w:val="clear" w:color="auto" w:fill="F2F2F2" w:themeFill="background1" w:themeFillShade="F2"/>
+        <w:rPr>
+          <w:rFonts w:ascii="Times New Roman" w:hAnsi="Times New Roman" w:cs="Times New Roman"/>
+          <w:lang w:val="en-GB"/>
+        </w:rPr>
+      </w:pPr>
+      <w:r>
+        <w:rPr>
+          <w:rFonts w:ascii="Times New Roman" w:hAnsi="Times New Roman" w:cs="Times New Roman"/>
+          <w:lang w:val="en-GB"/>
+        </w:rPr>
+        <w:t>Router(config-if)# ipv6 ospf 1 area 0</w:t>
+      </w:r>
+    </w:p>
+    <w:p>
+      <w:pPr>
+        <w:rPr>
+          <w:b/>
+          <w:bCs/>
+        </w:rPr>
+      </w:pPr>
+    </w:p>
+    <w:p>
+      <w:pPr>
+        <w:rPr>
+          <w:b/>
+          <w:bCs/>
+        </w:rPr>
+      </w:pPr>
+      <w:r>
+        <w:rPr>
+          <w:b/>
+          <w:bCs/>
+        </w:rPr>
+        <w:t>Verificación de la Tabla de Enrutamiento y Adyacencias</w:t>
+      </w:r>
+    </w:p>
+    <w:p>
+      <w:r>
+        <w:t>Para validar el éxito del punto 4.6, se ejecutaron comandos de diagnóstico que arrojaron los siguientes resultados:</w:t>
+      </w:r>
+    </w:p>
+    <w:p>
+      <w:pPr>
+        <w:numPr>
+          <w:ilvl w:val="0"/>
+          <w:numId w:val="6"/>
+        </w:numPr>
+      </w:pPr>
+      <w:r>
+        <w:rPr>
+          <w:b/>
+          <w:bCs/>
+        </w:rPr>
+        <w:t>Vecindad OSPF:</w:t>
+      </w:r>
+      <w:r>
+        <w:t xml:space="preserve"> El comando show ipv6 ospf neighbor confirmó el estado </w:t>
+      </w:r>
+      <w:r>
+        <w:rPr>
+          <w:b/>
+          <w:bCs/>
+        </w:rPr>
+        <w:t>FULL</w:t>
+      </w:r>
+      <w:r>
+        <w:t xml:space="preserve"> con los routers adyacentes, indicando una sincronización completa de la base de datos de estado de enlace (LSDB).</w:t>
+      </w:r>
+    </w:p>
+    <w:p>
+      <w:pPr>
+        <w:numPr>
+          <w:ilvl w:val="0"/>
+          <w:numId w:val="6"/>
+        </w:numPr>
+      </w:pPr>
+      <w:r>
+        <w:rPr>
+          <w:b/>
+          <w:bCs/>
+        </w:rPr>
+        <w:t>Convergencia de Rutas:</w:t>
+      </w:r>
+      <w:r>
+        <w:t xml:space="preserve"> Mediante show ipv6 route ospf, se evidenció la aparición de rutas remotas con el prefijo </w:t>
+      </w:r>
+      <w:r>
+        <w:rPr>
+          <w:b/>
+          <w:bCs/>
+        </w:rPr>
+        <w:t>"O"</w:t>
+      </w:r>
+      <w:r>
+        <w:t>. Esto demuestra que el Router 1 ahora conoce la red de la LAN 2 (2001:DB8:CC1A:2::/64) y viceversa.</w:t>
+      </w:r>
+    </w:p>
+    <w:p>
+      <w:pPr>
+        <w:rPr>
+          <w:b/>
+          <w:bCs/>
+        </w:rPr>
+      </w:pPr>
+      <w:r>
+        <w:rPr>
+          <w:b/>
+          <w:bCs/>
+        </w:rPr>
+        <w:t>Prueba de Conectividad Extremo a Extremo</w:t>
+      </w:r>
+    </w:p>
+    <w:p>
+      <w:r>
+        <w:t xml:space="preserve">Como validación final, se realizó una prueba de </w:t>
+      </w:r>
+      <w:r>
+        <w:rPr>
+          <w:b/>
+          <w:bCs/>
+        </w:rPr>
+        <w:t>Ping</w:t>
+      </w:r>
+      <w:r>
+        <w:t xml:space="preserve"> y </w:t>
+      </w:r>
+      <w:r>
+        <w:rPr>
+          <w:b/>
+          <w:bCs/>
+        </w:rPr>
+        <w:t>Traceroute</w:t>
+      </w:r>
+      <w:r>
+        <w:t xml:space="preserve"> desde el PC00 hacia la dirección Global Unicast del PC02. El éxito de estas pruebas confirma que el plano de datos está correctamente direccionado y que el protocolo de enrutamiento dinámico ha seleccionado la ruta óptima a través de la red.</w:t>
+      </w:r>
+    </w:p>
     <w:p/>
     <w:sectPr>
       <w:pgSz w:w="12240" w:h="15840"/>
@@ -1787,6 +1297,155 @@
 <file path=word/numbering.xml><?xml version="1.0" encoding="utf-8"?>
 <w:numbering xmlns:wpc="http://schemas.microsoft.com/office/word/2010/wordprocessingCanvas" xmlns:cx="http://schemas.microsoft.com/office/drawing/2014/chartex" xmlns:cx1="http://schemas.microsoft.com/office/drawing/2015/9/8/chartex" xmlns:cx2="http://schemas.microsoft.com/office/drawing/2015/10/21/chartex" xmlns:cx3="http://schemas.microsoft.com/office/drawing/2016/5/9/chartex" xmlns:cx4="http://schemas.microsoft.com/office/drawing/2016/5/10/chartex" xmlns:cx5="http://schemas.microsoft.com/office/drawing/2016/5/11/chartex" xmlns:cx6="http://schemas.microsoft.com/office/drawing/2016/5/12/chartex" xmlns:cx7="http://schemas.microsoft.com/office/drawing/2016/5/13/chartex" xmlns:cx8="http://schemas.microsoft.com/office/drawing/2016/5/14/chartex" xmlns:mc="http://schemas.openxmlformats.org/markup-compatibility/2006" xmlns:aink="http://schemas.microsoft.com/office/drawing/2016/ink" xmlns:am3d="http://schemas.microsoft.com/office/drawing/2017/model3d" xmlns:o="urn:schemas-microsoft-com:office:office" xmlns:oel="http://schemas.microsoft.com/office/2019/extlst" xmlns:r="http://schemas.openxmlformats.org/officeDocument/2006/relationships" xmlns:m="http://schemas.openxmlformats.org/officeDocument/2006/math" xmlns:v="urn:schemas-microsoft-com:vml" xmlns:wp14="http://schemas.microsoft.com/office/word/2010/wordprocessingDrawing" xmlns:wp="http://schemas.openxmlformats.org/drawingml/2006/wordprocessingDrawing" xmlns:w10="urn:schemas-microsoft-com:office:word" xmlns:w="http://schemas.openxmlformats.org/wordprocessingml/2006/main" xmlns:w14="http://schemas.microsoft.com/office/word/2010/wordml" xmlns:w15="http://schemas.microsoft.com/office/word/2012/wordml" xmlns:w16cex="http://schemas.microsoft.com/office/word/2018/wordml/cex" xmlns:w16cid="http://schemas.microsoft.com/office/word/2016/wordml/cid" xmlns:w16="http://schemas.microsoft.com/office/word/2018/wordml" xmlns:w16du="http://schemas.microsoft.com/office/word/2023/wordml/word16du" xmlns:w16sdtdh="http://schemas.microsoft.com/office/word/2020/wordml/sdtdatahash" xmlns:w16sdtfl="http://schemas.microsoft.com/office/word/2024/wordml/sdtformatlock" xmlns:w16se="http://schemas.microsoft.com/office/word/2015/wordml/symex" xmlns:wpg="http://schemas.microsoft.com/office/word/2010/wordprocessingGroup" xmlns:wpi="http://schemas.microsoft.com/office/word/2010/wordprocessingInk" xmlns:wne="http://schemas.microsoft.com/office/word/2006/wordml" xmlns:wps="http://schemas.microsoft.com/office/word/2010/wordprocessingShape" mc:Ignorable="w14 w15 w16se w16cid w16 w16cex w16sdtdh w16sdtfl w16du wp14">
   <w:abstractNum w:abstractNumId="0" w15:restartNumberingAfterBreak="0">
+    <w:nsid w:val="1EBD6B54"/>
+    <w:multiLevelType w:val="multilevel"/>
+    <w:tmpl w:val="AB706198"/>
+    <w:lvl w:ilvl="0">
+      <w:start w:val="1"/>
+      <w:numFmt w:val="bullet"/>
+      <w:lvlText w:val=""/>
+      <w:lvlJc w:val="left"/>
+      <w:pPr>
+        <w:tabs>
+          <w:tab w:val="num" w:pos="720"/>
+        </w:tabs>
+        <w:ind w:left="720" w:hanging="360"/>
+      </w:pPr>
+      <w:rPr>
+        <w:rFonts w:ascii="Symbol" w:hAnsi="Symbol" w:hint="default"/>
+        <w:sz w:val="20"/>
+      </w:rPr>
+    </w:lvl>
+    <w:lvl w:ilvl="1" w:tentative="1">
+      <w:start w:val="1"/>
+      <w:numFmt w:val="bullet"/>
+      <w:lvlText w:val="o"/>
+      <w:lvlJc w:val="left"/>
+      <w:pPr>
+        <w:tabs>
+          <w:tab w:val="num" w:pos="1440"/>
+        </w:tabs>
+        <w:ind w:left="1440" w:hanging="360"/>
+      </w:pPr>
+      <w:rPr>
+        <w:rFonts w:ascii="Courier New" w:hAnsi="Courier New" w:hint="default"/>
+        <w:sz w:val="20"/>
+      </w:rPr>
+    </w:lvl>
+    <w:lvl w:ilvl="2" w:tentative="1">
+      <w:start w:val="1"/>
+      <w:numFmt w:val="bullet"/>
+      <w:lvlText w:val=""/>
+      <w:lvlJc w:val="left"/>
+      <w:pPr>
+        <w:tabs>
+          <w:tab w:val="num" w:pos="2160"/>
+        </w:tabs>
+        <w:ind w:left="2160" w:hanging="360"/>
+      </w:pPr>
+      <w:rPr>
+        <w:rFonts w:ascii="Wingdings" w:hAnsi="Wingdings" w:hint="default"/>
+        <w:sz w:val="20"/>
+      </w:rPr>
+    </w:lvl>
+    <w:lvl w:ilvl="3" w:tentative="1">
+      <w:start w:val="1"/>
+      <w:numFmt w:val="bullet"/>
+      <w:lvlText w:val=""/>
+      <w:lvlJc w:val="left"/>
+      <w:pPr>
+        <w:tabs>
+          <w:tab w:val="num" w:pos="2880"/>
+        </w:tabs>
+        <w:ind w:left="2880" w:hanging="360"/>
+      </w:pPr>
+      <w:rPr>
+        <w:rFonts w:ascii="Wingdings" w:hAnsi="Wingdings" w:hint="default"/>
+        <w:sz w:val="20"/>
+      </w:rPr>
+    </w:lvl>
+    <w:lvl w:ilvl="4" w:tentative="1">
+      <w:start w:val="1"/>
+      <w:numFmt w:val="bullet"/>
+      <w:lvlText w:val=""/>
+      <w:lvlJc w:val="left"/>
+      <w:pPr>
+        <w:tabs>
+          <w:tab w:val="num" w:pos="3600"/>
+        </w:tabs>
+        <w:ind w:left="3600" w:hanging="360"/>
+      </w:pPr>
+      <w:rPr>
+        <w:rFonts w:ascii="Wingdings" w:hAnsi="Wingdings" w:hint="default"/>
+        <w:sz w:val="20"/>
+      </w:rPr>
+    </w:lvl>
+    <w:lvl w:ilvl="5" w:tentative="1">
+      <w:start w:val="1"/>
+      <w:numFmt w:val="bullet"/>
+      <w:lvlText w:val=""/>
+      <w:lvlJc w:val="left"/>
+      <w:pPr>
+        <w:tabs>
+          <w:tab w:val="num" w:pos="4320"/>
+        </w:tabs>
+        <w:ind w:left="4320" w:hanging="360"/>
+      </w:pPr>
+      <w:rPr>
+        <w:rFonts w:ascii="Wingdings" w:hAnsi="Wingdings" w:hint="default"/>
+        <w:sz w:val="20"/>
+      </w:rPr>
+    </w:lvl>
+    <w:lvl w:ilvl="6" w:tentative="1">
+      <w:start w:val="1"/>
+      <w:numFmt w:val="bullet"/>
+      <w:lvlText w:val=""/>
+      <w:lvlJc w:val="left"/>
+      <w:pPr>
+        <w:tabs>
+          <w:tab w:val="num" w:pos="5040"/>
+        </w:tabs>
+        <w:ind w:left="5040" w:hanging="360"/>
+      </w:pPr>
+      <w:rPr>
+        <w:rFonts w:ascii="Wingdings" w:hAnsi="Wingdings" w:hint="default"/>
+        <w:sz w:val="20"/>
+      </w:rPr>
+    </w:lvl>
+    <w:lvl w:ilvl="7" w:tentative="1">
+      <w:start w:val="1"/>
+      <w:numFmt w:val="bullet"/>
+      <w:lvlText w:val=""/>
+      <w:lvlJc w:val="left"/>
+      <w:pPr>
+        <w:tabs>
+          <w:tab w:val="num" w:pos="5760"/>
+        </w:tabs>
+        <w:ind w:left="5760" w:hanging="360"/>
+      </w:pPr>
+      <w:rPr>
+        <w:rFonts w:ascii="Wingdings" w:hAnsi="Wingdings" w:hint="default"/>
+        <w:sz w:val="20"/>
+      </w:rPr>
+    </w:lvl>
+    <w:lvl w:ilvl="8" w:tentative="1">
+      <w:start w:val="1"/>
+      <w:numFmt w:val="bullet"/>
+      <w:lvlText w:val=""/>
+      <w:lvlJc w:val="left"/>
+      <w:pPr>
+        <w:tabs>
+          <w:tab w:val="num" w:pos="6480"/>
+        </w:tabs>
+        <w:ind w:left="6480" w:hanging="360"/>
+      </w:pPr>
+      <w:rPr>
+        <w:rFonts w:ascii="Wingdings" w:hAnsi="Wingdings" w:hint="default"/>
+        <w:sz w:val="20"/>
+      </w:rPr>
+    </w:lvl>
+  </w:abstractNum>
+  <w:abstractNum w:abstractNumId="1" w15:restartNumberingAfterBreak="0">
     <w:nsid w:val="2B03417D"/>
     <w:multiLevelType w:val="hybridMultilevel"/>
     <w:tmpl w:val="CDD2A302"/>
@@ -1899,7 +1558,120 @@
       </w:rPr>
     </w:lvl>
   </w:abstractNum>
-  <w:abstractNum w:abstractNumId="1" w15:restartNumberingAfterBreak="0">
+  <w:abstractNum w:abstractNumId="2" w15:restartNumberingAfterBreak="0">
+    <w:nsid w:val="3E6C6D7E"/>
+    <w:multiLevelType w:val="multilevel"/>
+    <w:tmpl w:val="7F066CF2"/>
+    <w:lvl w:ilvl="0">
+      <w:start w:val="1"/>
+      <w:numFmt w:val="decimal"/>
+      <w:lvlText w:val="%1."/>
+      <w:lvlJc w:val="left"/>
+      <w:pPr>
+        <w:tabs>
+          <w:tab w:val="num" w:pos="720"/>
+        </w:tabs>
+        <w:ind w:left="720" w:hanging="360"/>
+      </w:pPr>
+    </w:lvl>
+    <w:lvl w:ilvl="1" w:tentative="1">
+      <w:start w:val="1"/>
+      <w:numFmt w:val="decimal"/>
+      <w:lvlText w:val="%2."/>
+      <w:lvlJc w:val="left"/>
+      <w:pPr>
+        <w:tabs>
+          <w:tab w:val="num" w:pos="1440"/>
+        </w:tabs>
+        <w:ind w:left="1440" w:hanging="360"/>
+      </w:pPr>
+    </w:lvl>
+    <w:lvl w:ilvl="2" w:tentative="1">
+      <w:start w:val="1"/>
+      <w:numFmt w:val="decimal"/>
+      <w:lvlText w:val="%3."/>
+      <w:lvlJc w:val="left"/>
+      <w:pPr>
+        <w:tabs>
+          <w:tab w:val="num" w:pos="2160"/>
+        </w:tabs>
+        <w:ind w:left="2160" w:hanging="360"/>
+      </w:pPr>
+    </w:lvl>
+    <w:lvl w:ilvl="3" w:tentative="1">
+      <w:start w:val="1"/>
+      <w:numFmt w:val="decimal"/>
+      <w:lvlText w:val="%4."/>
+      <w:lvlJc w:val="left"/>
+      <w:pPr>
+        <w:tabs>
+          <w:tab w:val="num" w:pos="2880"/>
+        </w:tabs>
+        <w:ind w:left="2880" w:hanging="360"/>
+      </w:pPr>
+    </w:lvl>
+    <w:lvl w:ilvl="4" w:tentative="1">
+      <w:start w:val="1"/>
+      <w:numFmt w:val="decimal"/>
+      <w:lvlText w:val="%5."/>
+      <w:lvlJc w:val="left"/>
+      <w:pPr>
+        <w:tabs>
+          <w:tab w:val="num" w:pos="3600"/>
+        </w:tabs>
+        <w:ind w:left="3600" w:hanging="360"/>
+      </w:pPr>
+    </w:lvl>
+    <w:lvl w:ilvl="5" w:tentative="1">
+      <w:start w:val="1"/>
+      <w:numFmt w:val="decimal"/>
+      <w:lvlText w:val="%6."/>
+      <w:lvlJc w:val="left"/>
+      <w:pPr>
+        <w:tabs>
+          <w:tab w:val="num" w:pos="4320"/>
+        </w:tabs>
+        <w:ind w:left="4320" w:hanging="360"/>
+      </w:pPr>
+    </w:lvl>
+    <w:lvl w:ilvl="6" w:tentative="1">
+      <w:start w:val="1"/>
+      <w:numFmt w:val="decimal"/>
+      <w:lvlText w:val="%7."/>
+      <w:lvlJc w:val="left"/>
+      <w:pPr>
+        <w:tabs>
+          <w:tab w:val="num" w:pos="5040"/>
+        </w:tabs>
+        <w:ind w:left="5040" w:hanging="360"/>
+      </w:pPr>
+    </w:lvl>
+    <w:lvl w:ilvl="7" w:tentative="1">
+      <w:start w:val="1"/>
+      <w:numFmt w:val="decimal"/>
+      <w:lvlText w:val="%8."/>
+      <w:lvlJc w:val="left"/>
+      <w:pPr>
+        <w:tabs>
+          <w:tab w:val="num" w:pos="5760"/>
+        </w:tabs>
+        <w:ind w:left="5760" w:hanging="360"/>
+      </w:pPr>
+    </w:lvl>
+    <w:lvl w:ilvl="8" w:tentative="1">
+      <w:start w:val="1"/>
+      <w:numFmt w:val="decimal"/>
+      <w:lvlText w:val="%9."/>
+      <w:lvlJc w:val="left"/>
+      <w:pPr>
+        <w:tabs>
+          <w:tab w:val="num" w:pos="6480"/>
+        </w:tabs>
+        <w:ind w:left="6480" w:hanging="360"/>
+      </w:pPr>
+    </w:lvl>
+  </w:abstractNum>
+  <w:abstractNum w:abstractNumId="3" w15:restartNumberingAfterBreak="0">
     <w:nsid w:val="5436629F"/>
     <w:multiLevelType w:val="hybridMultilevel"/>
     <w:tmpl w:val="5190602E"/>
@@ -1988,7 +1760,7 @@
       </w:pPr>
     </w:lvl>
   </w:abstractNum>
-  <w:abstractNum w:abstractNumId="2" w15:restartNumberingAfterBreak="0">
+  <w:abstractNum w:abstractNumId="4" w15:restartNumberingAfterBreak="0">
     <w:nsid w:val="695123E2"/>
     <w:multiLevelType w:val="multilevel"/>
     <w:tmpl w:val="B574CB48"/>
@@ -2137,7 +1909,7 @@
       </w:rPr>
     </w:lvl>
   </w:abstractNum>
-  <w:abstractNum w:abstractNumId="3" w15:restartNumberingAfterBreak="0">
+  <w:abstractNum w:abstractNumId="5" w15:restartNumberingAfterBreak="0">
     <w:nsid w:val="7EF26C7D"/>
     <w:multiLevelType w:val="multilevel"/>
     <w:tmpl w:val="A04645C8"/>
@@ -2251,16 +2023,22 @@
     </w:lvl>
   </w:abstractNum>
   <w:num w:numId="1" w16cid:durableId="400563392">
-    <w:abstractNumId w:val="0"/>
+    <w:abstractNumId w:val="1"/>
   </w:num>
   <w:num w:numId="2" w16cid:durableId="1076561358">
-    <w:abstractNumId w:val="1"/>
+    <w:abstractNumId w:val="3"/>
   </w:num>
   <w:num w:numId="3" w16cid:durableId="132330012">
+    <w:abstractNumId w:val="4"/>
+  </w:num>
+  <w:num w:numId="4" w16cid:durableId="1051541165">
+    <w:abstractNumId w:val="5"/>
+  </w:num>
+  <w:num w:numId="5" w16cid:durableId="31880740">
     <w:abstractNumId w:val="2"/>
   </w:num>
-  <w:num w:numId="4" w16cid:durableId="1051541165">
-    <w:abstractNumId w:val="3"/>
+  <w:num w:numId="6" w16cid:durableId="1240482992">
+    <w:abstractNumId w:val="0"/>
   </w:num>
 </w:numbering>
 </file>

</xml_diff>

<commit_message>
se actualiza el documento de laboratorio
</commit_message>
<xml_diff>
--- a/EscritoLab3_RD.docx
+++ b/EscritoLab3_RD.docx
@@ -1,6 +1,6 @@
 
 <file path=word/document.xml><?xml version="1.0" encoding="utf-8"?>
-<w:document xmlns:wpc="http://schemas.microsoft.com/office/word/2010/wordprocessingCanvas" xmlns:cx="http://schemas.microsoft.com/office/drawing/2014/chartex" xmlns:cx1="http://schemas.microsoft.com/office/drawing/2015/9/8/chartex" xmlns:cx2="http://schemas.microsoft.com/office/drawing/2015/10/21/chartex" xmlns:cx3="http://schemas.microsoft.com/office/drawing/2016/5/9/chartex" xmlns:cx4="http://schemas.microsoft.com/office/drawing/2016/5/10/chartex" xmlns:cx5="http://schemas.microsoft.com/office/drawing/2016/5/11/chartex" xmlns:cx6="http://schemas.microsoft.com/office/drawing/2016/5/12/chartex" xmlns:cx7="http://schemas.microsoft.com/office/drawing/2016/5/13/chartex" xmlns:cx8="http://schemas.microsoft.com/office/drawing/2016/5/14/chartex" xmlns:mc="http://schemas.openxmlformats.org/markup-compatibility/2006" xmlns:aink="http://schemas.microsoft.com/office/drawing/2016/ink" xmlns:am3d="http://schemas.microsoft.com/office/drawing/2017/model3d" xmlns:o="urn:schemas-microsoft-com:office:office" xmlns:r="http://schemas.openxmlformats.org/officeDocument/2006/relationships" xmlns:m="http://schemas.openxmlformats.org/officeDocument/2006/math" xmlns:v="urn:schemas-microsoft-com:vml" xmlns:wp14="http://schemas.microsoft.com/office/word/2010/wordprocessingDrawing" xmlns:wp="http://schemas.openxmlformats.org/drawingml/2006/wordprocessingDrawing" xmlns:w10="urn:schemas-microsoft-com:office:word" xmlns:w="http://schemas.openxmlformats.org/wordprocessingml/2006/main" xmlns:w14="http://schemas.microsoft.com/office/word/2010/wordml" xmlns:w15="http://schemas.microsoft.com/office/word/2012/wordml" xmlns:w16cex="http://schemas.microsoft.com/office/word/2018/wordml/cex" xmlns:w16cid="http://schemas.microsoft.com/office/word/2016/wordml/cid" xmlns:w16="http://schemas.microsoft.com/office/word/2018/wordml" xmlns:w16sdtdh="http://schemas.microsoft.com/office/word/2020/wordml/sdtdatahash" xmlns:w16se="http://schemas.microsoft.com/office/word/2015/wordml/symex" xmlns:wpg="http://schemas.microsoft.com/office/word/2010/wordprocessingGroup" xmlns:wpi="http://schemas.microsoft.com/office/word/2010/wordprocessingInk" xmlns:wne="http://schemas.microsoft.com/office/word/2006/wordml" xmlns:wps="http://schemas.microsoft.com/office/word/2010/wordprocessingShape" mc:Ignorable="w14 w15 w16se w16cid w16 w16cex w16sdtdh wp14">
+<w:document xmlns:wpc="http://schemas.microsoft.com/office/word/2010/wordprocessingCanvas" xmlns:cx="http://schemas.microsoft.com/office/drawing/2014/chartex" xmlns:cx1="http://schemas.microsoft.com/office/drawing/2015/9/8/chartex" xmlns:cx2="http://schemas.microsoft.com/office/drawing/2015/10/21/chartex" xmlns:cx3="http://schemas.microsoft.com/office/drawing/2016/5/9/chartex" xmlns:cx4="http://schemas.microsoft.com/office/drawing/2016/5/10/chartex" xmlns:cx5="http://schemas.microsoft.com/office/drawing/2016/5/11/chartex" xmlns:cx6="http://schemas.microsoft.com/office/drawing/2016/5/12/chartex" xmlns:cx7="http://schemas.microsoft.com/office/drawing/2016/5/13/chartex" xmlns:cx8="http://schemas.microsoft.com/office/drawing/2016/5/14/chartex" xmlns:mc="http://schemas.openxmlformats.org/markup-compatibility/2006" xmlns:aink="http://schemas.microsoft.com/office/drawing/2016/ink" xmlns:am3d="http://schemas.microsoft.com/office/drawing/2017/model3d" xmlns:o="urn:schemas-microsoft-com:office:office" xmlns:oel="http://schemas.microsoft.com/office/2019/extlst" xmlns:r="http://schemas.openxmlformats.org/officeDocument/2006/relationships" xmlns:m="http://schemas.openxmlformats.org/officeDocument/2006/math" xmlns:v="urn:schemas-microsoft-com:vml" xmlns:wp14="http://schemas.microsoft.com/office/word/2010/wordprocessingDrawing" xmlns:wp="http://schemas.openxmlformats.org/drawingml/2006/wordprocessingDrawing" xmlns:w10="urn:schemas-microsoft-com:office:word" xmlns:w="http://schemas.openxmlformats.org/wordprocessingml/2006/main" xmlns:w14="http://schemas.microsoft.com/office/word/2010/wordml" xmlns:w15="http://schemas.microsoft.com/office/word/2012/wordml" xmlns:w16cex="http://schemas.microsoft.com/office/word/2018/wordml/cex" xmlns:w16cid="http://schemas.microsoft.com/office/word/2016/wordml/cid" xmlns:w16="http://schemas.microsoft.com/office/word/2018/wordml" xmlns:w16du="http://schemas.microsoft.com/office/word/2023/wordml/word16du" xmlns:w16sdtdh="http://schemas.microsoft.com/office/word/2020/wordml/sdtdatahash" xmlns:w16sdtfl="http://schemas.microsoft.com/office/word/2024/wordml/sdtformatlock" xmlns:w16se="http://schemas.microsoft.com/office/word/2015/wordml/symex" xmlns:wpg="http://schemas.microsoft.com/office/word/2010/wordprocessingGroup" xmlns:wpi="http://schemas.microsoft.com/office/word/2010/wordprocessingInk" xmlns:wne="http://schemas.microsoft.com/office/word/2006/wordml" xmlns:wps="http://schemas.microsoft.com/office/word/2010/wordprocessingShape" mc:Ignorable="w14 w15 w16se w16cid w16 w16cex w16sdtdh w16sdtfl w16du wp14">
   <w:body>
     <w:p>
       <w:pPr>
@@ -25,18 +25,8 @@
           <w:i/>
           <w:iCs/>
         </w:rPr>
-        <w:t xml:space="preserve"> / Jacobo Jaramillo </w:t>
-      </w:r>
-      <w:proofErr w:type="spellStart"/>
-      <w:r>
-        <w:rPr>
-          <w:rFonts w:ascii="Calibri Light" w:hAnsi="Calibri Light" w:cs="Calibri Light"/>
-          <w:i/>
-          <w:iCs/>
-        </w:rPr>
-        <w:t>Jaramillo</w:t>
-      </w:r>
-      <w:proofErr w:type="spellEnd"/>
+        <w:t xml:space="preserve"> / Jacobo Jaramillo Jaramillo</w:t>
+      </w:r>
     </w:p>
     <w:p>
       <w:pPr>
@@ -154,7 +144,7 @@
     </w:p>
     <w:tbl>
       <w:tblPr>
-        <w:tblStyle w:val="TableGrid"/>
+        <w:tblStyle w:val="Tablaconcuadrcula"/>
         <w:tblW w:w="0" w:type="auto"/>
         <w:tblLook w:val="04A0" w:firstRow="1" w:lastRow="0" w:firstColumn="1" w:lastColumn="0" w:noHBand="0" w:noVBand="1"/>
       </w:tblPr>
@@ -301,23 +291,13 @@
                 <w:bCs/>
               </w:rPr>
             </w:pPr>
-            <w:proofErr w:type="gramStart"/>
-            <w:r>
-              <w:rPr>
-                <w:rFonts w:ascii="Calibri Light" w:hAnsi="Calibri Light" w:cs="Calibri Light"/>
-                <w:b/>
-                <w:bCs/>
-              </w:rPr>
-              <w:t>2001:DB8:CC1A</w:t>
-            </w:r>
-            <w:proofErr w:type="gramEnd"/>
-            <w:r>
-              <w:rPr>
-                <w:rFonts w:ascii="Calibri Light" w:hAnsi="Calibri Light" w:cs="Calibri Light"/>
-                <w:b/>
-                <w:bCs/>
-              </w:rPr>
-              <w:t>:1:260:5CFF:FE30:1E</w:t>
+            <w:r>
+              <w:rPr>
+                <w:rFonts w:ascii="Calibri Light" w:hAnsi="Calibri Light" w:cs="Calibri Light"/>
+                <w:b/>
+                <w:bCs/>
+              </w:rPr>
+              <w:t>2001:DB8:CC1A:1:260:5CFF:FE30:1E</w:t>
             </w:r>
             <w:r>
               <w:rPr>
@@ -388,79 +368,14 @@
                 <w:lang w:val="en-US"/>
               </w:rPr>
             </w:pPr>
-            <w:proofErr w:type="gramStart"/>
-            <w:r>
-              <w:rPr>
-                <w:rFonts w:ascii="Calibri Light" w:hAnsi="Calibri Light" w:cs="Calibri Light"/>
-                <w:b/>
-                <w:bCs/>
-                <w:lang w:val="en-US"/>
-              </w:rPr>
-              <w:t>2001:DB8:CC1A</w:t>
-            </w:r>
-            <w:proofErr w:type="gramEnd"/>
-            <w:r>
-              <w:rPr>
-                <w:rFonts w:ascii="Calibri Light" w:hAnsi="Calibri Light" w:cs="Calibri Light"/>
-                <w:b/>
-                <w:bCs/>
-                <w:lang w:val="en-US"/>
-              </w:rPr>
-              <w:t>:1:2</w:t>
-            </w:r>
-            <w:r>
-              <w:rPr>
-                <w:rFonts w:ascii="Calibri Light" w:hAnsi="Calibri Light" w:cs="Calibri Light"/>
-                <w:b/>
-                <w:bCs/>
-                <w:lang w:val="en-US"/>
-              </w:rPr>
-              <w:t>D0</w:t>
-            </w:r>
-            <w:r>
-              <w:rPr>
-                <w:rFonts w:ascii="Calibri Light" w:hAnsi="Calibri Light" w:cs="Calibri Light"/>
-                <w:b/>
-                <w:bCs/>
-                <w:lang w:val="en-US"/>
-              </w:rPr>
-              <w:t>:</w:t>
-            </w:r>
-            <w:r>
-              <w:rPr>
-                <w:rFonts w:ascii="Calibri Light" w:hAnsi="Calibri Light" w:cs="Calibri Light"/>
-                <w:b/>
-                <w:bCs/>
-                <w:lang w:val="en-US"/>
-              </w:rPr>
-              <w:t>97</w:t>
-            </w:r>
-            <w:r>
-              <w:rPr>
-                <w:rFonts w:ascii="Calibri Light" w:hAnsi="Calibri Light" w:cs="Calibri Light"/>
-                <w:b/>
-                <w:bCs/>
-                <w:lang w:val="en-US"/>
-              </w:rPr>
-              <w:t>FF:FE</w:t>
-            </w:r>
-            <w:r>
-              <w:rPr>
-                <w:rFonts w:ascii="Calibri Light" w:hAnsi="Calibri Light" w:cs="Calibri Light"/>
-                <w:b/>
-                <w:bCs/>
-                <w:lang w:val="en-US"/>
-              </w:rPr>
-              <w:t>85</w:t>
-            </w:r>
-            <w:r>
-              <w:rPr>
-                <w:rFonts w:ascii="Calibri Light" w:hAnsi="Calibri Light" w:cs="Calibri Light"/>
-                <w:b/>
-                <w:bCs/>
-                <w:lang w:val="en-US"/>
-              </w:rPr>
-              <w:t>:</w:t>
+            <w:r>
+              <w:rPr>
+                <w:rFonts w:ascii="Calibri Light" w:hAnsi="Calibri Light" w:cs="Calibri Light"/>
+                <w:b/>
+                <w:bCs/>
+                <w:lang w:val="en-US"/>
+              </w:rPr>
+              <w:t>2001:DB8:CC1A:1:2D0:97FF:FE85:</w:t>
             </w:r>
             <w:r>
               <w:rPr>
@@ -532,17 +447,42 @@
                 <w:lang w:val="en-US"/>
               </w:rPr>
             </w:pPr>
-            <w:proofErr w:type="gramStart"/>
-            <w:r>
-              <w:rPr>
-                <w:rFonts w:ascii="Calibri Light" w:hAnsi="Calibri Light" w:cs="Calibri Light"/>
-                <w:b/>
-                <w:bCs/>
-                <w:lang w:val="en-US"/>
-              </w:rPr>
-              <w:t>2001:DB8:CC1A</w:t>
-            </w:r>
-            <w:proofErr w:type="gramEnd"/>
+            <w:r>
+              <w:rPr>
+                <w:rFonts w:ascii="Calibri Light" w:hAnsi="Calibri Light" w:cs="Calibri Light"/>
+                <w:b/>
+                <w:bCs/>
+                <w:lang w:val="en-US"/>
+              </w:rPr>
+              <w:t>2001:DB8:CC1A:</w:t>
+            </w:r>
+            <w:r>
+              <w:rPr>
+                <w:rFonts w:ascii="Calibri Light" w:hAnsi="Calibri Light" w:cs="Calibri Light"/>
+                <w:b/>
+                <w:bCs/>
+                <w:lang w:val="en-US"/>
+              </w:rPr>
+              <w:t>2</w:t>
+            </w:r>
+            <w:r>
+              <w:rPr>
+                <w:rFonts w:ascii="Calibri Light" w:hAnsi="Calibri Light" w:cs="Calibri Light"/>
+                <w:b/>
+                <w:bCs/>
+                <w:lang w:val="en-US"/>
+              </w:rPr>
+              <w:t>:2</w:t>
+            </w:r>
+            <w:r>
+              <w:rPr>
+                <w:rFonts w:ascii="Calibri Light" w:hAnsi="Calibri Light" w:cs="Calibri Light"/>
+                <w:b/>
+                <w:bCs/>
+                <w:lang w:val="en-US"/>
+              </w:rPr>
+              <w:t>05</w:t>
+            </w:r>
             <w:r>
               <w:rPr>
                 <w:rFonts w:ascii="Calibri Light" w:hAnsi="Calibri Light" w:cs="Calibri Light"/>
@@ -559,25 +499,25 @@
                 <w:bCs/>
                 <w:lang w:val="en-US"/>
               </w:rPr>
-              <w:t>2</w:t>
-            </w:r>
-            <w:r>
-              <w:rPr>
-                <w:rFonts w:ascii="Calibri Light" w:hAnsi="Calibri Light" w:cs="Calibri Light"/>
-                <w:b/>
-                <w:bCs/>
-                <w:lang w:val="en-US"/>
-              </w:rPr>
-              <w:t>:2</w:t>
-            </w:r>
-            <w:r>
-              <w:rPr>
-                <w:rFonts w:ascii="Calibri Light" w:hAnsi="Calibri Light" w:cs="Calibri Light"/>
-                <w:b/>
-                <w:bCs/>
-                <w:lang w:val="en-US"/>
-              </w:rPr>
-              <w:t>05</w:t>
+              <w:t>5E</w:t>
+            </w:r>
+            <w:r>
+              <w:rPr>
+                <w:rFonts w:ascii="Calibri Light" w:hAnsi="Calibri Light" w:cs="Calibri Light"/>
+                <w:b/>
+                <w:bCs/>
+                <w:lang w:val="en-US"/>
+              </w:rPr>
+              <w:t>FF:F</w:t>
+            </w:r>
+            <w:r>
+              <w:rPr>
+                <w:rFonts w:ascii="Calibri Light" w:hAnsi="Calibri Light" w:cs="Calibri Light"/>
+                <w:b/>
+                <w:bCs/>
+                <w:lang w:val="en-US"/>
+              </w:rPr>
+              <w:t>EE5</w:t>
             </w:r>
             <w:r>
               <w:rPr>
@@ -595,52 +535,7 @@
                 <w:bCs/>
                 <w:lang w:val="en-US"/>
               </w:rPr>
-              <w:t>5E</w:t>
-            </w:r>
-            <w:r>
-              <w:rPr>
-                <w:rFonts w:ascii="Calibri Light" w:hAnsi="Calibri Light" w:cs="Calibri Light"/>
-                <w:b/>
-                <w:bCs/>
-                <w:lang w:val="en-US"/>
-              </w:rPr>
-              <w:t>FF:F</w:t>
-            </w:r>
-            <w:r>
-              <w:rPr>
-                <w:rFonts w:ascii="Calibri Light" w:hAnsi="Calibri Light" w:cs="Calibri Light"/>
-                <w:b/>
-                <w:bCs/>
-                <w:lang w:val="en-US"/>
-              </w:rPr>
-              <w:t>EE5</w:t>
-            </w:r>
-            <w:r>
-              <w:rPr>
-                <w:rFonts w:ascii="Calibri Light" w:hAnsi="Calibri Light" w:cs="Calibri Light"/>
-                <w:b/>
-                <w:bCs/>
-                <w:lang w:val="en-US"/>
-              </w:rPr>
-              <w:t>:</w:t>
-            </w:r>
-            <w:r>
-              <w:rPr>
-                <w:rFonts w:ascii="Calibri Light" w:hAnsi="Calibri Light" w:cs="Calibri Light"/>
-                <w:b/>
-                <w:bCs/>
-                <w:lang w:val="en-US"/>
-              </w:rPr>
-              <w:t>A</w:t>
-            </w:r>
-            <w:r>
-              <w:rPr>
-                <w:rFonts w:ascii="Calibri Light" w:hAnsi="Calibri Light" w:cs="Calibri Light"/>
-                <w:b/>
-                <w:bCs/>
-                <w:lang w:val="en-US"/>
-              </w:rPr>
-              <w:t>AB8</w:t>
+              <w:t>AAB8</w:t>
             </w:r>
           </w:p>
         </w:tc>
@@ -703,17 +598,42 @@
                 <w:lang w:val="en-US"/>
               </w:rPr>
             </w:pPr>
-            <w:proofErr w:type="gramStart"/>
-            <w:r>
-              <w:rPr>
-                <w:rFonts w:ascii="Calibri Light" w:hAnsi="Calibri Light" w:cs="Calibri Light"/>
-                <w:b/>
-                <w:bCs/>
-                <w:lang w:val="en-US"/>
-              </w:rPr>
-              <w:t>2001:DB8:CC1A</w:t>
-            </w:r>
-            <w:proofErr w:type="gramEnd"/>
+            <w:r>
+              <w:rPr>
+                <w:rFonts w:ascii="Calibri Light" w:hAnsi="Calibri Light" w:cs="Calibri Light"/>
+                <w:b/>
+                <w:bCs/>
+                <w:lang w:val="en-US"/>
+              </w:rPr>
+              <w:t>2001:DB8:CC1A:</w:t>
+            </w:r>
+            <w:r>
+              <w:rPr>
+                <w:rFonts w:ascii="Calibri Light" w:hAnsi="Calibri Light" w:cs="Calibri Light"/>
+                <w:b/>
+                <w:bCs/>
+                <w:lang w:val="en-US"/>
+              </w:rPr>
+              <w:t>2</w:t>
+            </w:r>
+            <w:r>
+              <w:rPr>
+                <w:rFonts w:ascii="Calibri Light" w:hAnsi="Calibri Light" w:cs="Calibri Light"/>
+                <w:b/>
+                <w:bCs/>
+                <w:lang w:val="en-US"/>
+              </w:rPr>
+              <w:t>:2</w:t>
+            </w:r>
+            <w:r>
+              <w:rPr>
+                <w:rFonts w:ascii="Calibri Light" w:hAnsi="Calibri Light" w:cs="Calibri Light"/>
+                <w:b/>
+                <w:bCs/>
+                <w:lang w:val="en-US"/>
+              </w:rPr>
+              <w:t>0B</w:t>
+            </w:r>
             <w:r>
               <w:rPr>
                 <w:rFonts w:ascii="Calibri Light" w:hAnsi="Calibri Light" w:cs="Calibri Light"/>
@@ -730,61 +650,7 @@
                 <w:bCs/>
                 <w:lang w:val="en-US"/>
               </w:rPr>
-              <w:t>2</w:t>
-            </w:r>
-            <w:r>
-              <w:rPr>
-                <w:rFonts w:ascii="Calibri Light" w:hAnsi="Calibri Light" w:cs="Calibri Light"/>
-                <w:b/>
-                <w:bCs/>
-                <w:lang w:val="en-US"/>
-              </w:rPr>
-              <w:t>:2</w:t>
-            </w:r>
-            <w:r>
-              <w:rPr>
-                <w:rFonts w:ascii="Calibri Light" w:hAnsi="Calibri Light" w:cs="Calibri Light"/>
-                <w:b/>
-                <w:bCs/>
-                <w:lang w:val="en-US"/>
-              </w:rPr>
-              <w:t>0</w:t>
-            </w:r>
-            <w:r>
-              <w:rPr>
-                <w:rFonts w:ascii="Calibri Light" w:hAnsi="Calibri Light" w:cs="Calibri Light"/>
-                <w:b/>
-                <w:bCs/>
-                <w:lang w:val="en-US"/>
-              </w:rPr>
-              <w:t>B</w:t>
-            </w:r>
-            <w:r>
-              <w:rPr>
-                <w:rFonts w:ascii="Calibri Light" w:hAnsi="Calibri Light" w:cs="Calibri Light"/>
-                <w:b/>
-                <w:bCs/>
-                <w:lang w:val="en-US"/>
-              </w:rPr>
-              <w:t>:</w:t>
-            </w:r>
-            <w:r>
-              <w:rPr>
-                <w:rFonts w:ascii="Calibri Light" w:hAnsi="Calibri Light" w:cs="Calibri Light"/>
-                <w:b/>
-                <w:bCs/>
-                <w:lang w:val="en-US"/>
-              </w:rPr>
-              <w:t>B</w:t>
-            </w:r>
-            <w:r>
-              <w:rPr>
-                <w:rFonts w:ascii="Calibri Light" w:hAnsi="Calibri Light" w:cs="Calibri Light"/>
-                <w:b/>
-                <w:bCs/>
-                <w:lang w:val="en-US"/>
-              </w:rPr>
-              <w:t>E</w:t>
+              <w:t>BE</w:t>
             </w:r>
             <w:r>
               <w:rPr>
@@ -802,16 +668,7 @@
                 <w:bCs/>
                 <w:lang w:val="en-US"/>
               </w:rPr>
-              <w:t>E</w:t>
-            </w:r>
-            <w:r>
-              <w:rPr>
-                <w:rFonts w:ascii="Calibri Light" w:hAnsi="Calibri Light" w:cs="Calibri Light"/>
-                <w:b/>
-                <w:bCs/>
-                <w:lang w:val="en-US"/>
-              </w:rPr>
-              <w:t>42</w:t>
+              <w:t>E42</w:t>
             </w:r>
             <w:r>
               <w:rPr>
@@ -1273,15 +1130,7 @@
                 <w:b/>
                 <w:bCs/>
               </w:rPr>
-              <w:t>Router</w:t>
-            </w:r>
-            <w:r>
-              <w:rPr>
-                <w:rFonts w:ascii="Calibri Light" w:hAnsi="Calibri Light" w:cs="Calibri Light"/>
-                <w:b/>
-                <w:bCs/>
-              </w:rPr>
-              <w:t>3</w:t>
+              <w:t>Router3</w:t>
             </w:r>
           </w:p>
         </w:tc>
@@ -1351,15 +1200,7 @@
                 <w:b/>
                 <w:bCs/>
               </w:rPr>
-              <w:t>Router</w:t>
-            </w:r>
-            <w:r>
-              <w:rPr>
-                <w:rFonts w:ascii="Calibri Light" w:hAnsi="Calibri Light" w:cs="Calibri Light"/>
-                <w:b/>
-                <w:bCs/>
-              </w:rPr>
-              <w:t>3</w:t>
+              <w:t>Router3</w:t>
             </w:r>
           </w:p>
         </w:tc>
@@ -1477,7 +1318,6 @@
         </w:rPr>
         <w:t xml:space="preserve">as 6 </w:t>
       </w:r>
-      <w:proofErr w:type="spellStart"/>
       <w:r>
         <w:rPr>
           <w:rFonts w:ascii="Calibri Light" w:hAnsi="Calibri Light" w:cs="Calibri Light"/>
@@ -1494,9 +1334,8 @@
           <w:bCs/>
           <w:lang w:val="en-US"/>
         </w:rPr>
-        <w:t>ruebas</w:t>
-      </w:r>
-      <w:proofErr w:type="spellEnd"/>
+        <w:t xml:space="preserve">ruebas de </w:t>
+      </w:r>
       <w:r>
         <w:rPr>
           <w:rFonts w:ascii="Calibri Light" w:hAnsi="Calibri Light" w:cs="Calibri Light"/>
@@ -1504,9 +1343,8 @@
           <w:bCs/>
           <w:lang w:val="en-US"/>
         </w:rPr>
-        <w:t xml:space="preserve"> de </w:t>
-      </w:r>
-      <w:proofErr w:type="spellStart"/>
+        <w:t>V</w:t>
+      </w:r>
       <w:r>
         <w:rPr>
           <w:rFonts w:ascii="Calibri Light" w:hAnsi="Calibri Light" w:cs="Calibri Light"/>
@@ -1514,29 +1352,28 @@
           <w:bCs/>
           <w:lang w:val="en-US"/>
         </w:rPr>
-        <w:t>V</w:t>
-      </w:r>
-      <w:r>
+        <w:t>erificacion</w:t>
+      </w:r>
+    </w:p>
+    <w:p>
+      <w:pPr>
+        <w:jc w:val="center"/>
         <w:rPr>
           <w:rFonts w:ascii="Calibri Light" w:hAnsi="Calibri Light" w:cs="Calibri Light"/>
           <w:b/>
           <w:bCs/>
           <w:lang w:val="en-US"/>
         </w:rPr>
-        <w:t>erificacion</w:t>
-      </w:r>
-      <w:proofErr w:type="spellEnd"/>
-    </w:p>
-    <w:p>
-      <w:pPr>
-        <w:jc w:val="center"/>
+      </w:pPr>
+      <w:r>
         <w:rPr>
           <w:rFonts w:ascii="Calibri Light" w:hAnsi="Calibri Light" w:cs="Calibri Light"/>
           <w:b/>
           <w:bCs/>
           <w:lang w:val="en-US"/>
         </w:rPr>
-      </w:pPr>
+        <w:t>“</w:t>
+      </w:r>
       <w:r>
         <w:rPr>
           <w:rFonts w:ascii="Calibri Light" w:hAnsi="Calibri Light" w:cs="Calibri Light"/>
@@ -1544,9 +1381,8 @@
           <w:bCs/>
           <w:lang w:val="en-US"/>
         </w:rPr>
-        <w:t>“</w:t>
-      </w:r>
-      <w:proofErr w:type="gramStart"/>
+        <w:t>show ipv6 interface</w:t>
+      </w:r>
       <w:r>
         <w:rPr>
           <w:rFonts w:ascii="Calibri Light" w:hAnsi="Calibri Light" w:cs="Calibri Light"/>
@@ -1554,9 +1390,8 @@
           <w:bCs/>
           <w:lang w:val="en-US"/>
         </w:rPr>
-        <w:t>show</w:t>
-      </w:r>
-      <w:proofErr w:type="gramEnd"/>
+        <w:t xml:space="preserve"> </w:t>
+      </w:r>
       <w:r>
         <w:rPr>
           <w:rFonts w:ascii="Calibri Light" w:hAnsi="Calibri Light" w:cs="Calibri Light"/>
@@ -1564,65 +1399,7 @@
           <w:bCs/>
           <w:lang w:val="en-US"/>
         </w:rPr>
-        <w:t xml:space="preserve"> ipv6 interface</w:t>
-      </w:r>
-      <w:r>
-        <w:rPr>
-          <w:rFonts w:ascii="Calibri Light" w:hAnsi="Calibri Light" w:cs="Calibri Light"/>
-          <w:b/>
-          <w:bCs/>
-          <w:lang w:val="en-US"/>
-        </w:rPr>
-        <w:t xml:space="preserve"> </w:t>
-      </w:r>
-      <w:r>
-        <w:rPr>
-          <w:rFonts w:ascii="Calibri Light" w:hAnsi="Calibri Light" w:cs="Calibri Light"/>
-          <w:b/>
-          <w:bCs/>
-          <w:lang w:val="en-US"/>
-        </w:rPr>
-        <w:t xml:space="preserve">brief </w:t>
-      </w:r>
-      <w:proofErr w:type="spellStart"/>
-      <w:r>
-        <w:rPr>
-          <w:rFonts w:ascii="Calibri Light" w:hAnsi="Calibri Light" w:cs="Calibri Light"/>
-          <w:b/>
-          <w:bCs/>
-          <w:lang w:val="en-US"/>
-        </w:rPr>
-        <w:t>en</w:t>
-      </w:r>
-      <w:proofErr w:type="spellEnd"/>
-      <w:r>
-        <w:rPr>
-          <w:rFonts w:ascii="Calibri Light" w:hAnsi="Calibri Light" w:cs="Calibri Light"/>
-          <w:b/>
-          <w:bCs/>
-          <w:lang w:val="en-US"/>
-        </w:rPr>
-        <w:t xml:space="preserve"> </w:t>
-      </w:r>
-      <w:proofErr w:type="spellStart"/>
-      <w:r>
-        <w:rPr>
-          <w:rFonts w:ascii="Calibri Light" w:hAnsi="Calibri Light" w:cs="Calibri Light"/>
-          <w:b/>
-          <w:bCs/>
-          <w:lang w:val="en-US"/>
-        </w:rPr>
-        <w:t>cada</w:t>
-      </w:r>
-      <w:proofErr w:type="spellEnd"/>
-      <w:r>
-        <w:rPr>
-          <w:rFonts w:ascii="Calibri Light" w:hAnsi="Calibri Light" w:cs="Calibri Light"/>
-          <w:b/>
-          <w:bCs/>
-          <w:lang w:val="en-US"/>
-        </w:rPr>
-        <w:t xml:space="preserve"> router</w:t>
+        <w:t>brief en cada router</w:t>
       </w:r>
       <w:r>
         <w:rPr>
@@ -1636,7 +1413,7 @@
     </w:p>
     <w:tbl>
       <w:tblPr>
-        <w:tblStyle w:val="TableGrid"/>
+        <w:tblStyle w:val="Tablaconcuadrcula"/>
         <w:tblW w:w="0" w:type="auto"/>
         <w:tblLook w:val="04A0" w:firstRow="1" w:lastRow="0" w:firstColumn="1" w:lastColumn="0" w:noHBand="0" w:noVBand="1"/>
       </w:tblPr>
@@ -2020,7 +1797,6 @@
         <w:lastRenderedPageBreak/>
         <w:t>“</w:t>
       </w:r>
-      <w:proofErr w:type="gramStart"/>
       <w:r>
         <w:rPr>
           <w:rFonts w:ascii="Calibri Light" w:hAnsi="Calibri Light" w:cs="Calibri Light"/>
@@ -2028,49 +1804,8 @@
           <w:bCs/>
           <w:lang w:val="en-US"/>
         </w:rPr>
-        <w:t>show</w:t>
-      </w:r>
-      <w:proofErr w:type="gramEnd"/>
-      <w:r>
-        <w:rPr>
-          <w:rFonts w:ascii="Calibri Light" w:hAnsi="Calibri Light" w:cs="Calibri Light"/>
-          <w:b/>
-          <w:bCs/>
-          <w:lang w:val="en-US"/>
-        </w:rPr>
-        <w:t xml:space="preserve"> ipv6 route </w:t>
-      </w:r>
-      <w:proofErr w:type="spellStart"/>
-      <w:r>
-        <w:rPr>
-          <w:rFonts w:ascii="Calibri Light" w:hAnsi="Calibri Light" w:cs="Calibri Light"/>
-          <w:b/>
-          <w:bCs/>
-          <w:lang w:val="en-US"/>
-        </w:rPr>
-        <w:t>en</w:t>
-      </w:r>
-      <w:proofErr w:type="spellEnd"/>
-      <w:r>
-        <w:rPr>
-          <w:rFonts w:ascii="Calibri Light" w:hAnsi="Calibri Light" w:cs="Calibri Light"/>
-          <w:b/>
-          <w:bCs/>
-          <w:lang w:val="en-US"/>
-        </w:rPr>
-        <w:t xml:space="preserve"> </w:t>
-      </w:r>
-      <w:proofErr w:type="spellStart"/>
-      <w:r>
-        <w:rPr>
-          <w:rFonts w:ascii="Calibri Light" w:hAnsi="Calibri Light" w:cs="Calibri Light"/>
-          <w:b/>
-          <w:bCs/>
-          <w:lang w:val="en-US"/>
-        </w:rPr>
-        <w:t>cada</w:t>
-      </w:r>
-      <w:proofErr w:type="spellEnd"/>
+        <w:t>show ipv6 route en cada</w:t>
+      </w:r>
       <w:r>
         <w:rPr>
           <w:rFonts w:ascii="Calibri Light" w:hAnsi="Calibri Light" w:cs="Calibri Light"/>
@@ -2101,7 +1836,7 @@
     </w:p>
     <w:tbl>
       <w:tblPr>
-        <w:tblStyle w:val="TableGrid"/>
+        <w:tblStyle w:val="Tablaconcuadrcula"/>
         <w:tblW w:w="0" w:type="auto"/>
         <w:tblLook w:val="04A0" w:firstRow="1" w:lastRow="0" w:firstColumn="1" w:lastColumn="0" w:noHBand="0" w:noVBand="1"/>
       </w:tblPr>
@@ -2461,96 +2196,7 @@
           <w:lang w:val="en-US"/>
         </w:rPr>
         <w:lastRenderedPageBreak/>
-        <w:t>“</w:t>
-      </w:r>
-      <w:proofErr w:type="gramStart"/>
-      <w:r>
-        <w:rPr>
-          <w:rFonts w:ascii="Calibri Light" w:hAnsi="Calibri Light" w:cs="Calibri Light"/>
-          <w:b/>
-          <w:bCs/>
-          <w:lang w:val="en-US"/>
-        </w:rPr>
-        <w:t>show</w:t>
-      </w:r>
-      <w:proofErr w:type="gramEnd"/>
-      <w:r>
-        <w:rPr>
-          <w:rFonts w:ascii="Calibri Light" w:hAnsi="Calibri Light" w:cs="Calibri Light"/>
-          <w:b/>
-          <w:bCs/>
-          <w:lang w:val="en-US"/>
-        </w:rPr>
-        <w:t xml:space="preserve"> ipv6 </w:t>
-      </w:r>
-      <w:proofErr w:type="spellStart"/>
-      <w:r>
-        <w:rPr>
-          <w:rFonts w:ascii="Calibri Light" w:hAnsi="Calibri Light" w:cs="Calibri Light"/>
-          <w:b/>
-          <w:bCs/>
-          <w:lang w:val="en-US"/>
-        </w:rPr>
-        <w:t>ospf</w:t>
-      </w:r>
-      <w:proofErr w:type="spellEnd"/>
-      <w:r>
-        <w:rPr>
-          <w:rFonts w:ascii="Calibri Light" w:hAnsi="Calibri Light" w:cs="Calibri Light"/>
-          <w:b/>
-          <w:bCs/>
-          <w:lang w:val="en-US"/>
-        </w:rPr>
-        <w:t xml:space="preserve"> neighbor</w:t>
-      </w:r>
-      <w:r>
-        <w:rPr>
-          <w:rFonts w:ascii="Calibri Light" w:hAnsi="Calibri Light" w:cs="Calibri Light"/>
-          <w:b/>
-          <w:bCs/>
-          <w:lang w:val="en-US"/>
-        </w:rPr>
-        <w:t xml:space="preserve"> </w:t>
-      </w:r>
-      <w:proofErr w:type="spellStart"/>
-      <w:r>
-        <w:rPr>
-          <w:rFonts w:ascii="Calibri Light" w:hAnsi="Calibri Light" w:cs="Calibri Light"/>
-          <w:b/>
-          <w:bCs/>
-          <w:lang w:val="en-US"/>
-        </w:rPr>
-        <w:t>en</w:t>
-      </w:r>
-      <w:proofErr w:type="spellEnd"/>
-      <w:r>
-        <w:rPr>
-          <w:rFonts w:ascii="Calibri Light" w:hAnsi="Calibri Light" w:cs="Calibri Light"/>
-          <w:b/>
-          <w:bCs/>
-          <w:lang w:val="en-US"/>
-        </w:rPr>
-        <w:t xml:space="preserve"> un router </w:t>
-      </w:r>
-      <w:proofErr w:type="spellStart"/>
-      <w:r>
-        <w:rPr>
-          <w:rFonts w:ascii="Calibri Light" w:hAnsi="Calibri Light" w:cs="Calibri Light"/>
-          <w:b/>
-          <w:bCs/>
-          <w:lang w:val="en-US"/>
-        </w:rPr>
-        <w:t>intermedio</w:t>
-      </w:r>
-      <w:proofErr w:type="spellEnd"/>
-      <w:r>
-        <w:rPr>
-          <w:rFonts w:ascii="Calibri Light" w:hAnsi="Calibri Light" w:cs="Calibri Light"/>
-          <w:b/>
-          <w:bCs/>
-          <w:lang w:val="en-US"/>
-        </w:rPr>
-        <w:t>”</w:t>
+        <w:t>“show ipv6 ospf neighbor en un router intermedio”</w:t>
       </w:r>
       <w:r>
         <w:rPr>
@@ -2646,43 +2292,7 @@
           <w:b/>
           <w:bCs/>
         </w:rPr>
-        <w:t>“</w:t>
-      </w:r>
-      <w:proofErr w:type="spellStart"/>
-      <w:r>
-        <w:rPr>
-          <w:rFonts w:ascii="Calibri Light" w:hAnsi="Calibri Light" w:cs="Calibri Light"/>
-          <w:b/>
-          <w:bCs/>
-        </w:rPr>
-        <w:t>ipconfig</w:t>
-      </w:r>
-      <w:proofErr w:type="spellEnd"/>
-      <w:r>
-        <w:rPr>
-          <w:rFonts w:ascii="Calibri Light" w:hAnsi="Calibri Light" w:cs="Calibri Light"/>
-          <w:b/>
-          <w:bCs/>
-        </w:rPr>
-        <w:t xml:space="preserve"> /</w:t>
-      </w:r>
-      <w:proofErr w:type="spellStart"/>
-      <w:r>
-        <w:rPr>
-          <w:rFonts w:ascii="Calibri Light" w:hAnsi="Calibri Light" w:cs="Calibri Light"/>
-          <w:b/>
-          <w:bCs/>
-        </w:rPr>
-        <w:t>all</w:t>
-      </w:r>
-      <w:proofErr w:type="spellEnd"/>
-      <w:r>
-        <w:rPr>
-          <w:rFonts w:ascii="Calibri Light" w:hAnsi="Calibri Light" w:cs="Calibri Light"/>
-          <w:b/>
-          <w:bCs/>
-        </w:rPr>
-        <w:t xml:space="preserve"> en PC de</w:t>
+        <w:t>“ipconfig /all en PC de</w:t>
       </w:r>
       <w:r>
         <w:rPr>
@@ -2698,15 +2308,7 @@
           <w:b/>
           <w:bCs/>
         </w:rPr>
-        <w:t>LAN extremo 1</w:t>
-      </w:r>
-      <w:r>
-        <w:rPr>
-          <w:rFonts w:ascii="Calibri Light" w:hAnsi="Calibri Light" w:cs="Calibri Light"/>
-          <w:b/>
-          <w:bCs/>
-        </w:rPr>
-        <w:t>”</w:t>
+        <w:t>LAN extremo 1”</w:t>
       </w:r>
       <w:r>
         <w:rPr>
@@ -2926,23 +2528,13 @@
         </w:rPr>
         <w:t>“</w:t>
       </w:r>
-      <w:proofErr w:type="spellStart"/>
-      <w:r>
-        <w:rPr>
-          <w:rFonts w:ascii="Calibri Light" w:hAnsi="Calibri Light" w:cs="Calibri Light"/>
-          <w:b/>
-          <w:bCs/>
-        </w:rPr>
-        <w:t>tracert</w:t>
-      </w:r>
-      <w:proofErr w:type="spellEnd"/>
-      <w:r>
-        <w:rPr>
-          <w:rFonts w:ascii="Calibri Light" w:hAnsi="Calibri Light" w:cs="Calibri Light"/>
-          <w:b/>
-          <w:bCs/>
-        </w:rPr>
-        <w:t xml:space="preserve"> IPv6 entre los</w:t>
+      <w:r>
+        <w:rPr>
+          <w:rFonts w:ascii="Calibri Light" w:hAnsi="Calibri Light" w:cs="Calibri Light"/>
+          <w:b/>
+          <w:bCs/>
+        </w:rPr>
+        <w:t>tracert IPv6 entre los</w:t>
       </w:r>
       <w:r>
         <w:rPr>
@@ -2958,33 +2550,15 @@
           <w:b/>
           <w:bCs/>
         </w:rPr>
-        <w:t xml:space="preserve">dos </w:t>
-      </w:r>
-      <w:proofErr w:type="spellStart"/>
-      <w:r>
-        <w:rPr>
-          <w:rFonts w:ascii="Calibri Light" w:hAnsi="Calibri Light" w:cs="Calibri Light"/>
-          <w:b/>
-          <w:bCs/>
-        </w:rPr>
-        <w:t>PCs</w:t>
-      </w:r>
-      <w:proofErr w:type="spellEnd"/>
-      <w:r>
-        <w:rPr>
-          <w:rFonts w:ascii="Calibri Light" w:hAnsi="Calibri Light" w:cs="Calibri Light"/>
-          <w:b/>
-          <w:bCs/>
-        </w:rPr>
-        <w:t xml:space="preserve">” </w:t>
-      </w:r>
-      <w:r>
-        <w:rPr>
-          <w:rFonts w:ascii="Calibri Light" w:hAnsi="Calibri Light" w:cs="Calibri Light"/>
-          <w:b/>
-          <w:bCs/>
-        </w:rPr>
-        <w:t xml:space="preserve">(PC1 </w:t>
+        <w:t>dos PCs</w:t>
+      </w:r>
+      <w:r>
+        <w:rPr>
+          <w:rFonts w:ascii="Calibri Light" w:hAnsi="Calibri Light" w:cs="Calibri Light"/>
+          <w:b/>
+          <w:bCs/>
+        </w:rPr>
+        <w:t xml:space="preserve">” (PC1 </w:t>
       </w:r>
       <w:r>
         <w:rPr>
@@ -3133,21 +2707,7 @@
         <w:rPr>
           <w:rFonts w:ascii="Calibri Light" w:hAnsi="Calibri Light" w:cs="Calibri Light"/>
         </w:rPr>
-        <w:t xml:space="preserve"> de </w:t>
-      </w:r>
-      <w:proofErr w:type="spellStart"/>
-      <w:r>
-        <w:rPr>
-          <w:rFonts w:ascii="Calibri Light" w:hAnsi="Calibri Light" w:cs="Calibri Light"/>
-        </w:rPr>
-        <w:t>unidifusion</w:t>
-      </w:r>
-      <w:proofErr w:type="spellEnd"/>
-      <w:r>
-        <w:rPr>
-          <w:rFonts w:ascii="Calibri Light" w:hAnsi="Calibri Light" w:cs="Calibri Light"/>
-        </w:rPr>
-        <w:t xml:space="preserve"> globales</w:t>
+        <w:t xml:space="preserve"> de unidifusion globales</w:t>
       </w:r>
       <w:r>
         <w:rPr>
@@ -3161,297 +2721,105 @@
           <w:i/>
           <w:iCs/>
         </w:rPr>
-        <w:t>ICMPv6 RA (</w:t>
-      </w:r>
-      <w:proofErr w:type="spellStart"/>
+        <w:t>ICMPv6 RA (Router Advertisement)</w:t>
+      </w:r>
+      <w:r>
+        <w:rPr>
+          <w:rFonts w:ascii="Calibri Light" w:hAnsi="Calibri Light" w:cs="Calibri Light"/>
+        </w:rPr>
+        <w:t xml:space="preserve"> para proporcionar direccionamiento y cualquier otra información de configuración</w:t>
+      </w:r>
+      <w:r>
+        <w:rPr>
+          <w:rFonts w:ascii="Calibri Light" w:hAnsi="Calibri Light" w:cs="Calibri Light"/>
+        </w:rPr>
+        <w:t xml:space="preserve"> que normalmente proporcionaría un servidor DHCP. Un host configura su dirección IPv6 en función de la información que se envía en la RA. Los mensajes RA son enviados por un router IPv6 cada 200 segundos. Un host también puede enviar un mensaje </w:t>
+      </w:r>
       <w:r>
         <w:rPr>
           <w:rFonts w:ascii="Calibri Light" w:hAnsi="Calibri Light" w:cs="Calibri Light"/>
           <w:i/>
           <w:iCs/>
         </w:rPr>
-        <w:t>Router</w:t>
-      </w:r>
-      <w:proofErr w:type="spellEnd"/>
+        <w:t>Router Solicitation (RS)</w:t>
+      </w:r>
+      <w:r>
+        <w:rPr>
+          <w:rFonts w:ascii="Calibri Light" w:hAnsi="Calibri Light" w:cs="Calibri Light"/>
+        </w:rPr>
+        <w:t xml:space="preserve"> solicitando que un router habilitado para IPv6 envíe al host un RA.</w:t>
+      </w:r>
+    </w:p>
+    <w:p>
+      <w:pPr>
+        <w:rPr>
+          <w:rFonts w:ascii="Calibri Light" w:hAnsi="Calibri Light" w:cs="Calibri Light"/>
+        </w:rPr>
+      </w:pPr>
+      <w:r>
+        <w:rPr>
+          <w:rFonts w:ascii="Calibri Light" w:hAnsi="Calibri Light" w:cs="Calibri Light"/>
+        </w:rPr>
+        <w:t xml:space="preserve">En </w:t>
+      </w:r>
+      <w:r>
+        <w:rPr>
+          <w:rFonts w:ascii="Calibri Light" w:hAnsi="Calibri Light" w:cs="Calibri Light"/>
+        </w:rPr>
+        <w:t>sí</w:t>
+      </w:r>
+      <w:r>
+        <w:rPr>
+          <w:rFonts w:ascii="Calibri Light" w:hAnsi="Calibri Light" w:cs="Calibri Light"/>
+        </w:rPr>
+        <w:t xml:space="preserve">, es un método que permite que un dispositivo obtenga su prefijo, la longitud de prefijo, la dirección de gateway predeterminado y otra información de un </w:t>
+      </w:r>
       <w:r>
         <w:rPr>
           <w:rFonts w:ascii="Calibri Light" w:hAnsi="Calibri Light" w:cs="Calibri Light"/>
           <w:i/>
           <w:iCs/>
         </w:rPr>
-        <w:t xml:space="preserve"> </w:t>
-      </w:r>
-      <w:proofErr w:type="spellStart"/>
-      <w:r>
-        <w:rPr>
-          <w:rFonts w:ascii="Calibri Light" w:hAnsi="Calibri Light" w:cs="Calibri Light"/>
-          <w:i/>
-          <w:iCs/>
-        </w:rPr>
-        <w:t>Advertisement</w:t>
-      </w:r>
-      <w:proofErr w:type="spellEnd"/>
-      <w:r>
-        <w:rPr>
-          <w:rFonts w:ascii="Calibri Light" w:hAnsi="Calibri Light" w:cs="Calibri Light"/>
-          <w:i/>
-          <w:iCs/>
-        </w:rPr>
-        <w:t>)</w:t>
-      </w:r>
-      <w:r>
-        <w:rPr>
-          <w:rFonts w:ascii="Calibri Light" w:hAnsi="Calibri Light" w:cs="Calibri Light"/>
-        </w:rPr>
-        <w:t xml:space="preserve"> para proporcionar direccionamiento y cualquier otra información de configuración</w:t>
-      </w:r>
-      <w:r>
-        <w:rPr>
-          <w:rFonts w:ascii="Calibri Light" w:hAnsi="Calibri Light" w:cs="Calibri Light"/>
-        </w:rPr>
-        <w:t xml:space="preserve"> que normalmente proporcionaría un servidor DHCP. Un host configura su dirección IPv6 en función de la información que se envía en la RA. Los mensajes RA son enviados por un </w:t>
-      </w:r>
-      <w:proofErr w:type="spellStart"/>
+        <w:t>router IPv6</w:t>
+      </w:r>
+      <w:r>
+        <w:rPr>
+          <w:rFonts w:ascii="Calibri Light" w:hAnsi="Calibri Light" w:cs="Calibri Light"/>
+        </w:rPr>
+        <w:t xml:space="preserve">, sin usar un servidor DHCPv6. Mediante SLAAC, los dispositivos dependen de los mensajes de anuncio de </w:t>
+      </w:r>
       <w:r>
         <w:rPr>
           <w:rFonts w:ascii="Calibri Light" w:hAnsi="Calibri Light" w:cs="Calibri Light"/>
         </w:rPr>
         <w:t>router</w:t>
       </w:r>
-      <w:proofErr w:type="spellEnd"/>
-      <w:r>
-        <w:rPr>
-          <w:rFonts w:ascii="Calibri Light" w:hAnsi="Calibri Light" w:cs="Calibri Light"/>
-        </w:rPr>
-        <w:t xml:space="preserve"> IPv6 cada 200 segundos. Un host también puede enviar un mensaje </w:t>
-      </w:r>
-      <w:proofErr w:type="spellStart"/>
-      <w:r>
-        <w:rPr>
-          <w:rFonts w:ascii="Calibri Light" w:hAnsi="Calibri Light" w:cs="Calibri Light"/>
-          <w:i/>
-          <w:iCs/>
-        </w:rPr>
-        <w:t>Router</w:t>
-      </w:r>
-      <w:proofErr w:type="spellEnd"/>
-      <w:r>
-        <w:rPr>
-          <w:rFonts w:ascii="Calibri Light" w:hAnsi="Calibri Light" w:cs="Calibri Light"/>
-          <w:i/>
-          <w:iCs/>
-        </w:rPr>
-        <w:t xml:space="preserve"> </w:t>
-      </w:r>
-      <w:proofErr w:type="spellStart"/>
-      <w:r>
-        <w:rPr>
-          <w:rFonts w:ascii="Calibri Light" w:hAnsi="Calibri Light" w:cs="Calibri Light"/>
-          <w:i/>
-          <w:iCs/>
-        </w:rPr>
-        <w:t>Solicitation</w:t>
-      </w:r>
-      <w:proofErr w:type="spellEnd"/>
-      <w:r>
-        <w:rPr>
-          <w:rFonts w:ascii="Calibri Light" w:hAnsi="Calibri Light" w:cs="Calibri Light"/>
-          <w:i/>
-          <w:iCs/>
-        </w:rPr>
-        <w:t xml:space="preserve"> (RS)</w:t>
-      </w:r>
-      <w:r>
-        <w:rPr>
-          <w:rFonts w:ascii="Calibri Light" w:hAnsi="Calibri Light" w:cs="Calibri Light"/>
-        </w:rPr>
-        <w:t xml:space="preserve"> solicitando que un </w:t>
-      </w:r>
-      <w:proofErr w:type="spellStart"/>
-      <w:r>
-        <w:rPr>
-          <w:rFonts w:ascii="Calibri Light" w:hAnsi="Calibri Light" w:cs="Calibri Light"/>
-        </w:rPr>
-        <w:t>router</w:t>
-      </w:r>
-      <w:proofErr w:type="spellEnd"/>
-      <w:r>
-        <w:rPr>
-          <w:rFonts w:ascii="Calibri Light" w:hAnsi="Calibri Light" w:cs="Calibri Light"/>
-        </w:rPr>
-        <w:t xml:space="preserve"> habilitado para IPv6 envíe al host un RA.</w:t>
-      </w:r>
-    </w:p>
-    <w:p>
-      <w:pPr>
-        <w:rPr>
-          <w:rFonts w:ascii="Calibri Light" w:hAnsi="Calibri Light" w:cs="Calibri Light"/>
-        </w:rPr>
-      </w:pPr>
-      <w:r>
-        <w:rPr>
-          <w:rFonts w:ascii="Calibri Light" w:hAnsi="Calibri Light" w:cs="Calibri Light"/>
-        </w:rPr>
-        <w:t xml:space="preserve">En </w:t>
-      </w:r>
-      <w:r>
-        <w:rPr>
-          <w:rFonts w:ascii="Calibri Light" w:hAnsi="Calibri Light" w:cs="Calibri Light"/>
-        </w:rPr>
-        <w:t>sí</w:t>
-      </w:r>
-      <w:r>
-        <w:rPr>
-          <w:rFonts w:ascii="Calibri Light" w:hAnsi="Calibri Light" w:cs="Calibri Light"/>
-        </w:rPr>
-        <w:t xml:space="preserve">, es un método que permite que un dispositivo obtenga su prefijo, la longitud de prefijo, la dirección de </w:t>
-      </w:r>
-      <w:proofErr w:type="spellStart"/>
-      <w:r>
-        <w:rPr>
-          <w:rFonts w:ascii="Calibri Light" w:hAnsi="Calibri Light" w:cs="Calibri Light"/>
-        </w:rPr>
-        <w:t>gateway</w:t>
-      </w:r>
-      <w:proofErr w:type="spellEnd"/>
-      <w:r>
-        <w:rPr>
-          <w:rFonts w:ascii="Calibri Light" w:hAnsi="Calibri Light" w:cs="Calibri Light"/>
-        </w:rPr>
-        <w:t xml:space="preserve"> predeterminado y otra información de un </w:t>
-      </w:r>
-      <w:proofErr w:type="spellStart"/>
-      <w:r>
-        <w:rPr>
-          <w:rFonts w:ascii="Calibri Light" w:hAnsi="Calibri Light" w:cs="Calibri Light"/>
-          <w:i/>
-          <w:iCs/>
-        </w:rPr>
-        <w:t>router</w:t>
-      </w:r>
-      <w:proofErr w:type="spellEnd"/>
-      <w:r>
-        <w:rPr>
-          <w:rFonts w:ascii="Calibri Light" w:hAnsi="Calibri Light" w:cs="Calibri Light"/>
-          <w:i/>
-          <w:iCs/>
-        </w:rPr>
-        <w:t xml:space="preserve"> IPv6</w:t>
-      </w:r>
-      <w:r>
-        <w:rPr>
-          <w:rFonts w:ascii="Calibri Light" w:hAnsi="Calibri Light" w:cs="Calibri Light"/>
-        </w:rPr>
-        <w:t xml:space="preserve">, sin usar un servidor DHCPv6. Mediante SLAAC, los dispositivos dependen de los mensajes de anuncio de </w:t>
-      </w:r>
-      <w:proofErr w:type="spellStart"/>
-      <w:r>
-        <w:rPr>
-          <w:rFonts w:ascii="Calibri Light" w:hAnsi="Calibri Light" w:cs="Calibri Light"/>
-        </w:rPr>
-        <w:t>router</w:t>
-      </w:r>
-      <w:proofErr w:type="spellEnd"/>
-      <w:r>
-        <w:rPr>
-          <w:rFonts w:ascii="Calibri Light" w:hAnsi="Calibri Light" w:cs="Calibri Light"/>
-        </w:rPr>
-        <w:t xml:space="preserve"> de ICMPv6 del </w:t>
-      </w:r>
-      <w:proofErr w:type="spellStart"/>
-      <w:r>
-        <w:rPr>
-          <w:rFonts w:ascii="Calibri Light" w:hAnsi="Calibri Light" w:cs="Calibri Light"/>
-        </w:rPr>
-        <w:t>router</w:t>
-      </w:r>
-      <w:proofErr w:type="spellEnd"/>
-      <w:r>
-        <w:rPr>
-          <w:rFonts w:ascii="Calibri Light" w:hAnsi="Calibri Light" w:cs="Calibri Light"/>
-        </w:rPr>
-        <w:t xml:space="preserve"> local para obtener la información necesaria.</w:t>
-      </w:r>
-    </w:p>
-    <w:p>
-      <w:pPr>
-        <w:rPr>
-          <w:rFonts w:ascii="Calibri Light" w:hAnsi="Calibri Light" w:cs="Calibri Light"/>
-        </w:rPr>
-      </w:pPr>
-      <w:r>
-        <w:rPr>
-          <w:rFonts w:ascii="Calibri Light" w:hAnsi="Calibri Light" w:cs="Calibri Light"/>
-        </w:rPr>
-        <w:t xml:space="preserve">El </w:t>
-      </w:r>
-      <w:proofErr w:type="spellStart"/>
-      <w:r>
-        <w:rPr>
-          <w:rFonts w:ascii="Calibri Light" w:hAnsi="Calibri Light" w:cs="Calibri Light"/>
-        </w:rPr>
-        <w:t>routing</w:t>
-      </w:r>
-      <w:proofErr w:type="spellEnd"/>
-      <w:r>
-        <w:rPr>
-          <w:rFonts w:ascii="Calibri Light" w:hAnsi="Calibri Light" w:cs="Calibri Light"/>
-        </w:rPr>
-        <w:t xml:space="preserve"> IPv6 no está habilitado de manera predeterminada. Para habilitar un </w:t>
-      </w:r>
-      <w:proofErr w:type="spellStart"/>
-      <w:r>
-        <w:rPr>
-          <w:rFonts w:ascii="Calibri Light" w:hAnsi="Calibri Light" w:cs="Calibri Light"/>
-        </w:rPr>
-        <w:t>router</w:t>
-      </w:r>
-      <w:proofErr w:type="spellEnd"/>
-      <w:r>
-        <w:rPr>
-          <w:rFonts w:ascii="Calibri Light" w:hAnsi="Calibri Light" w:cs="Calibri Light"/>
-        </w:rPr>
-        <w:t xml:space="preserve"> como </w:t>
-      </w:r>
-      <w:proofErr w:type="spellStart"/>
-      <w:r>
-        <w:rPr>
-          <w:rFonts w:ascii="Calibri Light" w:hAnsi="Calibri Light" w:cs="Calibri Light"/>
-        </w:rPr>
-        <w:t>router</w:t>
-      </w:r>
-      <w:proofErr w:type="spellEnd"/>
-      <w:r>
-        <w:rPr>
-          <w:rFonts w:ascii="Calibri Light" w:hAnsi="Calibri Light" w:cs="Calibri Light"/>
-        </w:rPr>
-        <w:t xml:space="preserve"> IPv6, se debe usar el comando de configuración global “</w:t>
-      </w:r>
-      <w:r>
-        <w:rPr>
-          <w:rFonts w:ascii="Calibri Light" w:hAnsi="Calibri Light" w:cs="Calibri Light"/>
-          <w:b/>
-          <w:bCs/>
-        </w:rPr>
-        <w:t xml:space="preserve">ipv6 </w:t>
-      </w:r>
-      <w:proofErr w:type="spellStart"/>
-      <w:r>
-        <w:rPr>
-          <w:rFonts w:ascii="Calibri Light" w:hAnsi="Calibri Light" w:cs="Calibri Light"/>
-          <w:b/>
-          <w:bCs/>
-        </w:rPr>
-        <w:t>unicast-routing</w:t>
-      </w:r>
-      <w:proofErr w:type="spellEnd"/>
-      <w:r>
-        <w:rPr>
-          <w:rFonts w:ascii="Calibri Light" w:hAnsi="Calibri Light" w:cs="Calibri Light"/>
-          <w:b/>
-          <w:bCs/>
-        </w:rPr>
-        <w:t>”</w:t>
+      <w:r>
+        <w:rPr>
+          <w:rFonts w:ascii="Calibri Light" w:hAnsi="Calibri Light" w:cs="Calibri Light"/>
+        </w:rPr>
+        <w:t xml:space="preserve"> de ICMPv6 del router local para obtener la información necesaria.</w:t>
+      </w:r>
+    </w:p>
+    <w:p>
+      <w:pPr>
+        <w:rPr>
+          <w:rFonts w:ascii="Calibri Light" w:hAnsi="Calibri Light" w:cs="Calibri Light"/>
+        </w:rPr>
+      </w:pPr>
+      <w:r>
+        <w:rPr>
+          <w:rFonts w:ascii="Calibri Light" w:hAnsi="Calibri Light" w:cs="Calibri Light"/>
+        </w:rPr>
+        <w:t>El routing IPv6 no está habilitado de manera predeterminada. Para habilitar un router como router IPv6, se debe usar el comando de configuración global “</w:t>
+      </w:r>
+      <w:r>
+        <w:rPr>
+          <w:rFonts w:ascii="Calibri Light" w:hAnsi="Calibri Light" w:cs="Calibri Light"/>
+          <w:b/>
+          <w:bCs/>
+        </w:rPr>
+        <w:t>ipv6 unicast-routing”</w:t>
       </w:r>
       <w:r>
         <w:rPr>
@@ -3487,7 +2855,7 @@
     </w:p>
     <w:p>
       <w:pPr>
-        <w:pStyle w:val="ListParagraph"/>
+        <w:pStyle w:val="Prrafodelista"/>
         <w:numPr>
           <w:ilvl w:val="0"/>
           <w:numId w:val="1"/>
@@ -3502,114 +2870,18 @@
           <w:b/>
           <w:bCs/>
         </w:rPr>
-        <w:t xml:space="preserve">Mensaje de solicitud del </w:t>
-      </w:r>
-      <w:proofErr w:type="spellStart"/>
-      <w:r>
-        <w:rPr>
-          <w:rFonts w:ascii="Calibri Light" w:hAnsi="Calibri Light" w:cs="Calibri Light"/>
-          <w:b/>
-          <w:bCs/>
-        </w:rPr>
-        <w:t>router</w:t>
-      </w:r>
-      <w:proofErr w:type="spellEnd"/>
-      <w:r>
-        <w:rPr>
-          <w:rFonts w:ascii="Calibri Light" w:hAnsi="Calibri Light" w:cs="Calibri Light"/>
-          <w:b/>
-          <w:bCs/>
-        </w:rPr>
-        <w:t xml:space="preserve"> (RS, </w:t>
-      </w:r>
-      <w:proofErr w:type="spellStart"/>
-      <w:r>
-        <w:rPr>
-          <w:rFonts w:ascii="Calibri Light" w:hAnsi="Calibri Light" w:cs="Calibri Light"/>
-          <w:b/>
-          <w:bCs/>
-        </w:rPr>
-        <w:t>Router</w:t>
-      </w:r>
-      <w:proofErr w:type="spellEnd"/>
-      <w:r>
-        <w:rPr>
-          <w:rFonts w:ascii="Calibri Light" w:hAnsi="Calibri Light" w:cs="Calibri Light"/>
-          <w:b/>
-          <w:bCs/>
-        </w:rPr>
-        <w:t xml:space="preserve"> </w:t>
-      </w:r>
-      <w:proofErr w:type="spellStart"/>
-      <w:r>
-        <w:rPr>
-          <w:rFonts w:ascii="Calibri Light" w:hAnsi="Calibri Light" w:cs="Calibri Light"/>
-          <w:b/>
-          <w:bCs/>
-        </w:rPr>
-        <w:t>Solicitation</w:t>
-      </w:r>
-      <w:proofErr w:type="spellEnd"/>
-      <w:r>
-        <w:rPr>
-          <w:rFonts w:ascii="Calibri Light" w:hAnsi="Calibri Light" w:cs="Calibri Light"/>
-          <w:b/>
-          <w:bCs/>
-        </w:rPr>
-        <w:t>);</w:t>
-      </w:r>
-      <w:r>
-        <w:rPr>
-          <w:rFonts w:ascii="Calibri Light" w:hAnsi="Calibri Light" w:cs="Calibri Light"/>
-        </w:rPr>
-        <w:t xml:space="preserve"> Cuando un cliente se configura para obtener su información de direccionamiento IPv6 automáticamente mediante SLAAC, éste envía un mensaje RS al </w:t>
-      </w:r>
-      <w:proofErr w:type="spellStart"/>
-      <w:r>
-        <w:rPr>
-          <w:rFonts w:ascii="Calibri Light" w:hAnsi="Calibri Light" w:cs="Calibri Light"/>
-        </w:rPr>
-        <w:t>router</w:t>
-      </w:r>
-      <w:proofErr w:type="spellEnd"/>
-      <w:r>
-        <w:rPr>
-          <w:rFonts w:ascii="Calibri Light" w:hAnsi="Calibri Light" w:cs="Calibri Light"/>
-        </w:rPr>
-        <w:t xml:space="preserve">. El mensaje RS se envía a la dirección </w:t>
-      </w:r>
-      <w:proofErr w:type="spellStart"/>
-      <w:r>
-        <w:rPr>
-          <w:rFonts w:ascii="Calibri Light" w:hAnsi="Calibri Light" w:cs="Calibri Light"/>
-        </w:rPr>
-        <w:t>multicast</w:t>
-      </w:r>
-      <w:proofErr w:type="spellEnd"/>
-      <w:r>
-        <w:rPr>
-          <w:rFonts w:ascii="Calibri Light" w:hAnsi="Calibri Light" w:cs="Calibri Light"/>
-        </w:rPr>
-        <w:t xml:space="preserve"> de todos los </w:t>
-      </w:r>
-      <w:proofErr w:type="spellStart"/>
-      <w:r>
-        <w:rPr>
-          <w:rFonts w:ascii="Calibri Light" w:hAnsi="Calibri Light" w:cs="Calibri Light"/>
-        </w:rPr>
-        <w:t>routers</w:t>
-      </w:r>
-      <w:proofErr w:type="spellEnd"/>
-      <w:r>
-        <w:rPr>
-          <w:rFonts w:ascii="Calibri Light" w:hAnsi="Calibri Light" w:cs="Calibri Light"/>
-        </w:rPr>
-        <w:t xml:space="preserve"> IPv6 FF02::2. Es un mensaje ICMPv6 tipo 133.</w:t>
-      </w:r>
-    </w:p>
-    <w:p>
-      <w:pPr>
-        <w:pStyle w:val="ListParagraph"/>
+        <w:t>Mensaje de solicitud del router (RS, Router Solicitation);</w:t>
+      </w:r>
+      <w:r>
+        <w:rPr>
+          <w:rFonts w:ascii="Calibri Light" w:hAnsi="Calibri Light" w:cs="Calibri Light"/>
+        </w:rPr>
+        <w:t xml:space="preserve"> Cuando un cliente se configura para obtener su información de direccionamiento IPv6 automáticamente mediante SLAAC, éste envía un mensaje RS al router. El mensaje RS se envía a la dirección multicast de todos los routers IPv6 FF02::2. Es un mensaje ICMPv6 tipo 133.</w:t>
+      </w:r>
+    </w:p>
+    <w:p>
+      <w:pPr>
+        <w:pStyle w:val="Prrafodelista"/>
         <w:numPr>
           <w:ilvl w:val="0"/>
           <w:numId w:val="1"/>
@@ -3624,123 +2896,13 @@
           <w:b/>
           <w:bCs/>
         </w:rPr>
-        <w:t xml:space="preserve">Mensaje de anuncio del </w:t>
-      </w:r>
-      <w:proofErr w:type="spellStart"/>
-      <w:r>
-        <w:rPr>
-          <w:rFonts w:ascii="Calibri Light" w:hAnsi="Calibri Light" w:cs="Calibri Light"/>
-          <w:b/>
-          <w:bCs/>
-        </w:rPr>
-        <w:t>router</w:t>
-      </w:r>
-      <w:proofErr w:type="spellEnd"/>
-      <w:r>
-        <w:rPr>
-          <w:rFonts w:ascii="Calibri Light" w:hAnsi="Calibri Light" w:cs="Calibri Light"/>
-          <w:b/>
-          <w:bCs/>
-        </w:rPr>
-        <w:t xml:space="preserve"> (RA, </w:t>
-      </w:r>
-      <w:proofErr w:type="spellStart"/>
-      <w:r>
-        <w:rPr>
-          <w:rFonts w:ascii="Calibri Light" w:hAnsi="Calibri Light" w:cs="Calibri Light"/>
-          <w:b/>
-          <w:bCs/>
-        </w:rPr>
-        <w:t>Router</w:t>
-      </w:r>
-      <w:proofErr w:type="spellEnd"/>
-      <w:r>
-        <w:rPr>
-          <w:rFonts w:ascii="Calibri Light" w:hAnsi="Calibri Light" w:cs="Calibri Light"/>
-          <w:b/>
-          <w:bCs/>
-        </w:rPr>
-        <w:t xml:space="preserve"> </w:t>
-      </w:r>
-      <w:proofErr w:type="spellStart"/>
-      <w:r>
-        <w:rPr>
-          <w:rFonts w:ascii="Calibri Light" w:hAnsi="Calibri Light" w:cs="Calibri Light"/>
-          <w:b/>
-          <w:bCs/>
-        </w:rPr>
-        <w:t>Advertisement</w:t>
-      </w:r>
-      <w:proofErr w:type="spellEnd"/>
-      <w:r>
-        <w:rPr>
-          <w:rFonts w:ascii="Calibri Light" w:hAnsi="Calibri Light" w:cs="Calibri Light"/>
-          <w:b/>
-          <w:bCs/>
-        </w:rPr>
-        <w:t>);</w:t>
-      </w:r>
-      <w:r>
-        <w:rPr>
-          <w:rFonts w:ascii="Calibri Light" w:hAnsi="Calibri Light" w:cs="Calibri Light"/>
-        </w:rPr>
-        <w:t xml:space="preserve"> Los </w:t>
-      </w:r>
-      <w:proofErr w:type="spellStart"/>
-      <w:r>
-        <w:rPr>
-          <w:rFonts w:ascii="Calibri Light" w:hAnsi="Calibri Light" w:cs="Calibri Light"/>
-        </w:rPr>
-        <w:t>routers</w:t>
-      </w:r>
-      <w:proofErr w:type="spellEnd"/>
-      <w:r>
-        <w:rPr>
-          <w:rFonts w:ascii="Calibri Light" w:hAnsi="Calibri Light" w:cs="Calibri Light"/>
-        </w:rPr>
-        <w:t xml:space="preserve"> envían mensajes RA para proporcionar información de direccionamiento IPv6 a los clientes. El mensaje RA incluye el prefijo y la longitud del prefijo del segmento local. Un </w:t>
-      </w:r>
-      <w:proofErr w:type="spellStart"/>
-      <w:r>
-        <w:rPr>
-          <w:rFonts w:ascii="Calibri Light" w:hAnsi="Calibri Light" w:cs="Calibri Light"/>
-        </w:rPr>
-        <w:t>router</w:t>
-      </w:r>
-      <w:proofErr w:type="spellEnd"/>
-      <w:r>
-        <w:rPr>
-          <w:rFonts w:ascii="Calibri Light" w:hAnsi="Calibri Light" w:cs="Calibri Light"/>
-        </w:rPr>
-        <w:t xml:space="preserve"> envía un mensaje RA periódicamente (configurable entre 4 y 1800 segundos) o en respuesta a un mensaje RS. Por defecto, los </w:t>
-      </w:r>
-      <w:proofErr w:type="spellStart"/>
-      <w:r>
-        <w:rPr>
-          <w:rFonts w:ascii="Calibri Light" w:hAnsi="Calibri Light" w:cs="Calibri Light"/>
-        </w:rPr>
-        <w:t>routers</w:t>
-      </w:r>
-      <w:proofErr w:type="spellEnd"/>
-      <w:r>
-        <w:rPr>
-          <w:rFonts w:ascii="Calibri Light" w:hAnsi="Calibri Light" w:cs="Calibri Light"/>
-        </w:rPr>
-        <w:t xml:space="preserve"> Cisco envían mensajes RA cada 200 segundos. Los mensajes RA siempre se envían a la dirección </w:t>
-      </w:r>
-      <w:proofErr w:type="spellStart"/>
-      <w:r>
-        <w:rPr>
-          <w:rFonts w:ascii="Calibri Light" w:hAnsi="Calibri Light" w:cs="Calibri Light"/>
-        </w:rPr>
-        <w:t>multicast</w:t>
-      </w:r>
-      <w:proofErr w:type="spellEnd"/>
-      <w:r>
-        <w:rPr>
-          <w:rFonts w:ascii="Calibri Light" w:hAnsi="Calibri Light" w:cs="Calibri Light"/>
-        </w:rPr>
-        <w:t xml:space="preserve"> de todos los nodos IPv6 FF02::1. Es un mensaje ICMPv6 tipo 134.</w:t>
+        <w:t>Mensaje de anuncio del router (RA, Router Advertisement);</w:t>
+      </w:r>
+      <w:r>
+        <w:rPr>
+          <w:rFonts w:ascii="Calibri Light" w:hAnsi="Calibri Light" w:cs="Calibri Light"/>
+        </w:rPr>
+        <w:t xml:space="preserve"> Los routers envían mensajes RA para proporcionar información de direccionamiento IPv6 a los clientes. El mensaje RA incluye el prefijo y la longitud del prefijo del segmento local. Un router envía un mensaje RA periódicamente (configurable entre 4 y 1800 segundos) o en respuesta a un mensaje RS. Por defecto, los routers Cisco envían mensajes RA cada 200 segundos. Los mensajes RA siempre se envían a la dirección multicast de todos los nodos IPv6 FF02::1. Es un mensaje ICMPv6 tipo 134.</w:t>
       </w:r>
     </w:p>
     <w:p>
@@ -3762,7 +2924,7 @@
     </w:p>
     <w:p>
       <w:pPr>
-        <w:pStyle w:val="ListParagraph"/>
+        <w:pStyle w:val="Prrafodelista"/>
         <w:numPr>
           <w:ilvl w:val="0"/>
           <w:numId w:val="5"/>
@@ -3774,7 +2936,7 @@
       <w:hyperlink r:id="rId18" w:history="1">
         <w:r>
           <w:rPr>
-            <w:rStyle w:val="Hyperlink"/>
+            <w:rStyle w:val="Hipervnculo"/>
             <w:rFonts w:ascii="Calibri Light" w:hAnsi="Calibri Light" w:cs="Calibri Light"/>
           </w:rPr>
           <w:t>https://ccnadesdecero.es/slaac/</w:t>
@@ -3789,7 +2951,7 @@
     </w:p>
     <w:p>
       <w:pPr>
-        <w:pStyle w:val="ListParagraph"/>
+        <w:pStyle w:val="Prrafodelista"/>
         <w:numPr>
           <w:ilvl w:val="0"/>
           <w:numId w:val="5"/>
@@ -3801,7 +2963,7 @@
       <w:hyperlink r:id="rId19" w:history="1">
         <w:r>
           <w:rPr>
-            <w:rStyle w:val="Hyperlink"/>
+            <w:rStyle w:val="Hipervnculo"/>
             <w:rFonts w:ascii="Calibri Light" w:hAnsi="Calibri Light" w:cs="Calibri Light"/>
           </w:rPr>
           <w:t>https://elhacker.info/Cursos/Curso%20de%20Certificacion%20CCNA%20completo/ccna1/course/module7/7.2.4.3/7.2.4.3.html</w:t>
@@ -3816,7 +2978,7 @@
     </w:p>
     <w:p>
       <w:pPr>
-        <w:pStyle w:val="ListParagraph"/>
+        <w:pStyle w:val="Prrafodelista"/>
         <w:numPr>
           <w:ilvl w:val="0"/>
           <w:numId w:val="5"/>
@@ -3828,7 +2990,7 @@
       <w:hyperlink r:id="rId20" w:history="1">
         <w:r>
           <w:rPr>
-            <w:rStyle w:val="Hyperlink"/>
+            <w:rStyle w:val="Hipervnculo"/>
             <w:rFonts w:ascii="Calibri Light" w:hAnsi="Calibri Light" w:cs="Calibri Light"/>
           </w:rPr>
           <w:t>https://learningnetwork.cisco.com/s/article/Analizando-DHCPv6-con-estado-y-sin-estado</w:t>
@@ -3932,23 +3094,13 @@
         </w:rPr>
         <w:t xml:space="preserve"> en forma </w:t>
       </w:r>
-      <w:proofErr w:type="gramStart"/>
       <w:r>
         <w:rPr>
           <w:rFonts w:ascii="Calibri Light" w:hAnsi="Calibri Light" w:cs="Calibri Light"/>
           <w:i/>
           <w:iCs/>
         </w:rPr>
-        <w:t>XXXX:XXXX</w:t>
-      </w:r>
-      <w:proofErr w:type="gramEnd"/>
-      <w:r>
-        <w:rPr>
-          <w:rFonts w:ascii="Calibri Light" w:hAnsi="Calibri Light" w:cs="Calibri Light"/>
-          <w:i/>
-          <w:iCs/>
-        </w:rPr>
-        <w:t>:XXXX:XXXX:XXXX:XXXX:XXXX:XXXX</w:t>
+        <w:t>XXXX:XXXX:XXXX:XXXX:XXXX:XXXX:XXXX:XXXX</w:t>
       </w:r>
       <w:r>
         <w:rPr>
@@ -3997,127 +3149,45 @@
         <w:rPr>
           <w:rFonts w:ascii="Calibri Light" w:hAnsi="Calibri Light" w:cs="Calibri Light"/>
         </w:rPr>
-        <w:t xml:space="preserve">Para la puesta en marcha de la autoconfiguración sin estado (SLAAC), se procedió a la configuración de los </w:t>
-      </w:r>
-      <w:proofErr w:type="spellStart"/>
-      <w:r>
-        <w:rPr>
-          <w:rFonts w:ascii="Calibri Light" w:hAnsi="Calibri Light" w:cs="Calibri Light"/>
-        </w:rPr>
-        <w:t>routers</w:t>
-      </w:r>
-      <w:proofErr w:type="spellEnd"/>
-      <w:r>
-        <w:rPr>
-          <w:rFonts w:ascii="Calibri Light" w:hAnsi="Calibri Light" w:cs="Calibri Light"/>
-        </w:rPr>
-        <w:t xml:space="preserve"> extremos para que actuaran como fuentes de anuncios de red. El proceso se detalla a continuación:</w:t>
-      </w:r>
-    </w:p>
-    <w:p>
-      <w:pPr>
-        <w:rPr>
-          <w:rFonts w:ascii="Calibri Light" w:hAnsi="Calibri Light" w:cs="Calibri Light"/>
-          <w:b/>
-          <w:bCs/>
-        </w:rPr>
-      </w:pPr>
-      <w:r>
-        <w:rPr>
-          <w:rFonts w:ascii="Calibri Light" w:hAnsi="Calibri Light" w:cs="Calibri Light"/>
-          <w:b/>
-          <w:bCs/>
-        </w:rPr>
-        <w:t xml:space="preserve">Configuración del </w:t>
-      </w:r>
-      <w:proofErr w:type="spellStart"/>
-      <w:r>
-        <w:rPr>
-          <w:rFonts w:ascii="Calibri Light" w:hAnsi="Calibri Light" w:cs="Calibri Light"/>
-          <w:b/>
-          <w:bCs/>
-        </w:rPr>
-        <w:t>Router</w:t>
-      </w:r>
-      <w:proofErr w:type="spellEnd"/>
-      <w:r>
-        <w:rPr>
-          <w:rFonts w:ascii="Calibri Light" w:hAnsi="Calibri Light" w:cs="Calibri Light"/>
-          <w:b/>
-          <w:bCs/>
-        </w:rPr>
-        <w:t xml:space="preserve"> (Lado Servidor)</w:t>
-      </w:r>
-    </w:p>
-    <w:p>
-      <w:pPr>
-        <w:rPr>
-          <w:rFonts w:ascii="Calibri Light" w:hAnsi="Calibri Light" w:cs="Calibri Light"/>
-        </w:rPr>
-      </w:pPr>
-      <w:r>
-        <w:rPr>
-          <w:rFonts w:ascii="Calibri Light" w:hAnsi="Calibri Light" w:cs="Calibri Light"/>
-        </w:rPr>
-        <w:t xml:space="preserve">Se habilitó el enrutamiento de unidifusión IPv6 y se configuraron las interfaces LAN con sus respectivos prefijos globales. Esto permite que el </w:t>
-      </w:r>
-      <w:proofErr w:type="spellStart"/>
-      <w:r>
-        <w:rPr>
-          <w:rFonts w:ascii="Calibri Light" w:hAnsi="Calibri Light" w:cs="Calibri Light"/>
-        </w:rPr>
-        <w:t>router</w:t>
-      </w:r>
-      <w:proofErr w:type="spellEnd"/>
-      <w:r>
-        <w:rPr>
-          <w:rFonts w:ascii="Calibri Light" w:hAnsi="Calibri Light" w:cs="Calibri Light"/>
-        </w:rPr>
-        <w:t xml:space="preserve"> envíe mensajes </w:t>
-      </w:r>
-      <w:r>
-        <w:rPr>
-          <w:rFonts w:ascii="Calibri Light" w:hAnsi="Calibri Light" w:cs="Calibri Light"/>
-          <w:b/>
-          <w:bCs/>
-        </w:rPr>
-        <w:t>ICMPv6 Tipo 134 (</w:t>
-      </w:r>
-      <w:proofErr w:type="spellStart"/>
-      <w:r>
-        <w:rPr>
-          <w:rFonts w:ascii="Calibri Light" w:hAnsi="Calibri Light" w:cs="Calibri Light"/>
-          <w:b/>
-          <w:bCs/>
-        </w:rPr>
-        <w:t>Router</w:t>
-      </w:r>
-      <w:proofErr w:type="spellEnd"/>
-      <w:r>
-        <w:rPr>
-          <w:rFonts w:ascii="Calibri Light" w:hAnsi="Calibri Light" w:cs="Calibri Light"/>
-          <w:b/>
-          <w:bCs/>
-        </w:rPr>
-        <w:t xml:space="preserve"> </w:t>
-      </w:r>
-      <w:proofErr w:type="spellStart"/>
-      <w:r>
-        <w:rPr>
-          <w:rFonts w:ascii="Calibri Light" w:hAnsi="Calibri Light" w:cs="Calibri Light"/>
-          <w:b/>
-          <w:bCs/>
-        </w:rPr>
-        <w:t>Advertisement</w:t>
-      </w:r>
-      <w:proofErr w:type="spellEnd"/>
-      <w:r>
-        <w:rPr>
-          <w:rFonts w:ascii="Calibri Light" w:hAnsi="Calibri Light" w:cs="Calibri Light"/>
-          <w:b/>
-          <w:bCs/>
-        </w:rPr>
-        <w:t>)</w:t>
+        <w:t>Para la puesta en marcha de la autoconfiguración sin estado (SLAAC), se procedió a la configuración de los routers extremos para que actuaran como fuentes de anuncios de red. El proceso se detalla a continuación:</w:t>
+      </w:r>
+    </w:p>
+    <w:p>
+      <w:pPr>
+        <w:rPr>
+          <w:rFonts w:ascii="Calibri Light" w:hAnsi="Calibri Light" w:cs="Calibri Light"/>
+          <w:b/>
+          <w:bCs/>
+        </w:rPr>
+      </w:pPr>
+      <w:r>
+        <w:rPr>
+          <w:rFonts w:ascii="Calibri Light" w:hAnsi="Calibri Light" w:cs="Calibri Light"/>
+          <w:b/>
+          <w:bCs/>
+        </w:rPr>
+        <w:t>Configuración del Router (Lado Servidor)</w:t>
+      </w:r>
+    </w:p>
+    <w:p>
+      <w:pPr>
+        <w:rPr>
+          <w:rFonts w:ascii="Calibri Light" w:hAnsi="Calibri Light" w:cs="Calibri Light"/>
+        </w:rPr>
+      </w:pPr>
+      <w:r>
+        <w:rPr>
+          <w:rFonts w:ascii="Calibri Light" w:hAnsi="Calibri Light" w:cs="Calibri Light"/>
+        </w:rPr>
+        <w:t xml:space="preserve">Se habilitó el enrutamiento de unidifusión IPv6 y se configuraron las interfaces LAN con sus respectivos prefijos globales. Esto permite que el router envíe mensajes </w:t>
+      </w:r>
+      <w:r>
+        <w:rPr>
+          <w:rFonts w:ascii="Calibri Light" w:hAnsi="Calibri Light" w:cs="Calibri Light"/>
+          <w:b/>
+          <w:bCs/>
+        </w:rPr>
+        <w:t>ICMPv6 Tipo 134 (Router Advertisement)</w:t>
       </w:r>
       <w:r>
         <w:rPr>
@@ -4140,25 +3210,7 @@
           <w:b/>
           <w:bCs/>
         </w:rPr>
-        <w:t xml:space="preserve">Comandos aplicados (Ejemplo </w:t>
-      </w:r>
-      <w:proofErr w:type="spellStart"/>
-      <w:r>
-        <w:rPr>
-          <w:rFonts w:ascii="Calibri Light" w:hAnsi="Calibri Light" w:cs="Calibri Light"/>
-          <w:b/>
-          <w:bCs/>
-        </w:rPr>
-        <w:t>Router</w:t>
-      </w:r>
-      <w:proofErr w:type="spellEnd"/>
-      <w:r>
-        <w:rPr>
-          <w:rFonts w:ascii="Calibri Light" w:hAnsi="Calibri Light" w:cs="Calibri Light"/>
-          <w:b/>
-          <w:bCs/>
-        </w:rPr>
-        <w:t xml:space="preserve"> 1):</w:t>
+        <w:t>Comandos aplicados (Ejemplo Router 1):</w:t>
       </w:r>
     </w:p>
     <w:p>
@@ -4180,30 +3232,8 @@
         <w:rPr>
           <w:rFonts w:ascii="Calibri Light" w:hAnsi="Calibri Light" w:cs="Calibri Light"/>
         </w:rPr>
-        <w:t>Router-1(</w:t>
-      </w:r>
-      <w:proofErr w:type="spellStart"/>
-      <w:r>
-        <w:rPr>
-          <w:rFonts w:ascii="Calibri Light" w:hAnsi="Calibri Light" w:cs="Calibri Light"/>
-        </w:rPr>
-        <w:t>config</w:t>
-      </w:r>
-      <w:proofErr w:type="spellEnd"/>
-      <w:r>
-        <w:rPr>
-          <w:rFonts w:ascii="Calibri Light" w:hAnsi="Calibri Light" w:cs="Calibri Light"/>
-        </w:rPr>
-        <w:t xml:space="preserve">)# ipv6 </w:t>
-      </w:r>
-      <w:proofErr w:type="spellStart"/>
-      <w:r>
-        <w:rPr>
-          <w:rFonts w:ascii="Calibri Light" w:hAnsi="Calibri Light" w:cs="Calibri Light"/>
-        </w:rPr>
-        <w:t>unicast-routing</w:t>
-      </w:r>
-      <w:proofErr w:type="spellEnd"/>
+        <w:t>Router-1(config)# ipv6 unicast-routing</w:t>
+      </w:r>
     </w:p>
     <w:p>
       <w:pPr>
@@ -4234,23 +3264,23 @@
           <w:rFonts w:ascii="Calibri Light" w:hAnsi="Calibri Light" w:cs="Calibri Light"/>
           <w:lang w:val="en-US"/>
         </w:rPr>
-        <w:t>Router-1(config-</w:t>
-      </w:r>
-      <w:proofErr w:type="gramStart"/>
-      <w:r>
+        <w:t>Router-1(config-if)# ipv6 address 2001:DB8:CC1A:1::1/64</w:t>
+      </w:r>
+    </w:p>
+    <w:p>
+      <w:pPr>
+        <w:shd w:val="clear" w:color="auto" w:fill="F2F2F2" w:themeFill="background1" w:themeFillShade="F2"/>
         <w:rPr>
           <w:rFonts w:ascii="Calibri Light" w:hAnsi="Calibri Light" w:cs="Calibri Light"/>
           <w:lang w:val="en-US"/>
         </w:rPr>
-        <w:t>if)#</w:t>
-      </w:r>
-      <w:proofErr w:type="gramEnd"/>
+      </w:pPr>
       <w:r>
         <w:rPr>
           <w:rFonts w:ascii="Calibri Light" w:hAnsi="Calibri Light" w:cs="Calibri Light"/>
           <w:lang w:val="en-US"/>
         </w:rPr>
-        <w:t xml:space="preserve"> ipv6 address 2001:DB8:CC1A:1::1/64</w:t>
+        <w:t>Router-1(config-if)# ipv6 address FE80::1 link-local</w:t>
       </w:r>
     </w:p>
     <w:p>
@@ -4258,73 +3288,13 @@
         <w:shd w:val="clear" w:color="auto" w:fill="F2F2F2" w:themeFill="background1" w:themeFillShade="F2"/>
         <w:rPr>
           <w:rFonts w:ascii="Calibri Light" w:hAnsi="Calibri Light" w:cs="Calibri Light"/>
-          <w:lang w:val="en-US"/>
-        </w:rPr>
-      </w:pPr>
-      <w:r>
-        <w:rPr>
-          <w:rFonts w:ascii="Calibri Light" w:hAnsi="Calibri Light" w:cs="Calibri Light"/>
-          <w:lang w:val="en-US"/>
-        </w:rPr>
-        <w:t>Router-1(config-</w:t>
-      </w:r>
-      <w:proofErr w:type="gramStart"/>
-      <w:r>
-        <w:rPr>
-          <w:rFonts w:ascii="Calibri Light" w:hAnsi="Calibri Light" w:cs="Calibri Light"/>
-          <w:lang w:val="en-US"/>
-        </w:rPr>
-        <w:t>if)#</w:t>
-      </w:r>
-      <w:proofErr w:type="gramEnd"/>
-      <w:r>
-        <w:rPr>
-          <w:rFonts w:ascii="Calibri Light" w:hAnsi="Calibri Light" w:cs="Calibri Light"/>
-          <w:lang w:val="en-US"/>
-        </w:rPr>
-        <w:t xml:space="preserve"> ipv6 address FE80::1 link-local</w:t>
-      </w:r>
-    </w:p>
-    <w:p>
-      <w:pPr>
-        <w:shd w:val="clear" w:color="auto" w:fill="F2F2F2" w:themeFill="background1" w:themeFillShade="F2"/>
-        <w:rPr>
-          <w:rFonts w:ascii="Calibri Light" w:hAnsi="Calibri Light" w:cs="Calibri Light"/>
-        </w:rPr>
-      </w:pPr>
-      <w:r>
-        <w:rPr>
-          <w:rFonts w:ascii="Calibri Light" w:hAnsi="Calibri Light" w:cs="Calibri Light"/>
-        </w:rPr>
-        <w:t>Router-1(</w:t>
-      </w:r>
-      <w:proofErr w:type="spellStart"/>
-      <w:r>
-        <w:rPr>
-          <w:rFonts w:ascii="Calibri Light" w:hAnsi="Calibri Light" w:cs="Calibri Light"/>
-        </w:rPr>
-        <w:t>config-</w:t>
-      </w:r>
-      <w:proofErr w:type="gramStart"/>
-      <w:r>
-        <w:rPr>
-          <w:rFonts w:ascii="Calibri Light" w:hAnsi="Calibri Light" w:cs="Calibri Light"/>
-        </w:rPr>
-        <w:t>if</w:t>
-      </w:r>
-      <w:proofErr w:type="spellEnd"/>
-      <w:r>
-        <w:rPr>
-          <w:rFonts w:ascii="Calibri Light" w:hAnsi="Calibri Light" w:cs="Calibri Light"/>
-        </w:rPr>
-        <w:t>)#</w:t>
-      </w:r>
-      <w:proofErr w:type="gramEnd"/>
-      <w:r>
-        <w:rPr>
-          <w:rFonts w:ascii="Calibri Light" w:hAnsi="Calibri Light" w:cs="Calibri Light"/>
-        </w:rPr>
-        <w:t xml:space="preserve"> no shutdown</w:t>
+        </w:rPr>
+      </w:pPr>
+      <w:r>
+        <w:rPr>
+          <w:rFonts w:ascii="Calibri Light" w:hAnsi="Calibri Light" w:cs="Calibri Light"/>
+        </w:rPr>
+        <w:t>Router-1(config-if)# no shutdown</w:t>
       </w:r>
     </w:p>
     <w:p>
@@ -4347,79 +3317,33 @@
           <w:b/>
           <w:bCs/>
         </w:rPr>
-        <w:t xml:space="preserve">Habilitación del Enrutamiento </w:t>
-      </w:r>
-      <w:proofErr w:type="spellStart"/>
-      <w:r>
-        <w:rPr>
-          <w:rFonts w:ascii="Calibri Light" w:hAnsi="Calibri Light" w:cs="Calibri Light"/>
-          <w:b/>
-          <w:bCs/>
-        </w:rPr>
-        <w:t>Unicast</w:t>
-      </w:r>
-      <w:proofErr w:type="spellEnd"/>
-      <w:r>
-        <w:rPr>
-          <w:rFonts w:ascii="Calibri Light" w:hAnsi="Calibri Light" w:cs="Calibri Light"/>
-          <w:b/>
-          <w:bCs/>
-        </w:rPr>
-        <w:t xml:space="preserve"> IPv6</w:t>
-      </w:r>
-    </w:p>
-    <w:p>
-      <w:pPr>
-        <w:rPr>
-          <w:rFonts w:ascii="Calibri Light" w:hAnsi="Calibri Light" w:cs="Calibri Light"/>
-        </w:rPr>
-      </w:pPr>
-      <w:r>
-        <w:rPr>
-          <w:rFonts w:ascii="Calibri Light" w:hAnsi="Calibri Light" w:cs="Calibri Light"/>
-        </w:rPr>
-        <w:t xml:space="preserve">Un paso crítico identificado durante la práctica fue la activación global del enrutamiento IPv6. Por defecto, los </w:t>
-      </w:r>
-      <w:proofErr w:type="spellStart"/>
-      <w:r>
-        <w:rPr>
-          <w:rFonts w:ascii="Calibri Light" w:hAnsi="Calibri Light" w:cs="Calibri Light"/>
-        </w:rPr>
-        <w:t>routers</w:t>
-      </w:r>
-      <w:proofErr w:type="spellEnd"/>
-      <w:r>
-        <w:rPr>
-          <w:rFonts w:ascii="Calibri Light" w:hAnsi="Calibri Light" w:cs="Calibri Light"/>
-        </w:rPr>
-        <w:t xml:space="preserve"> Cisco actúan como nodos finales y no reenvían paquetes IPv6 ni envían mensajes de anuncio (RA) a menos que se habilite explícitamente esta función. </w:t>
-      </w:r>
-    </w:p>
-    <w:p>
-      <w:pPr>
-        <w:rPr>
-          <w:rFonts w:ascii="Calibri Light" w:hAnsi="Calibri Light" w:cs="Calibri Light"/>
-        </w:rPr>
-      </w:pPr>
-      <w:r>
-        <w:rPr>
-          <w:rFonts w:ascii="Calibri Light" w:hAnsi="Calibri Light" w:cs="Calibri Light"/>
-        </w:rPr>
-        <w:t xml:space="preserve">Como se observa en la evidencia técnica del </w:t>
-      </w:r>
-      <w:proofErr w:type="spellStart"/>
-      <w:r>
-        <w:rPr>
-          <w:rFonts w:ascii="Calibri Light" w:hAnsi="Calibri Light" w:cs="Calibri Light"/>
-        </w:rPr>
-        <w:t>Router</w:t>
-      </w:r>
-      <w:proofErr w:type="spellEnd"/>
-      <w:r>
-        <w:rPr>
-          <w:rFonts w:ascii="Calibri Light" w:hAnsi="Calibri Light" w:cs="Calibri Light"/>
-        </w:rPr>
-        <w:t xml:space="preserve"> 1:</w:t>
+        <w:t>Habilitación del Enrutamiento Unicast IPv6</w:t>
+      </w:r>
+    </w:p>
+    <w:p>
+      <w:pPr>
+        <w:rPr>
+          <w:rFonts w:ascii="Calibri Light" w:hAnsi="Calibri Light" w:cs="Calibri Light"/>
+        </w:rPr>
+      </w:pPr>
+      <w:r>
+        <w:rPr>
+          <w:rFonts w:ascii="Calibri Light" w:hAnsi="Calibri Light" w:cs="Calibri Light"/>
+        </w:rPr>
+        <w:t xml:space="preserve">Un paso crítico identificado durante la práctica fue la activación global del enrutamiento IPv6. Por defecto, los routers Cisco actúan como nodos finales y no reenvían paquetes IPv6 ni envían mensajes de anuncio (RA) a menos que se habilite explícitamente esta función. </w:t>
+      </w:r>
+    </w:p>
+    <w:p>
+      <w:pPr>
+        <w:rPr>
+          <w:rFonts w:ascii="Calibri Light" w:hAnsi="Calibri Light" w:cs="Calibri Light"/>
+        </w:rPr>
+      </w:pPr>
+      <w:r>
+        <w:rPr>
+          <w:rFonts w:ascii="Calibri Light" w:hAnsi="Calibri Light" w:cs="Calibri Light"/>
+        </w:rPr>
+        <w:t>Como se observa en la evidencia técnica del Router 1:</w:t>
       </w:r>
     </w:p>
     <w:p>
@@ -4436,35 +3360,7 @@
         <w:rPr>
           <w:rFonts w:ascii="Calibri Light" w:hAnsi="Calibri Light" w:cs="Calibri Light"/>
         </w:rPr>
-        <w:t xml:space="preserve">Validación Inicial: Al ejecutar show ipv6 </w:t>
-      </w:r>
-      <w:proofErr w:type="spellStart"/>
-      <w:r>
-        <w:rPr>
-          <w:rFonts w:ascii="Calibri Light" w:hAnsi="Calibri Light" w:cs="Calibri Light"/>
-        </w:rPr>
-        <w:t>protocols</w:t>
-      </w:r>
-      <w:proofErr w:type="spellEnd"/>
-      <w:r>
-        <w:rPr>
-          <w:rFonts w:ascii="Calibri Light" w:hAnsi="Calibri Light" w:cs="Calibri Light"/>
-        </w:rPr>
-        <w:t xml:space="preserve">, el </w:t>
-      </w:r>
-      <w:proofErr w:type="spellStart"/>
-      <w:r>
-        <w:rPr>
-          <w:rFonts w:ascii="Calibri Light" w:hAnsi="Calibri Light" w:cs="Calibri Light"/>
-        </w:rPr>
-        <w:t>router</w:t>
-      </w:r>
-      <w:proofErr w:type="spellEnd"/>
-      <w:r>
-        <w:rPr>
-          <w:rFonts w:ascii="Calibri Light" w:hAnsi="Calibri Light" w:cs="Calibri Light"/>
-        </w:rPr>
-        <w:t xml:space="preserve"> solo mostraba protocolos conectados y de descubrimiento (ND), indicando que el enrutamiento dinámico y el reenvío estaban inactivos.</w:t>
+        <w:t>Validación Inicial: Al ejecutar show ipv6 protocols, el router solo mostraba protocolos conectados y de descubrimiento (ND), indicando que el enrutamiento dinámico y el reenvío estaban inactivos.</w:t>
       </w:r>
     </w:p>
     <w:p>
@@ -4481,21 +3377,7 @@
         <w:rPr>
           <w:rFonts w:ascii="Calibri Light" w:hAnsi="Calibri Light" w:cs="Calibri Light"/>
         </w:rPr>
-        <w:t xml:space="preserve">Activación: Se ejecutó el comando de configuración global ipv6 </w:t>
-      </w:r>
-      <w:proofErr w:type="spellStart"/>
-      <w:r>
-        <w:rPr>
-          <w:rFonts w:ascii="Calibri Light" w:hAnsi="Calibri Light" w:cs="Calibri Light"/>
-        </w:rPr>
-        <w:t>unicast-routing</w:t>
-      </w:r>
-      <w:proofErr w:type="spellEnd"/>
-      <w:r>
-        <w:rPr>
-          <w:rFonts w:ascii="Calibri Light" w:hAnsi="Calibri Light" w:cs="Calibri Light"/>
-        </w:rPr>
-        <w:t xml:space="preserve">. </w:t>
+        <w:t xml:space="preserve">Activación: Se ejecutó el comando de configuración global ipv6 unicast-routing. </w:t>
       </w:r>
     </w:p>
     <w:p>
@@ -4512,21 +3394,7 @@
         <w:rPr>
           <w:rFonts w:ascii="Calibri Light" w:hAnsi="Calibri Light" w:cs="Calibri Light"/>
         </w:rPr>
-        <w:t xml:space="preserve">Impacto: Este comando permitió que el </w:t>
-      </w:r>
-      <w:proofErr w:type="spellStart"/>
-      <w:r>
-        <w:rPr>
-          <w:rFonts w:ascii="Calibri Light" w:hAnsi="Calibri Light" w:cs="Calibri Light"/>
-        </w:rPr>
-        <w:t>router</w:t>
-      </w:r>
-      <w:proofErr w:type="spellEnd"/>
-      <w:r>
-        <w:rPr>
-          <w:rFonts w:ascii="Calibri Light" w:hAnsi="Calibri Light" w:cs="Calibri Light"/>
-        </w:rPr>
-        <w:t xml:space="preserve"> comenzara a procesar el direccionamiento IPv6 en todas sus interfaces up/up y habilitó la capacidad de participar en el proceso de enrutamiento OSPFv3</w:t>
+        <w:t>Impacto: Este comando permitió que el router comenzara a procesar el direccionamiento IPv6 en todas sus interfaces up/up y habilitó la capacidad de participar en el proceso de enrutamiento OSPFv3</w:t>
       </w:r>
     </w:p>
     <w:p>
@@ -4557,21 +3425,7 @@
         <w:rPr>
           <w:rFonts w:ascii="Calibri Light" w:hAnsi="Calibri Light" w:cs="Calibri Light"/>
         </w:rPr>
-        <w:t xml:space="preserve">Una vez configurado el </w:t>
-      </w:r>
-      <w:proofErr w:type="spellStart"/>
-      <w:r>
-        <w:rPr>
-          <w:rFonts w:ascii="Calibri Light" w:hAnsi="Calibri Light" w:cs="Calibri Light"/>
-        </w:rPr>
-        <w:t>router</w:t>
-      </w:r>
-      <w:proofErr w:type="spellEnd"/>
-      <w:r>
-        <w:rPr>
-          <w:rFonts w:ascii="Calibri Light" w:hAnsi="Calibri Light" w:cs="Calibri Light"/>
-        </w:rPr>
-        <w:t>, se validó en los dispositivos finales (</w:t>
+        <w:t>Una vez configurado el router, se validó en los dispositivos finales (</w:t>
       </w:r>
       <w:r>
         <w:rPr>
@@ -4587,7 +3441,6 @@
         </w:rPr>
         <w:t xml:space="preserve">) el cambio de configuración de IP estática a </w:t>
       </w:r>
-      <w:proofErr w:type="spellStart"/>
       <w:r>
         <w:rPr>
           <w:rFonts w:ascii="Calibri Light" w:hAnsi="Calibri Light" w:cs="Calibri Light"/>
@@ -4596,7 +3449,6 @@
         </w:rPr>
         <w:t>Automatic</w:t>
       </w:r>
-      <w:proofErr w:type="spellEnd"/>
       <w:r>
         <w:rPr>
           <w:rFonts w:ascii="Calibri Light" w:hAnsi="Calibri Light" w:cs="Calibri Light"/>
@@ -4667,35 +3519,7 @@
         <w:rPr>
           <w:rFonts w:ascii="Calibri Light" w:hAnsi="Calibri Light" w:cs="Calibri Light"/>
         </w:rPr>
-        <w:t xml:space="preserve"> Se verificó mediante el comando </w:t>
-      </w:r>
-      <w:proofErr w:type="spellStart"/>
-      <w:r>
-        <w:rPr>
-          <w:rFonts w:ascii="Calibri Light" w:hAnsi="Calibri Light" w:cs="Calibri Light"/>
-        </w:rPr>
-        <w:t>ipconfig</w:t>
-      </w:r>
-      <w:proofErr w:type="spellEnd"/>
-      <w:r>
-        <w:rPr>
-          <w:rFonts w:ascii="Calibri Light" w:hAnsi="Calibri Light" w:cs="Calibri Light"/>
-        </w:rPr>
-        <w:t xml:space="preserve"> que los </w:t>
-      </w:r>
-      <w:proofErr w:type="spellStart"/>
-      <w:r>
-        <w:rPr>
-          <w:rFonts w:ascii="Calibri Light" w:hAnsi="Calibri Light" w:cs="Calibri Light"/>
-        </w:rPr>
-        <w:t>PCs</w:t>
-      </w:r>
-      <w:proofErr w:type="spellEnd"/>
-      <w:r>
-        <w:rPr>
-          <w:rFonts w:ascii="Calibri Light" w:hAnsi="Calibri Light" w:cs="Calibri Light"/>
-        </w:rPr>
-        <w:t xml:space="preserve"> tomaron automáticamente la dirección </w:t>
+        <w:t xml:space="preserve"> Se verificó mediante el comando ipconfig que los PCs tomaron automáticamente la dirección </w:t>
       </w:r>
       <w:r>
         <w:rPr>
@@ -4709,35 +3533,7 @@
         <w:rPr>
           <w:rFonts w:ascii="Calibri Light" w:hAnsi="Calibri Light" w:cs="Calibri Light"/>
         </w:rPr>
-        <w:t xml:space="preserve"> del </w:t>
-      </w:r>
-      <w:proofErr w:type="spellStart"/>
-      <w:r>
-        <w:rPr>
-          <w:rFonts w:ascii="Calibri Light" w:hAnsi="Calibri Light" w:cs="Calibri Light"/>
-        </w:rPr>
-        <w:t>router</w:t>
-      </w:r>
-      <w:proofErr w:type="spellEnd"/>
-      <w:r>
-        <w:rPr>
-          <w:rFonts w:ascii="Calibri Light" w:hAnsi="Calibri Light" w:cs="Calibri Light"/>
-        </w:rPr>
-        <w:t xml:space="preserve"> (FE</w:t>
-      </w:r>
-      <w:proofErr w:type="gramStart"/>
-      <w:r>
-        <w:rPr>
-          <w:rFonts w:ascii="Calibri Light" w:hAnsi="Calibri Light" w:cs="Calibri Light"/>
-        </w:rPr>
-        <w:t>80::X</w:t>
-      </w:r>
-      <w:proofErr w:type="gramEnd"/>
-      <w:r>
-        <w:rPr>
-          <w:rFonts w:ascii="Calibri Light" w:hAnsi="Calibri Light" w:cs="Calibri Light"/>
-        </w:rPr>
-        <w:t>) como su puerta de enlace, validando así el intercambio de mensajes RS/RA.</w:t>
+        <w:t xml:space="preserve"> del router (FE80::X) como su puerta de enlace, validando así el intercambio de mensajes RS/RA.</w:t>
       </w:r>
     </w:p>
     <w:p>
@@ -4762,35 +3558,7 @@
         <w:rPr>
           <w:rFonts w:ascii="Calibri Light" w:hAnsi="Calibri Light" w:cs="Calibri Light"/>
         </w:rPr>
-        <w:t xml:space="preserve"> En la interfaz de </w:t>
-      </w:r>
-      <w:proofErr w:type="spellStart"/>
-      <w:r>
-        <w:rPr>
-          <w:rFonts w:ascii="Calibri Light" w:hAnsi="Calibri Light" w:cs="Calibri Light"/>
-        </w:rPr>
-        <w:t>Packet</w:t>
-      </w:r>
-      <w:proofErr w:type="spellEnd"/>
-      <w:r>
-        <w:rPr>
-          <w:rFonts w:ascii="Calibri Light" w:hAnsi="Calibri Light" w:cs="Calibri Light"/>
-        </w:rPr>
-        <w:t xml:space="preserve"> </w:t>
-      </w:r>
-      <w:proofErr w:type="spellStart"/>
-      <w:r>
-        <w:rPr>
-          <w:rFonts w:ascii="Calibri Light" w:hAnsi="Calibri Light" w:cs="Calibri Light"/>
-        </w:rPr>
-        <w:t>Tracer</w:t>
-      </w:r>
-      <w:proofErr w:type="spellEnd"/>
-      <w:r>
-        <w:rPr>
-          <w:rFonts w:ascii="Calibri Light" w:hAnsi="Calibri Light" w:cs="Calibri Light"/>
-        </w:rPr>
-        <w:t xml:space="preserve">, se confirmó el mensaje </w:t>
+        <w:t xml:space="preserve"> En la interfaz de Packet Tracer, se confirmó el mensaje </w:t>
       </w:r>
       <w:r>
         <w:rPr>
@@ -4798,77 +3566,13 @@
           <w:i/>
           <w:iCs/>
         </w:rPr>
-        <w:t xml:space="preserve">"IPv6 </w:t>
-      </w:r>
-      <w:proofErr w:type="spellStart"/>
-      <w:r>
-        <w:rPr>
-          <w:rFonts w:ascii="Calibri Light" w:hAnsi="Calibri Light" w:cs="Calibri Light"/>
-          <w:i/>
-          <w:iCs/>
-        </w:rPr>
-        <w:t>request</w:t>
-      </w:r>
-      <w:proofErr w:type="spellEnd"/>
-      <w:r>
-        <w:rPr>
-          <w:rFonts w:ascii="Calibri Light" w:hAnsi="Calibri Light" w:cs="Calibri Light"/>
-          <w:i/>
-          <w:iCs/>
-        </w:rPr>
-        <w:t xml:space="preserve"> </w:t>
-      </w:r>
-      <w:proofErr w:type="spellStart"/>
-      <w:r>
-        <w:rPr>
-          <w:rFonts w:ascii="Calibri Light" w:hAnsi="Calibri Light" w:cs="Calibri Light"/>
-          <w:i/>
-          <w:iCs/>
-        </w:rPr>
-        <w:t>successful</w:t>
-      </w:r>
-      <w:proofErr w:type="spellEnd"/>
-      <w:r>
-        <w:rPr>
-          <w:rFonts w:ascii="Calibri Light" w:hAnsi="Calibri Light" w:cs="Calibri Light"/>
-          <w:i/>
-          <w:iCs/>
-        </w:rPr>
-        <w:t>"</w:t>
-      </w:r>
-      <w:r>
-        <w:rPr>
-          <w:rFonts w:ascii="Calibri Light" w:hAnsi="Calibri Light" w:cs="Calibri Light"/>
-        </w:rPr>
-        <w:t>, lo que indica que el proceso NDP (</w:t>
-      </w:r>
-      <w:proofErr w:type="spellStart"/>
-      <w:r>
-        <w:rPr>
-          <w:rFonts w:ascii="Calibri Light" w:hAnsi="Calibri Light" w:cs="Calibri Light"/>
-        </w:rPr>
-        <w:t>Neighbor</w:t>
-      </w:r>
-      <w:proofErr w:type="spellEnd"/>
-      <w:r>
-        <w:rPr>
-          <w:rFonts w:ascii="Calibri Light" w:hAnsi="Calibri Light" w:cs="Calibri Light"/>
-        </w:rPr>
-        <w:t xml:space="preserve"> Discovery </w:t>
-      </w:r>
-      <w:proofErr w:type="spellStart"/>
-      <w:r>
-        <w:rPr>
-          <w:rFonts w:ascii="Calibri Light" w:hAnsi="Calibri Light" w:cs="Calibri Light"/>
-        </w:rPr>
-        <w:t>Protocol</w:t>
-      </w:r>
-      <w:proofErr w:type="spellEnd"/>
-      <w:r>
-        <w:rPr>
-          <w:rFonts w:ascii="Calibri Light" w:hAnsi="Calibri Light" w:cs="Calibri Light"/>
-        </w:rPr>
-        <w:t>) completó el ciclo de direccionamiento sin errores.</w:t>
+        <w:t>"IPv6 request successful"</w:t>
+      </w:r>
+      <w:r>
+        <w:rPr>
+          <w:rFonts w:ascii="Calibri Light" w:hAnsi="Calibri Light" w:cs="Calibri Light"/>
+        </w:rPr>
+        <w:t>, lo que indica que el proceso NDP (Neighbor Discovery Protocol) completó el ciclo de direccionamiento sin errores.</w:t>
       </w:r>
     </w:p>
     <w:tbl>
@@ -5113,23 +3817,13 @@
                 <w:szCs w:val="20"/>
               </w:rPr>
             </w:pPr>
-            <w:proofErr w:type="gramStart"/>
             <w:r>
               <w:rPr>
                 <w:rFonts w:ascii="Calibri Light" w:hAnsi="Calibri Light" w:cs="Calibri Light"/>
                 <w:sz w:val="20"/>
                 <w:szCs w:val="20"/>
               </w:rPr>
-              <w:t>2001:DB8:CC1A</w:t>
-            </w:r>
-            <w:proofErr w:type="gramEnd"/>
-            <w:r>
-              <w:rPr>
-                <w:rFonts w:ascii="Calibri Light" w:hAnsi="Calibri Light" w:cs="Calibri Light"/>
-                <w:sz w:val="20"/>
-                <w:szCs w:val="20"/>
-              </w:rPr>
-              <w:t>:1::/64</w:t>
+              <w:t>2001:DB8:CC1A:1::/64</w:t>
             </w:r>
           </w:p>
         </w:tc>
@@ -5275,23 +3969,13 @@
                 <w:szCs w:val="20"/>
               </w:rPr>
             </w:pPr>
-            <w:proofErr w:type="gramStart"/>
             <w:r>
               <w:rPr>
                 <w:rFonts w:ascii="Calibri Light" w:hAnsi="Calibri Light" w:cs="Calibri Light"/>
                 <w:sz w:val="20"/>
                 <w:szCs w:val="20"/>
               </w:rPr>
-              <w:t>2001:DB8:CC1A</w:t>
-            </w:r>
-            <w:proofErr w:type="gramEnd"/>
-            <w:r>
-              <w:rPr>
-                <w:rFonts w:ascii="Calibri Light" w:hAnsi="Calibri Light" w:cs="Calibri Light"/>
-                <w:sz w:val="20"/>
-                <w:szCs w:val="20"/>
-              </w:rPr>
-              <w:t>:2::/64</w:t>
+              <w:t>2001:DB8:CC1A:2::/64</w:t>
             </w:r>
           </w:p>
         </w:tc>
@@ -5404,61 +4088,7 @@
           <w:b/>
           <w:bCs/>
         </w:rPr>
-        <w:t xml:space="preserve">OSPFv3 (Open </w:t>
-      </w:r>
-      <w:proofErr w:type="spellStart"/>
-      <w:r>
-        <w:rPr>
-          <w:rFonts w:ascii="Calibri Light" w:hAnsi="Calibri Light" w:cs="Calibri Light"/>
-          <w:b/>
-          <w:bCs/>
-        </w:rPr>
-        <w:t>Shortest</w:t>
-      </w:r>
-      <w:proofErr w:type="spellEnd"/>
-      <w:r>
-        <w:rPr>
-          <w:rFonts w:ascii="Calibri Light" w:hAnsi="Calibri Light" w:cs="Calibri Light"/>
-          <w:b/>
-          <w:bCs/>
-        </w:rPr>
-        <w:t xml:space="preserve"> </w:t>
-      </w:r>
-      <w:proofErr w:type="spellStart"/>
-      <w:r>
-        <w:rPr>
-          <w:rFonts w:ascii="Calibri Light" w:hAnsi="Calibri Light" w:cs="Calibri Light"/>
-          <w:b/>
-          <w:bCs/>
-        </w:rPr>
-        <w:t>Path</w:t>
-      </w:r>
-      <w:proofErr w:type="spellEnd"/>
-      <w:r>
-        <w:rPr>
-          <w:rFonts w:ascii="Calibri Light" w:hAnsi="Calibri Light" w:cs="Calibri Light"/>
-          <w:b/>
-          <w:bCs/>
-        </w:rPr>
-        <w:t xml:space="preserve"> </w:t>
-      </w:r>
-      <w:proofErr w:type="spellStart"/>
-      <w:r>
-        <w:rPr>
-          <w:rFonts w:ascii="Calibri Light" w:hAnsi="Calibri Light" w:cs="Calibri Light"/>
-          <w:b/>
-          <w:bCs/>
-        </w:rPr>
-        <w:t>First</w:t>
-      </w:r>
-      <w:proofErr w:type="spellEnd"/>
-      <w:r>
-        <w:rPr>
-          <w:rFonts w:ascii="Calibri Light" w:hAnsi="Calibri Light" w:cs="Calibri Light"/>
-          <w:b/>
-          <w:bCs/>
-        </w:rPr>
-        <w:t xml:space="preserve"> versión 3)</w:t>
+        <w:t>OSPFv3 (Open Shortest Path First versión 3)</w:t>
       </w:r>
       <w:r>
         <w:rPr>
@@ -5494,21 +4124,7 @@
         <w:rPr>
           <w:rFonts w:ascii="Calibri Light" w:hAnsi="Calibri Light" w:cs="Calibri Light"/>
         </w:rPr>
-        <w:t xml:space="preserve">La implementación se realizó siguiendo tres pasos críticos en cada </w:t>
-      </w:r>
-      <w:proofErr w:type="spellStart"/>
-      <w:r>
-        <w:rPr>
-          <w:rFonts w:ascii="Calibri Light" w:hAnsi="Calibri Light" w:cs="Calibri Light"/>
-        </w:rPr>
-        <w:t>router</w:t>
-      </w:r>
-      <w:proofErr w:type="spellEnd"/>
-      <w:r>
-        <w:rPr>
-          <w:rFonts w:ascii="Calibri Light" w:hAnsi="Calibri Light" w:cs="Calibri Light"/>
-        </w:rPr>
-        <w:t>:</w:t>
+        <w:t>La implementación se realizó siguiendo tres pasos críticos en cada router:</w:t>
       </w:r>
     </w:p>
     <w:p>
@@ -5535,23 +4151,13 @@
         </w:rPr>
         <w:t xml:space="preserve"> Se creó el proceso OSPFv3 y se asignó un </w:t>
       </w:r>
-      <w:proofErr w:type="spellStart"/>
-      <w:r>
-        <w:rPr>
-          <w:rFonts w:ascii="Calibri Light" w:hAnsi="Calibri Light" w:cs="Calibri Light"/>
-          <w:b/>
-          <w:bCs/>
-        </w:rPr>
-        <w:t>Router</w:t>
-      </w:r>
-      <w:proofErr w:type="spellEnd"/>
-      <w:r>
-        <w:rPr>
-          <w:rFonts w:ascii="Calibri Light" w:hAnsi="Calibri Light" w:cs="Calibri Light"/>
-          <w:b/>
-          <w:bCs/>
-        </w:rPr>
-        <w:t>-ID</w:t>
+      <w:r>
+        <w:rPr>
+          <w:rFonts w:ascii="Calibri Light" w:hAnsi="Calibri Light" w:cs="Calibri Light"/>
+          <w:b/>
+          <w:bCs/>
+        </w:rPr>
+        <w:t>Router-ID</w:t>
       </w:r>
       <w:r>
         <w:rPr>
@@ -5590,25 +4196,7 @@
           <w:b/>
           <w:bCs/>
         </w:rPr>
-        <w:t>Área 0 (</w:t>
-      </w:r>
-      <w:proofErr w:type="spellStart"/>
-      <w:r>
-        <w:rPr>
-          <w:rFonts w:ascii="Calibri Light" w:hAnsi="Calibri Light" w:cs="Calibri Light"/>
-          <w:b/>
-          <w:bCs/>
-        </w:rPr>
-        <w:t>Backbone</w:t>
-      </w:r>
-      <w:proofErr w:type="spellEnd"/>
-      <w:r>
-        <w:rPr>
-          <w:rFonts w:ascii="Calibri Light" w:hAnsi="Calibri Light" w:cs="Calibri Light"/>
-          <w:b/>
-          <w:bCs/>
-        </w:rPr>
-        <w:t>)</w:t>
+        <w:t>Área 0 (Backbone)</w:t>
       </w:r>
       <w:r>
         <w:rPr>
@@ -5639,21 +4227,7 @@
         <w:rPr>
           <w:rFonts w:ascii="Calibri Light" w:hAnsi="Calibri Light" w:cs="Calibri Light"/>
         </w:rPr>
-        <w:t xml:space="preserve"> Se verificó que las adyacencias se formaran utilizando las direcciones de enlace local (FE</w:t>
-      </w:r>
-      <w:proofErr w:type="gramStart"/>
-      <w:r>
-        <w:rPr>
-          <w:rFonts w:ascii="Calibri Light" w:hAnsi="Calibri Light" w:cs="Calibri Light"/>
-        </w:rPr>
-        <w:t>80::/</w:t>
-      </w:r>
-      <w:proofErr w:type="gramEnd"/>
-      <w:r>
-        <w:rPr>
-          <w:rFonts w:ascii="Calibri Light" w:hAnsi="Calibri Light" w:cs="Calibri Light"/>
-        </w:rPr>
-        <w:t>10), garantizando que el tráfico de control de enrutamiento permanezca dentro del segmento físico.</w:t>
+        <w:t xml:space="preserve"> Se verificó que las adyacencias se formaran utilizando las direcciones de enlace local (FE80::/10), garantizando que el tráfico de control de enrutamiento permanezca dentro del segmento físico.</w:t>
       </w:r>
     </w:p>
     <w:p>
@@ -5684,61 +4258,11 @@
           <w:rFonts w:ascii="Calibri Light" w:hAnsi="Calibri Light" w:cs="Calibri Light"/>
         </w:rPr>
       </w:pPr>
-      <w:proofErr w:type="spellStart"/>
-      <w:r>
-        <w:rPr>
-          <w:rFonts w:ascii="Calibri Light" w:hAnsi="Calibri Light" w:cs="Calibri Light"/>
-        </w:rPr>
-        <w:t>Router</w:t>
-      </w:r>
-      <w:proofErr w:type="spellEnd"/>
-      <w:r>
-        <w:rPr>
-          <w:rFonts w:ascii="Calibri Light" w:hAnsi="Calibri Light" w:cs="Calibri Light"/>
-        </w:rPr>
-        <w:t>(</w:t>
-      </w:r>
-      <w:proofErr w:type="spellStart"/>
-      <w:r>
-        <w:rPr>
-          <w:rFonts w:ascii="Calibri Light" w:hAnsi="Calibri Light" w:cs="Calibri Light"/>
-        </w:rPr>
-        <w:t>config</w:t>
-      </w:r>
-      <w:proofErr w:type="spellEnd"/>
-      <w:r>
-        <w:rPr>
-          <w:rFonts w:ascii="Calibri Light" w:hAnsi="Calibri Light" w:cs="Calibri Light"/>
-        </w:rPr>
-        <w:t xml:space="preserve">)# ipv6 </w:t>
-      </w:r>
-      <w:proofErr w:type="spellStart"/>
-      <w:r>
-        <w:rPr>
-          <w:rFonts w:ascii="Calibri Light" w:hAnsi="Calibri Light" w:cs="Calibri Light"/>
-        </w:rPr>
-        <w:t>router</w:t>
-      </w:r>
-      <w:proofErr w:type="spellEnd"/>
-      <w:r>
-        <w:rPr>
-          <w:rFonts w:ascii="Calibri Light" w:hAnsi="Calibri Light" w:cs="Calibri Light"/>
-        </w:rPr>
-        <w:t xml:space="preserve"> </w:t>
-      </w:r>
-      <w:proofErr w:type="spellStart"/>
-      <w:r>
-        <w:rPr>
-          <w:rFonts w:ascii="Calibri Light" w:hAnsi="Calibri Light" w:cs="Calibri Light"/>
-        </w:rPr>
-        <w:t>ospf</w:t>
-      </w:r>
-      <w:proofErr w:type="spellEnd"/>
-      <w:r>
-        <w:rPr>
-          <w:rFonts w:ascii="Calibri Light" w:hAnsi="Calibri Light" w:cs="Calibri Light"/>
-        </w:rPr>
-        <w:t xml:space="preserve"> 1</w:t>
+      <w:r>
+        <w:rPr>
+          <w:rFonts w:ascii="Calibri Light" w:hAnsi="Calibri Light" w:cs="Calibri Light"/>
+        </w:rPr>
+        <w:t>Router(config)# ipv6 router ospf 1</w:t>
       </w:r>
     </w:p>
     <w:p>
@@ -5753,32 +4277,7 @@
           <w:rFonts w:ascii="Calibri Light" w:hAnsi="Calibri Light" w:cs="Calibri Light"/>
           <w:lang w:val="en-GB"/>
         </w:rPr>
-        <w:t>Router(config-</w:t>
-      </w:r>
-      <w:proofErr w:type="spellStart"/>
-      <w:proofErr w:type="gramStart"/>
-      <w:r>
-        <w:rPr>
-          <w:rFonts w:ascii="Calibri Light" w:hAnsi="Calibri Light" w:cs="Calibri Light"/>
-          <w:lang w:val="en-GB"/>
-        </w:rPr>
-        <w:t>rtr</w:t>
-      </w:r>
-      <w:proofErr w:type="spellEnd"/>
-      <w:r>
-        <w:rPr>
-          <w:rFonts w:ascii="Calibri Light" w:hAnsi="Calibri Light" w:cs="Calibri Light"/>
-          <w:lang w:val="en-GB"/>
-        </w:rPr>
-        <w:t>)#</w:t>
-      </w:r>
-      <w:proofErr w:type="gramEnd"/>
-      <w:r>
-        <w:rPr>
-          <w:rFonts w:ascii="Calibri Light" w:hAnsi="Calibri Light" w:cs="Calibri Light"/>
-          <w:lang w:val="en-GB"/>
-        </w:rPr>
-        <w:t xml:space="preserve"> router-id 1.1.1.1</w:t>
+        <w:t>Router(config-rtr)# router-id 1.1.1.1</w:t>
       </w:r>
     </w:p>
     <w:p>
@@ -5809,39 +4308,7 @@
           <w:rFonts w:ascii="Calibri Light" w:hAnsi="Calibri Light" w:cs="Calibri Light"/>
           <w:lang w:val="en-GB"/>
         </w:rPr>
-        <w:t>Router(config-</w:t>
-      </w:r>
-      <w:proofErr w:type="gramStart"/>
-      <w:r>
-        <w:rPr>
-          <w:rFonts w:ascii="Calibri Light" w:hAnsi="Calibri Light" w:cs="Calibri Light"/>
-          <w:lang w:val="en-GB"/>
-        </w:rPr>
-        <w:t>if)#</w:t>
-      </w:r>
-      <w:proofErr w:type="gramEnd"/>
-      <w:r>
-        <w:rPr>
-          <w:rFonts w:ascii="Calibri Light" w:hAnsi="Calibri Light" w:cs="Calibri Light"/>
-          <w:lang w:val="en-GB"/>
-        </w:rPr>
-        <w:t xml:space="preserve"> ipv6 </w:t>
-      </w:r>
-      <w:proofErr w:type="spellStart"/>
-      <w:r>
-        <w:rPr>
-          <w:rFonts w:ascii="Calibri Light" w:hAnsi="Calibri Light" w:cs="Calibri Light"/>
-          <w:lang w:val="en-GB"/>
-        </w:rPr>
-        <w:t>ospf</w:t>
-      </w:r>
-      <w:proofErr w:type="spellEnd"/>
-      <w:r>
-        <w:rPr>
-          <w:rFonts w:ascii="Calibri Light" w:hAnsi="Calibri Light" w:cs="Calibri Light"/>
-          <w:lang w:val="en-GB"/>
-        </w:rPr>
-        <w:t xml:space="preserve"> 1 area 0</w:t>
+        <w:t>Router(config-if)# ipv6 ospf 1 area 0</w:t>
       </w:r>
     </w:p>
     <w:p>
@@ -5906,35 +4373,7 @@
         <w:rPr>
           <w:rFonts w:ascii="Calibri Light" w:hAnsi="Calibri Light" w:cs="Calibri Light"/>
         </w:rPr>
-        <w:t xml:space="preserve"> El comando show ipv6 </w:t>
-      </w:r>
-      <w:proofErr w:type="spellStart"/>
-      <w:r>
-        <w:rPr>
-          <w:rFonts w:ascii="Calibri Light" w:hAnsi="Calibri Light" w:cs="Calibri Light"/>
-        </w:rPr>
-        <w:t>ospf</w:t>
-      </w:r>
-      <w:proofErr w:type="spellEnd"/>
-      <w:r>
-        <w:rPr>
-          <w:rFonts w:ascii="Calibri Light" w:hAnsi="Calibri Light" w:cs="Calibri Light"/>
-        </w:rPr>
-        <w:t xml:space="preserve"> </w:t>
-      </w:r>
-      <w:proofErr w:type="spellStart"/>
-      <w:r>
-        <w:rPr>
-          <w:rFonts w:ascii="Calibri Light" w:hAnsi="Calibri Light" w:cs="Calibri Light"/>
-        </w:rPr>
-        <w:t>neighbor</w:t>
-      </w:r>
-      <w:proofErr w:type="spellEnd"/>
-      <w:r>
-        <w:rPr>
-          <w:rFonts w:ascii="Calibri Light" w:hAnsi="Calibri Light" w:cs="Calibri Light"/>
-        </w:rPr>
-        <w:t xml:space="preserve"> confirmó el estado </w:t>
+        <w:t xml:space="preserve"> El comando show ipv6 ospf neighbor confirmó el estado </w:t>
       </w:r>
       <w:r>
         <w:rPr>
@@ -5948,21 +4387,7 @@
         <w:rPr>
           <w:rFonts w:ascii="Calibri Light" w:hAnsi="Calibri Light" w:cs="Calibri Light"/>
         </w:rPr>
-        <w:t xml:space="preserve"> con los </w:t>
-      </w:r>
-      <w:proofErr w:type="spellStart"/>
-      <w:r>
-        <w:rPr>
-          <w:rFonts w:ascii="Calibri Light" w:hAnsi="Calibri Light" w:cs="Calibri Light"/>
-        </w:rPr>
-        <w:t>routers</w:t>
-      </w:r>
-      <w:proofErr w:type="spellEnd"/>
-      <w:r>
-        <w:rPr>
-          <w:rFonts w:ascii="Calibri Light" w:hAnsi="Calibri Light" w:cs="Calibri Light"/>
-        </w:rPr>
-        <w:t xml:space="preserve"> adyacentes, indicando una sincronización completa de la base de datos de estado de enlace (LSDB).</w:t>
+        <w:t xml:space="preserve"> con los routers adyacentes, indicando una sincronización completa de la base de datos de estado de enlace (LSDB).</w:t>
       </w:r>
     </w:p>
     <w:p>
@@ -5987,151 +4412,755 @@
         <w:rPr>
           <w:rFonts w:ascii="Calibri Light" w:hAnsi="Calibri Light" w:cs="Calibri Light"/>
         </w:rPr>
-        <w:t xml:space="preserve"> Mediante show ipv6 </w:t>
-      </w:r>
-      <w:proofErr w:type="spellStart"/>
-      <w:r>
-        <w:rPr>
-          <w:rFonts w:ascii="Calibri Light" w:hAnsi="Calibri Light" w:cs="Calibri Light"/>
-        </w:rPr>
-        <w:t>route</w:t>
-      </w:r>
-      <w:proofErr w:type="spellEnd"/>
+        <w:t xml:space="preserve"> Mediante show ipv6 route ospf, se evidenció la aparición de rutas remotas con el prefijo </w:t>
+      </w:r>
+      <w:r>
+        <w:rPr>
+          <w:rFonts w:ascii="Calibri Light" w:hAnsi="Calibri Light" w:cs="Calibri Light"/>
+          <w:b/>
+          <w:bCs/>
+        </w:rPr>
+        <w:t>"O"</w:t>
+      </w:r>
+      <w:r>
+        <w:rPr>
+          <w:rFonts w:ascii="Calibri Light" w:hAnsi="Calibri Light" w:cs="Calibri Light"/>
+        </w:rPr>
+        <w:t>. Esto demuestra que el Router 1 ahora conoce la red de la LAN 2 (2001:DB8:CC1A:2::/64) y viceversa.</w:t>
+      </w:r>
+    </w:p>
+    <w:p>
+      <w:pPr>
+        <w:rPr>
+          <w:rFonts w:ascii="Calibri Light" w:hAnsi="Calibri Light" w:cs="Calibri Light"/>
+          <w:b/>
+          <w:bCs/>
+        </w:rPr>
+      </w:pPr>
+      <w:r>
+        <w:rPr>
+          <w:rFonts w:ascii="Calibri Light" w:hAnsi="Calibri Light" w:cs="Calibri Light"/>
+          <w:b/>
+          <w:bCs/>
+        </w:rPr>
+        <w:t>Prueba de Conectividad Extremo a Extremo</w:t>
+      </w:r>
+    </w:p>
+    <w:p>
+      <w:pPr>
+        <w:rPr>
+          <w:rFonts w:ascii="Calibri Light" w:hAnsi="Calibri Light" w:cs="Calibri Light"/>
+        </w:rPr>
+      </w:pPr>
+      <w:r>
+        <w:rPr>
+          <w:rFonts w:ascii="Calibri Light" w:hAnsi="Calibri Light" w:cs="Calibri Light"/>
+        </w:rPr>
+        <w:t xml:space="preserve">Como validación final, se realizó una prueba de </w:t>
+      </w:r>
+      <w:r>
+        <w:rPr>
+          <w:rFonts w:ascii="Calibri Light" w:hAnsi="Calibri Light" w:cs="Calibri Light"/>
+          <w:b/>
+          <w:bCs/>
+        </w:rPr>
+        <w:t>Ping</w:t>
+      </w:r>
+      <w:r>
+        <w:rPr>
+          <w:rFonts w:ascii="Calibri Light" w:hAnsi="Calibri Light" w:cs="Calibri Light"/>
+        </w:rPr>
+        <w:t xml:space="preserve"> y </w:t>
+      </w:r>
+      <w:r>
+        <w:rPr>
+          <w:rFonts w:ascii="Calibri Light" w:hAnsi="Calibri Light" w:cs="Calibri Light"/>
+          <w:b/>
+          <w:bCs/>
+        </w:rPr>
+        <w:t>Traceroute</w:t>
+      </w:r>
+      <w:r>
+        <w:rPr>
+          <w:rFonts w:ascii="Calibri Light" w:hAnsi="Calibri Light" w:cs="Calibri Light"/>
+        </w:rPr>
+        <w:t xml:space="preserve"> desde el PC00 hacia la dirección Global Unicast del PC02. El éxito de estas pruebas confirma que el plano de datos está correctamente direccionado y que el protocolo de enrutamiento dinámico ha seleccionado la ruta óptima a través de la red.</w:t>
+      </w:r>
+    </w:p>
+    <w:p>
+      <w:pPr>
+        <w:rPr>
+          <w:rFonts w:ascii="Calibri Light" w:hAnsi="Calibri Light" w:cs="Calibri Light"/>
+          <w:b/>
+          <w:bCs/>
+        </w:rPr>
+      </w:pPr>
+      <w:r>
+        <w:rPr>
+          <w:rFonts w:ascii="Calibri Light" w:hAnsi="Calibri Light" w:cs="Calibri Light"/>
+        </w:rPr>
+        <w:br/>
+      </w:r>
+      <w:r>
+        <w:rPr>
+          <w:rFonts w:ascii="Calibri Light" w:hAnsi="Calibri Light" w:cs="Calibri Light"/>
+          <w:b/>
+          <w:bCs/>
+        </w:rPr>
+        <w:t>Análisis de Intercambio de Mensajes ICMPv6</w:t>
+      </w:r>
+    </w:p>
+    <w:p>
+      <w:pPr>
+        <w:rPr>
+          <w:rFonts w:ascii="Calibri Light" w:hAnsi="Calibri Light" w:cs="Calibri Light"/>
+        </w:rPr>
+      </w:pPr>
+      <w:r>
+        <w:rPr>
+          <w:rFonts w:ascii="Calibri Light" w:hAnsi="Calibri Light" w:cs="Calibri Light"/>
+        </w:rPr>
+        <w:t xml:space="preserve">Debido a la saturación del buffer en el modo simulación (causada por el tráfico constante de OSPFv3), se procedió a verificar el éxito de los procesos </w:t>
+      </w:r>
+      <w:r>
+        <w:rPr>
+          <w:rFonts w:ascii="Calibri Light" w:hAnsi="Calibri Light" w:cs="Calibri Light"/>
+          <w:b/>
+          <w:bCs/>
+        </w:rPr>
+        <w:t>SLAAC</w:t>
+      </w:r>
+      <w:r>
+        <w:rPr>
+          <w:rFonts w:ascii="Calibri Light" w:hAnsi="Calibri Light" w:cs="Calibri Light"/>
+        </w:rPr>
+        <w:t xml:space="preserve"> y </w:t>
+      </w:r>
+      <w:r>
+        <w:rPr>
+          <w:rFonts w:ascii="Calibri Light" w:hAnsi="Calibri Light" w:cs="Calibri Light"/>
+          <w:b/>
+          <w:bCs/>
+        </w:rPr>
+        <w:t>NDP (Neighbor Discovery Protocol)</w:t>
+      </w:r>
+      <w:r>
+        <w:rPr>
+          <w:rFonts w:ascii="Calibri Light" w:hAnsi="Calibri Light" w:cs="Calibri Light"/>
+        </w:rPr>
+        <w:t xml:space="preserve"> mediante la inspección directa de la tabla de vecinos en el router.</w:t>
+      </w:r>
+    </w:p>
+    <w:p>
+      <w:pPr>
+        <w:rPr>
+          <w:rFonts w:ascii="Calibri Light" w:hAnsi="Calibri Light" w:cs="Calibri Light"/>
+        </w:rPr>
+      </w:pPr>
+      <w:r>
+        <w:rPr>
+          <w:rFonts w:ascii="Calibri Light" w:hAnsi="Calibri Light" w:cs="Calibri Light"/>
+        </w:rPr>
+        <w:t xml:space="preserve">El comando show ipv6 neighbors revela una entrada en estado </w:t>
+      </w:r>
+      <w:r>
+        <w:rPr>
+          <w:rFonts w:ascii="Calibri Light" w:hAnsi="Calibri Light" w:cs="Calibri Light"/>
+          <w:b/>
+          <w:bCs/>
+        </w:rPr>
+        <w:t>REACH</w:t>
+      </w:r>
+      <w:r>
+        <w:rPr>
+          <w:rFonts w:ascii="Calibri Light" w:hAnsi="Calibri Light" w:cs="Calibri Light"/>
+        </w:rPr>
+        <w:t xml:space="preserve"> para la dirección link-local a través de la interfaz GigabitEthernet0/2/0. Esta es una evidencia técnica contundente de que el intercambio de mensajes ocurrió de la siguiente manera:</w:t>
+      </w:r>
+    </w:p>
+    <w:p>
+      <w:pPr>
+        <w:numPr>
+          <w:ilvl w:val="0"/>
+          <w:numId w:val="8"/>
+        </w:numPr>
+        <w:rPr>
+          <w:rFonts w:ascii="Calibri Light" w:hAnsi="Calibri Light" w:cs="Calibri Light"/>
+        </w:rPr>
+      </w:pPr>
+      <w:r>
+        <w:rPr>
+          <w:rFonts w:ascii="Calibri Light" w:hAnsi="Calibri Light" w:cs="Calibri Light"/>
+          <w:b/>
+          <w:bCs/>
+        </w:rPr>
+        <w:t>Router Solicitation (RS):</w:t>
+      </w:r>
+      <w:r>
+        <w:rPr>
+          <w:rFonts w:ascii="Calibri Light" w:hAnsi="Calibri Light" w:cs="Calibri Light"/>
+        </w:rPr>
+        <w:t xml:space="preserve"> El host envió un mensaje al grupo multicast </w:t>
+      </w:r>
+      <w:r>
+        <w:rPr>
+          <w:rFonts w:ascii="Calibri Light" w:hAnsi="Calibri Light" w:cs="Calibri Light"/>
+          <w:b/>
+          <w:bCs/>
+        </w:rPr>
+        <w:t>FF02::2</w:t>
+      </w:r>
+      <w:r>
+        <w:rPr>
+          <w:rFonts w:ascii="Calibri Light" w:hAnsi="Calibri Light" w:cs="Calibri Light"/>
+        </w:rPr>
+        <w:t xml:space="preserve">. Se utiliza esta dirección específica de </w:t>
+      </w:r>
+      <w:r>
+        <w:rPr>
+          <w:rFonts w:ascii="Calibri Light" w:hAnsi="Calibri Light" w:cs="Calibri Light"/>
+          <w:b/>
+          <w:bCs/>
+        </w:rPr>
+        <w:t>"Todos los Routers"</w:t>
+      </w:r>
+      <w:r>
+        <w:rPr>
+          <w:rFonts w:ascii="Calibri Light" w:hAnsi="Calibri Light" w:cs="Calibri Light"/>
+        </w:rPr>
+        <w:t xml:space="preserve"> para que el host descubra su gateway de forma agnóstica y eficiente, sin recurrir al broadcast.</w:t>
+      </w:r>
+    </w:p>
+    <w:p>
+      <w:pPr>
+        <w:numPr>
+          <w:ilvl w:val="0"/>
+          <w:numId w:val="8"/>
+        </w:numPr>
+        <w:rPr>
+          <w:rFonts w:ascii="Calibri Light" w:hAnsi="Calibri Light" w:cs="Calibri Light"/>
+        </w:rPr>
+      </w:pPr>
+      <w:r>
+        <w:rPr>
+          <w:rFonts w:ascii="Calibri Light" w:hAnsi="Calibri Light" w:cs="Calibri Light"/>
+          <w:b/>
+          <w:bCs/>
+        </w:rPr>
+        <w:t>Router Advertisement (RA):</w:t>
+      </w:r>
+      <w:r>
+        <w:rPr>
+          <w:rFonts w:ascii="Calibri Light" w:hAnsi="Calibri Light" w:cs="Calibri Light"/>
+        </w:rPr>
+        <w:t xml:space="preserve"> El router respondió al host con los parámetros de red (prefijo 2001:DB8:CC1A::/64 y longitud), permitiendo la autoconfiguración del direccionamiento global.</w:t>
+      </w:r>
+    </w:p>
+    <w:p>
+      <w:pPr>
+        <w:numPr>
+          <w:ilvl w:val="0"/>
+          <w:numId w:val="8"/>
+        </w:numPr>
+        <w:rPr>
+          <w:rFonts w:ascii="Calibri Light" w:hAnsi="Calibri Light" w:cs="Calibri Light"/>
+        </w:rPr>
+      </w:pPr>
+      <w:r>
+        <w:rPr>
+          <w:rFonts w:ascii="Calibri Light" w:hAnsi="Calibri Light" w:cs="Calibri Light"/>
+          <w:b/>
+          <w:bCs/>
+        </w:rPr>
+        <w:t>Neighbor Solicitation / Advertisement (NS/NA):</w:t>
+      </w:r>
+      <w:r>
+        <w:rPr>
+          <w:rFonts w:ascii="Calibri Light" w:hAnsi="Calibri Light" w:cs="Calibri Light"/>
+        </w:rPr>
+        <w:t xml:space="preserve"> Se completó la resolución de direcciones de Capa 2, permitiendo que ambos dispositivos sincronicen sus direcciones físicas (MAC) y lógicas (IPv6).</w:t>
+      </w:r>
+    </w:p>
+    <w:p>
+      <w:pPr>
+        <w:rPr>
+          <w:rFonts w:ascii="Calibri Light" w:hAnsi="Calibri Light" w:cs="Calibri Light"/>
+        </w:rPr>
+      </w:pPr>
+      <w:r>
+        <w:rPr>
+          <w:rFonts w:ascii="Calibri Light" w:hAnsi="Calibri Light" w:cs="Calibri Light"/>
+        </w:rPr>
+        <w:lastRenderedPageBreak/>
+        <w:t xml:space="preserve">Este mecanismo reemplaza por completo la dependencia de servidores DHCPv6 y del protocolo ARP (usado en IPv4). Al utilizar mensajes ICMPv6 basados en </w:t>
+      </w:r>
+      <w:r>
+        <w:rPr>
+          <w:rFonts w:ascii="Calibri Light" w:hAnsi="Calibri Light" w:cs="Calibri Light"/>
+          <w:b/>
+          <w:bCs/>
+        </w:rPr>
+        <w:t>multicast</w:t>
+      </w:r>
+      <w:r>
+        <w:rPr>
+          <w:rFonts w:ascii="Calibri Light" w:hAnsi="Calibri Light" w:cs="Calibri Light"/>
+        </w:rPr>
+        <w:t>, la red es más eficiente, ya que solo los nodos interesados procesan las solicitudes, optimizando el rendimiento general del enlac</w:t>
+      </w:r>
+      <w:r>
+        <w:rPr>
+          <w:rFonts w:ascii="Calibri Light" w:hAnsi="Calibri Light" w:cs="Calibri Light"/>
+        </w:rPr>
+        <w:t>e</w:t>
+      </w:r>
+    </w:p>
+    <w:p>
+      <w:pPr>
+        <w:rPr>
+          <w:rFonts w:ascii="Calibri Light" w:hAnsi="Calibri Light" w:cs="Calibri Light"/>
+        </w:rPr>
+      </w:pPr>
+      <w:r>
+        <w:rPr>
+          <w:noProof/>
+        </w:rPr>
+        <w:drawing>
+          <wp:inline distT="0" distB="0" distL="0" distR="0" wp14:anchorId="204709E2" wp14:editId="2D75A82C">
+            <wp:extent cx="5612130" cy="2402840"/>
+            <wp:effectExtent l="0" t="0" r="7620" b="0"/>
+            <wp:docPr id="285844765" name="Imagen 1"/>
+            <wp:cNvGraphicFramePr>
+              <a:graphicFrameLocks xmlns:a="http://schemas.openxmlformats.org/drawingml/2006/main" noChangeAspect="1"/>
+            </wp:cNvGraphicFramePr>
+            <a:graphic xmlns:a="http://schemas.openxmlformats.org/drawingml/2006/main">
+              <a:graphicData uri="http://schemas.openxmlformats.org/drawingml/2006/picture">
+                <pic:pic xmlns:pic="http://schemas.openxmlformats.org/drawingml/2006/picture">
+                  <pic:nvPicPr>
+                    <pic:cNvPr id="285844765" name=""/>
+                    <pic:cNvPicPr/>
+                  </pic:nvPicPr>
+                  <pic:blipFill>
+                    <a:blip r:embed="rId21"/>
+                    <a:stretch>
+                      <a:fillRect/>
+                    </a:stretch>
+                  </pic:blipFill>
+                  <pic:spPr>
+                    <a:xfrm>
+                      <a:off x="0" y="0"/>
+                      <a:ext cx="5612130" cy="2402840"/>
+                    </a:xfrm>
+                    <a:prstGeom prst="rect">
+                      <a:avLst/>
+                    </a:prstGeom>
+                  </pic:spPr>
+                </pic:pic>
+              </a:graphicData>
+            </a:graphic>
+          </wp:inline>
+        </w:drawing>
+      </w:r>
+    </w:p>
+    <w:p>
+      <w:pPr>
+        <w:rPr>
+          <w:rFonts w:ascii="Calibri Light" w:hAnsi="Calibri Light" w:cs="Calibri Light"/>
+        </w:rPr>
+      </w:pPr>
+      <w:r>
+        <w:rPr>
+          <w:rFonts w:ascii="Calibri Light" w:hAnsi="Calibri Light" w:cs="Calibri Light"/>
+        </w:rPr>
+        <w:drawing>
+          <wp:inline distT="0" distB="0" distL="0" distR="0" wp14:anchorId="5FA47B76" wp14:editId="517FA152">
+            <wp:extent cx="1638300" cy="848123"/>
+            <wp:effectExtent l="0" t="0" r="0" b="9525"/>
+            <wp:docPr id="836407836" name="Imagen 1"/>
+            <wp:cNvGraphicFramePr>
+              <a:graphicFrameLocks xmlns:a="http://schemas.openxmlformats.org/drawingml/2006/main" noChangeAspect="1"/>
+            </wp:cNvGraphicFramePr>
+            <a:graphic xmlns:a="http://schemas.openxmlformats.org/drawingml/2006/main">
+              <a:graphicData uri="http://schemas.openxmlformats.org/drawingml/2006/picture">
+                <pic:pic xmlns:pic="http://schemas.openxmlformats.org/drawingml/2006/picture">
+                  <pic:nvPicPr>
+                    <pic:cNvPr id="836407836" name=""/>
+                    <pic:cNvPicPr/>
+                  </pic:nvPicPr>
+                  <pic:blipFill>
+                    <a:blip r:embed="rId22"/>
+                    <a:stretch>
+                      <a:fillRect/>
+                    </a:stretch>
+                  </pic:blipFill>
+                  <pic:spPr>
+                    <a:xfrm>
+                      <a:off x="0" y="0"/>
+                      <a:ext cx="1654860" cy="856696"/>
+                    </a:xfrm>
+                    <a:prstGeom prst="rect">
+                      <a:avLst/>
+                    </a:prstGeom>
+                  </pic:spPr>
+                </pic:pic>
+              </a:graphicData>
+            </a:graphic>
+          </wp:inline>
+        </w:drawing>
+      </w:r>
       <w:r>
         <w:rPr>
           <w:rFonts w:ascii="Calibri Light" w:hAnsi="Calibri Light" w:cs="Calibri Light"/>
         </w:rPr>
         <w:t xml:space="preserve"> </w:t>
       </w:r>
-      <w:proofErr w:type="spellStart"/>
-      <w:r>
-        <w:rPr>
-          <w:rFonts w:ascii="Calibri Light" w:hAnsi="Calibri Light" w:cs="Calibri Light"/>
-        </w:rPr>
-        <w:t>ospf</w:t>
-      </w:r>
-      <w:proofErr w:type="spellEnd"/>
-      <w:r>
-        <w:rPr>
-          <w:rFonts w:ascii="Calibri Light" w:hAnsi="Calibri Light" w:cs="Calibri Light"/>
-        </w:rPr>
-        <w:t xml:space="preserve">, se evidenció la aparición de rutas remotas con el prefijo </w:t>
-      </w:r>
-      <w:r>
-        <w:rPr>
-          <w:rFonts w:ascii="Calibri Light" w:hAnsi="Calibri Light" w:cs="Calibri Light"/>
-          <w:b/>
-          <w:bCs/>
-        </w:rPr>
-        <w:t>"O"</w:t>
-      </w:r>
-      <w:r>
-        <w:rPr>
-          <w:rFonts w:ascii="Calibri Light" w:hAnsi="Calibri Light" w:cs="Calibri Light"/>
-        </w:rPr>
-        <w:t xml:space="preserve">. Esto demuestra que el </w:t>
-      </w:r>
-      <w:proofErr w:type="spellStart"/>
-      <w:r>
-        <w:rPr>
-          <w:rFonts w:ascii="Calibri Light" w:hAnsi="Calibri Light" w:cs="Calibri Light"/>
-        </w:rPr>
-        <w:t>Router</w:t>
-      </w:r>
-      <w:proofErr w:type="spellEnd"/>
-      <w:r>
-        <w:rPr>
-          <w:rFonts w:ascii="Calibri Light" w:hAnsi="Calibri Light" w:cs="Calibri Light"/>
-        </w:rPr>
-        <w:t xml:space="preserve"> 1 ahora conoce la red de la LAN 2 (</w:t>
-      </w:r>
-      <w:proofErr w:type="gramStart"/>
-      <w:r>
-        <w:rPr>
-          <w:rFonts w:ascii="Calibri Light" w:hAnsi="Calibri Light" w:cs="Calibri Light"/>
-        </w:rPr>
-        <w:t>2001:DB8:CC1A</w:t>
-      </w:r>
-      <w:proofErr w:type="gramEnd"/>
-      <w:r>
-        <w:rPr>
-          <w:rFonts w:ascii="Calibri Light" w:hAnsi="Calibri Light" w:cs="Calibri Light"/>
-        </w:rPr>
-        <w:t>:2::/64) y viceversa.</w:t>
-      </w:r>
-    </w:p>
-    <w:p>
-      <w:pPr>
-        <w:rPr>
-          <w:rFonts w:ascii="Calibri Light" w:hAnsi="Calibri Light" w:cs="Calibri Light"/>
-          <w:b/>
-          <w:bCs/>
-        </w:rPr>
-      </w:pPr>
-      <w:r>
-        <w:rPr>
-          <w:rFonts w:ascii="Calibri Light" w:hAnsi="Calibri Light" w:cs="Calibri Light"/>
-          <w:b/>
-          <w:bCs/>
-        </w:rPr>
-        <w:t>Prueba de Conectividad Extremo a Extremo</w:t>
-      </w:r>
-    </w:p>
-    <w:p>
-      <w:pPr>
-        <w:rPr>
-          <w:rFonts w:ascii="Calibri Light" w:hAnsi="Calibri Light" w:cs="Calibri Light"/>
-        </w:rPr>
-      </w:pPr>
-      <w:r>
-        <w:rPr>
-          <w:rFonts w:ascii="Calibri Light" w:hAnsi="Calibri Light" w:cs="Calibri Light"/>
-        </w:rPr>
-        <w:t xml:space="preserve">Como validación final, se realizó una prueba de </w:t>
-      </w:r>
-      <w:r>
-        <w:rPr>
-          <w:rFonts w:ascii="Calibri Light" w:hAnsi="Calibri Light" w:cs="Calibri Light"/>
-          <w:b/>
-          <w:bCs/>
-        </w:rPr>
-        <w:t>Ping</w:t>
-      </w:r>
-      <w:r>
-        <w:rPr>
-          <w:rFonts w:ascii="Calibri Light" w:hAnsi="Calibri Light" w:cs="Calibri Light"/>
-        </w:rPr>
-        <w:t xml:space="preserve"> y </w:t>
-      </w:r>
-      <w:proofErr w:type="spellStart"/>
-      <w:r>
-        <w:rPr>
-          <w:rFonts w:ascii="Calibri Light" w:hAnsi="Calibri Light" w:cs="Calibri Light"/>
-          <w:b/>
-          <w:bCs/>
-        </w:rPr>
-        <w:t>Traceroute</w:t>
-      </w:r>
-      <w:proofErr w:type="spellEnd"/>
-      <w:r>
-        <w:rPr>
-          <w:rFonts w:ascii="Calibri Light" w:hAnsi="Calibri Light" w:cs="Calibri Light"/>
-        </w:rPr>
-        <w:t xml:space="preserve"> desde el PC00 hacia la dirección Global </w:t>
-      </w:r>
-      <w:proofErr w:type="spellStart"/>
-      <w:r>
-        <w:rPr>
-          <w:rFonts w:ascii="Calibri Light" w:hAnsi="Calibri Light" w:cs="Calibri Light"/>
-        </w:rPr>
-        <w:t>Unicast</w:t>
-      </w:r>
-      <w:proofErr w:type="spellEnd"/>
-      <w:r>
-        <w:rPr>
-          <w:rFonts w:ascii="Calibri Light" w:hAnsi="Calibri Light" w:cs="Calibri Light"/>
-        </w:rPr>
-        <w:t xml:space="preserve"> del PC02. El éxito de estas pruebas confirma que el plano de datos está correctamente direccionado y que el protocolo de enrutamiento dinámico ha seleccionado la ruta óptima a través de la red.</w:t>
+    </w:p>
+    <w:p>
+      <w:pPr>
+        <w:rPr>
+          <w:rFonts w:ascii="Calibri Light" w:hAnsi="Calibri Light" w:cs="Calibri Light"/>
+        </w:rPr>
+      </w:pPr>
+      <w:r>
+        <w:rPr>
+          <w:rFonts w:ascii="Calibri Light" w:hAnsi="Calibri Light" w:cs="Calibri Light"/>
+        </w:rPr>
+        <w:drawing>
+          <wp:inline distT="0" distB="0" distL="0" distR="0" wp14:anchorId="55E566FC" wp14:editId="73DE1502">
+            <wp:extent cx="2205699" cy="1973580"/>
+            <wp:effectExtent l="0" t="0" r="4445" b="7620"/>
+            <wp:docPr id="785763357" name="Imagen 1"/>
+            <wp:cNvGraphicFramePr>
+              <a:graphicFrameLocks xmlns:a="http://schemas.openxmlformats.org/drawingml/2006/main" noChangeAspect="1"/>
+            </wp:cNvGraphicFramePr>
+            <a:graphic xmlns:a="http://schemas.openxmlformats.org/drawingml/2006/main">
+              <a:graphicData uri="http://schemas.openxmlformats.org/drawingml/2006/picture">
+                <pic:pic xmlns:pic="http://schemas.openxmlformats.org/drawingml/2006/picture">
+                  <pic:nvPicPr>
+                    <pic:cNvPr id="785763357" name=""/>
+                    <pic:cNvPicPr/>
+                  </pic:nvPicPr>
+                  <pic:blipFill rotWithShape="1">
+                    <a:blip r:embed="rId23"/>
+                    <a:srcRect t="23317" b="20234"/>
+                    <a:stretch>
+                      <a:fillRect/>
+                    </a:stretch>
+                  </pic:blipFill>
+                  <pic:spPr bwMode="auto">
+                    <a:xfrm>
+                      <a:off x="0" y="0"/>
+                      <a:ext cx="2220117" cy="1986481"/>
+                    </a:xfrm>
+                    <a:prstGeom prst="rect">
+                      <a:avLst/>
+                    </a:prstGeom>
+                    <a:ln>
+                      <a:noFill/>
+                    </a:ln>
+                    <a:extLst>
+                      <a:ext uri="{53640926-AAD7-44D8-BBD7-CCE9431645EC}">
+                        <a14:shadowObscured xmlns:a14="http://schemas.microsoft.com/office/drawing/2010/main"/>
+                      </a:ext>
+                    </a:extLst>
+                  </pic:spPr>
+                </pic:pic>
+              </a:graphicData>
+            </a:graphic>
+          </wp:inline>
+        </w:drawing>
+      </w:r>
+    </w:p>
+    <w:p>
+      <w:pPr>
+        <w:rPr>
+          <w:rFonts w:ascii="Calibri Light" w:hAnsi="Calibri Light" w:cs="Calibri Light"/>
+        </w:rPr>
+      </w:pPr>
+    </w:p>
+    <w:p>
+      <w:pPr>
+        <w:rPr>
+          <w:rFonts w:ascii="Calibri Light" w:hAnsi="Calibri Light" w:cs="Calibri Light"/>
+          <w:b/>
+          <w:bCs/>
+        </w:rPr>
+      </w:pPr>
+      <w:r>
+        <w:rPr>
+          <w:rFonts w:ascii="Calibri Light" w:hAnsi="Calibri Light" w:cs="Calibri Light"/>
+          <w:b/>
+          <w:bCs/>
+        </w:rPr>
+        <w:t>Preguntas de Reflexión y Conclusiones</w:t>
+      </w:r>
+    </w:p>
+    <w:p>
+      <w:pPr>
+        <w:rPr>
+          <w:rFonts w:ascii="Calibri Light" w:hAnsi="Calibri Light" w:cs="Calibri Light"/>
+          <w:b/>
+          <w:bCs/>
+        </w:rPr>
+      </w:pPr>
+      <w:r>
+        <w:rPr>
+          <w:rFonts w:ascii="Calibri Light" w:hAnsi="Calibri Light" w:cs="Calibri Light"/>
+          <w:b/>
+          <w:bCs/>
+        </w:rPr>
+        <w:t>1. ¿Por qué en IPv6 no es estrictamente necesario un servidor DHCP para asignar direcciones?</w:t>
+      </w:r>
+    </w:p>
+    <w:p>
+      <w:pPr>
+        <w:rPr>
+          <w:rFonts w:ascii="Calibri Light" w:hAnsi="Calibri Light" w:cs="Calibri Light"/>
+        </w:rPr>
+      </w:pPr>
+      <w:r>
+        <w:rPr>
+          <w:rFonts w:ascii="Calibri Light" w:hAnsi="Calibri Light" w:cs="Calibri Light"/>
+        </w:rPr>
+        <w:t xml:space="preserve">En IPv6 se utiliza el mecanismo </w:t>
+      </w:r>
+      <w:r>
+        <w:rPr>
+          <w:rFonts w:ascii="Calibri Light" w:hAnsi="Calibri Light" w:cs="Calibri Light"/>
+          <w:b/>
+          <w:bCs/>
+        </w:rPr>
+        <w:t>SLAAC (Stateless Address Autoconfiguration)</w:t>
+      </w:r>
+      <w:r>
+        <w:rPr>
+          <w:rFonts w:ascii="Calibri Light" w:hAnsi="Calibri Light" w:cs="Calibri Light"/>
+        </w:rPr>
+        <w:t xml:space="preserve">. Gracias a los mensajes ICMPv6 de tipo </w:t>
+      </w:r>
+      <w:r>
+        <w:rPr>
+          <w:rFonts w:ascii="Calibri Light" w:hAnsi="Calibri Light" w:cs="Calibri Light"/>
+          <w:b/>
+          <w:bCs/>
+        </w:rPr>
+        <w:t>Router Advertisement (RA)</w:t>
+      </w:r>
+      <w:r>
+        <w:rPr>
+          <w:rFonts w:ascii="Calibri Light" w:hAnsi="Calibri Light" w:cs="Calibri Light"/>
+        </w:rPr>
+        <w:t>, el router anuncia el prefijo de red y la longitud a todos los hosts. Los dispositivos finales toman ese prefijo y generan su propia interfaz ID (usando EUI-64 o identificadores aleatorios), logrando una configuración automática y única sin necesidad de un servidor que mantenga un registro de estados (Stateless).</w:t>
+      </w:r>
+    </w:p>
+    <w:p>
+      <w:pPr>
+        <w:rPr>
+          <w:rFonts w:ascii="Calibri Light" w:hAnsi="Calibri Light" w:cs="Calibri Light"/>
+          <w:b/>
+          <w:bCs/>
+        </w:rPr>
+      </w:pPr>
+      <w:r>
+        <w:rPr>
+          <w:rFonts w:ascii="Calibri Light" w:hAnsi="Calibri Light" w:cs="Calibri Light"/>
+          <w:b/>
+          <w:bCs/>
+        </w:rPr>
+        <w:lastRenderedPageBreak/>
+        <w:t>2. ¿Cuál es la función de la dirección Link-Local (FE80::/10) en el enrutamiento dinámico?</w:t>
+      </w:r>
+    </w:p>
+    <w:p>
+      <w:pPr>
+        <w:rPr>
+          <w:rFonts w:ascii="Calibri Light" w:hAnsi="Calibri Light" w:cs="Calibri Light"/>
+        </w:rPr>
+      </w:pPr>
+      <w:r>
+        <w:rPr>
+          <w:rFonts w:ascii="Calibri Light" w:hAnsi="Calibri Light" w:cs="Calibri Light"/>
+        </w:rPr>
+        <w:t xml:space="preserve">Durante la configuración de </w:t>
+      </w:r>
+      <w:r>
+        <w:rPr>
+          <w:rFonts w:ascii="Calibri Light" w:hAnsi="Calibri Light" w:cs="Calibri Light"/>
+          <w:b/>
+          <w:bCs/>
+        </w:rPr>
+        <w:t>OSPFv3</w:t>
+      </w:r>
+      <w:r>
+        <w:rPr>
+          <w:rFonts w:ascii="Calibri Light" w:hAnsi="Calibri Light" w:cs="Calibri Light"/>
+        </w:rPr>
+        <w:t xml:space="preserve">, observamos que las adyacencias entre routers se forman utilizando las direcciones </w:t>
+      </w:r>
+      <w:r>
+        <w:rPr>
+          <w:rFonts w:ascii="Calibri Light" w:hAnsi="Calibri Light" w:cs="Calibri Light"/>
+          <w:b/>
+          <w:bCs/>
+        </w:rPr>
+        <w:t>Link-Local</w:t>
+      </w:r>
+      <w:r>
+        <w:rPr>
+          <w:rFonts w:ascii="Calibri Light" w:hAnsi="Calibri Light" w:cs="Calibri Light"/>
+        </w:rPr>
+        <w:t>. Su función es vital porque permite que los protocolos de enrutamiento intercambien actualizaciones de red dentro de un mismo segmento físico, incluso si las direcciones Global Unicast cambian o no están configuradas. Esto independiza el plano de control del plano de datos global.</w:t>
+      </w:r>
+    </w:p>
+    <w:p>
+      <w:pPr>
+        <w:rPr>
+          <w:rFonts w:ascii="Calibri Light" w:hAnsi="Calibri Light" w:cs="Calibri Light"/>
+          <w:b/>
+          <w:bCs/>
+        </w:rPr>
+      </w:pPr>
+      <w:r>
+        <w:rPr>
+          <w:rFonts w:ascii="Calibri Light" w:hAnsi="Calibri Light" w:cs="Calibri Light"/>
+          <w:b/>
+          <w:bCs/>
+        </w:rPr>
+        <w:t>3. Diferencias observadas entre OSPF (v2) y OSPFv3</w:t>
+      </w:r>
+    </w:p>
+    <w:p>
+      <w:pPr>
+        <w:rPr>
+          <w:rFonts w:ascii="Calibri Light" w:hAnsi="Calibri Light" w:cs="Calibri Light"/>
+        </w:rPr>
+      </w:pPr>
+      <w:r>
+        <w:rPr>
+          <w:rFonts w:ascii="Calibri Light" w:hAnsi="Calibri Light" w:cs="Calibri Light"/>
+        </w:rPr>
+        <w:t xml:space="preserve">La principal diferencia técnica encontrada en este laboratorio es que </w:t>
+      </w:r>
+      <w:r>
+        <w:rPr>
+          <w:rFonts w:ascii="Calibri Light" w:hAnsi="Calibri Light" w:cs="Calibri Light"/>
+          <w:b/>
+          <w:bCs/>
+        </w:rPr>
+        <w:t>OSPFv3 se habilita directamente en la interfaz</w:t>
+      </w:r>
+      <w:r>
+        <w:rPr>
+          <w:rFonts w:ascii="Calibri Light" w:hAnsi="Calibri Light" w:cs="Calibri Light"/>
+        </w:rPr>
+        <w:t xml:space="preserve"> (ipv6 ospf 1 area 0) y no mediante comandos network globales. Además, OSPFv3 requiere la configuración manual de un </w:t>
+      </w:r>
+      <w:r>
+        <w:rPr>
+          <w:rFonts w:ascii="Calibri Light" w:hAnsi="Calibri Light" w:cs="Calibri Light"/>
+          <w:b/>
+          <w:bCs/>
+        </w:rPr>
+        <w:t>Router-ID</w:t>
+      </w:r>
+      <w:r>
+        <w:rPr>
+          <w:rFonts w:ascii="Calibri Light" w:hAnsi="Calibri Light" w:cs="Calibri Light"/>
+        </w:rPr>
+        <w:t xml:space="preserve"> en formato decimal (32 bits), ya que al no existir necesariamente direcciones IPv4 en el equipo, el proceso no puede autoelegir un ID.</w:t>
+      </w:r>
+    </w:p>
+    <w:p>
+      <w:pPr>
+        <w:rPr>
+          <w:rFonts w:ascii="Calibri Light" w:hAnsi="Calibri Light" w:cs="Calibri Light"/>
+          <w:b/>
+          <w:bCs/>
+        </w:rPr>
+      </w:pPr>
+      <w:r>
+        <w:rPr>
+          <w:rFonts w:ascii="Calibri Light" w:hAnsi="Calibri Light" w:cs="Calibri Light"/>
+          <w:b/>
+          <w:bCs/>
+        </w:rPr>
+        <w:t>4. Importancia de eliminar el Broadcast</w:t>
+      </w:r>
+    </w:p>
+    <w:p>
+      <w:pPr>
+        <w:rPr>
+          <w:rFonts w:ascii="Calibri Light" w:hAnsi="Calibri Light" w:cs="Calibri Light"/>
+        </w:rPr>
+      </w:pPr>
+      <w:r>
+        <w:rPr>
+          <w:rFonts w:ascii="Calibri Light" w:hAnsi="Calibri Light" w:cs="Calibri Light"/>
+        </w:rPr>
+        <w:t xml:space="preserve">IPv6 sustituye el broadcast por el </w:t>
+      </w:r>
+      <w:r>
+        <w:rPr>
+          <w:rFonts w:ascii="Calibri Light" w:hAnsi="Calibri Light" w:cs="Calibri Light"/>
+          <w:b/>
+          <w:bCs/>
+        </w:rPr>
+        <w:t>Multicast</w:t>
+      </w:r>
+      <w:r>
+        <w:rPr>
+          <w:rFonts w:ascii="Calibri Light" w:hAnsi="Calibri Light" w:cs="Calibri Light"/>
+        </w:rPr>
+        <w:t>. Como vimos en el análisis del Punto 7 (dirección FF02::2), esto mejora drásticamente la eficiencia de la red. Solo los dispositivos interesados procesan el tráfico, evitando que todos los hosts de la LAN desperdicien ciclos de CPU analizando paquetes que no les corresponden.</w:t>
+      </w:r>
+    </w:p>
+    <w:p>
+      <w:pPr>
+        <w:rPr>
+          <w:rFonts w:ascii="Calibri Light" w:hAnsi="Calibri Light" w:cs="Calibri Light"/>
+          <w:lang w:val="en-GB"/>
+        </w:rPr>
+      </w:pPr>
+      <w:r>
+        <w:rPr>
+          <w:rFonts w:ascii="Calibri Light" w:hAnsi="Calibri Light" w:cs="Calibri Light"/>
+          <w:lang w:val="en-GB"/>
+        </w:rPr>
+        <w:pict w14:anchorId="5B13BB43">
+          <v:rect id="_x0000_i1031" style="width:0;height:1.5pt" o:hralign="center" o:hrstd="t" o:hr="t" fillcolor="#a0a0a0" stroked="f"/>
+        </w:pict>
+      </w:r>
+    </w:p>
+    <w:p>
+      <w:pPr>
+        <w:rPr>
+          <w:rFonts w:ascii="Calibri Light" w:hAnsi="Calibri Light" w:cs="Calibri Light"/>
+          <w:b/>
+          <w:bCs/>
+        </w:rPr>
+      </w:pPr>
+      <w:r>
+        <w:rPr>
+          <w:rFonts w:ascii="Calibri Light" w:hAnsi="Calibri Light" w:cs="Calibri Light"/>
+          <w:b/>
+          <w:bCs/>
+        </w:rPr>
+        <w:t>5. Conclusión General del Equipo</w:t>
+      </w:r>
+    </w:p>
+    <w:p>
+      <w:pPr>
+        <w:rPr>
+          <w:rFonts w:ascii="Calibri Light" w:hAnsi="Calibri Light" w:cs="Calibri Light"/>
+        </w:rPr>
+      </w:pPr>
+      <w:r>
+        <w:rPr>
+          <w:rFonts w:ascii="Calibri Light" w:hAnsi="Calibri Light" w:cs="Calibri Light"/>
+          <w:i/>
+          <w:iCs/>
+        </w:rPr>
+        <w:t>La realización de este laboratorio permitió contrastar la teoría de la transición a IPv6 con la práctica real en dispositivos Cisco. La implementación de SLAAC y OSPFv3 demuestra que, aunque la configuración inicial requiere mayor atención al enrutamiento unicast y a las direcciones link-local, el resultado es una red más autónoma, eficiente y escalable. Superar retos técnicos como la saturación de buffers en simulación y la gestión de adyacencias dinámicas fortaleció nuestra capacidad de diagnóstico en redes de próxima generación.</w:t>
       </w:r>
     </w:p>
     <w:p>
@@ -6152,8 +5181,121 @@
 </file>
 
 <file path=word/numbering.xml><?xml version="1.0" encoding="utf-8"?>
-<w:numbering xmlns:wpc="http://schemas.microsoft.com/office/word/2010/wordprocessingCanvas" xmlns:cx="http://schemas.microsoft.com/office/drawing/2014/chartex" xmlns:cx1="http://schemas.microsoft.com/office/drawing/2015/9/8/chartex" xmlns:cx2="http://schemas.microsoft.com/office/drawing/2015/10/21/chartex" xmlns:cx3="http://schemas.microsoft.com/office/drawing/2016/5/9/chartex" xmlns:cx4="http://schemas.microsoft.com/office/drawing/2016/5/10/chartex" xmlns:cx5="http://schemas.microsoft.com/office/drawing/2016/5/11/chartex" xmlns:cx6="http://schemas.microsoft.com/office/drawing/2016/5/12/chartex" xmlns:cx7="http://schemas.microsoft.com/office/drawing/2016/5/13/chartex" xmlns:cx8="http://schemas.microsoft.com/office/drawing/2016/5/14/chartex" xmlns:mc="http://schemas.openxmlformats.org/markup-compatibility/2006" xmlns:aink="http://schemas.microsoft.com/office/drawing/2016/ink" xmlns:am3d="http://schemas.microsoft.com/office/drawing/2017/model3d" xmlns:o="urn:schemas-microsoft-com:office:office" xmlns:r="http://schemas.openxmlformats.org/officeDocument/2006/relationships" xmlns:m="http://schemas.openxmlformats.org/officeDocument/2006/math" xmlns:v="urn:schemas-microsoft-com:vml" xmlns:wp14="http://schemas.microsoft.com/office/word/2010/wordprocessingDrawing" xmlns:wp="http://schemas.openxmlformats.org/drawingml/2006/wordprocessingDrawing" xmlns:w10="urn:schemas-microsoft-com:office:word" xmlns:w="http://schemas.openxmlformats.org/wordprocessingml/2006/main" xmlns:w14="http://schemas.microsoft.com/office/word/2010/wordml" xmlns:w15="http://schemas.microsoft.com/office/word/2012/wordml" xmlns:w16cex="http://schemas.microsoft.com/office/word/2018/wordml/cex" xmlns:w16cid="http://schemas.microsoft.com/office/word/2016/wordml/cid" xmlns:w16="http://schemas.microsoft.com/office/word/2018/wordml" xmlns:w16sdtdh="http://schemas.microsoft.com/office/word/2020/wordml/sdtdatahash" xmlns:w16se="http://schemas.microsoft.com/office/word/2015/wordml/symex" xmlns:wpg="http://schemas.microsoft.com/office/word/2010/wordprocessingGroup" xmlns:wpi="http://schemas.microsoft.com/office/word/2010/wordprocessingInk" xmlns:wne="http://schemas.microsoft.com/office/word/2006/wordml" xmlns:wps="http://schemas.microsoft.com/office/word/2010/wordprocessingShape" mc:Ignorable="w14 w15 w16se w16cid w16 w16cex w16sdtdh wp14">
+<w:numbering xmlns:wpc="http://schemas.microsoft.com/office/word/2010/wordprocessingCanvas" xmlns:cx="http://schemas.microsoft.com/office/drawing/2014/chartex" xmlns:cx1="http://schemas.microsoft.com/office/drawing/2015/9/8/chartex" xmlns:cx2="http://schemas.microsoft.com/office/drawing/2015/10/21/chartex" xmlns:cx3="http://schemas.microsoft.com/office/drawing/2016/5/9/chartex" xmlns:cx4="http://schemas.microsoft.com/office/drawing/2016/5/10/chartex" xmlns:cx5="http://schemas.microsoft.com/office/drawing/2016/5/11/chartex" xmlns:cx6="http://schemas.microsoft.com/office/drawing/2016/5/12/chartex" xmlns:cx7="http://schemas.microsoft.com/office/drawing/2016/5/13/chartex" xmlns:cx8="http://schemas.microsoft.com/office/drawing/2016/5/14/chartex" xmlns:mc="http://schemas.openxmlformats.org/markup-compatibility/2006" xmlns:aink="http://schemas.microsoft.com/office/drawing/2016/ink" xmlns:am3d="http://schemas.microsoft.com/office/drawing/2017/model3d" xmlns:o="urn:schemas-microsoft-com:office:office" xmlns:oel="http://schemas.microsoft.com/office/2019/extlst" xmlns:r="http://schemas.openxmlformats.org/officeDocument/2006/relationships" xmlns:m="http://schemas.openxmlformats.org/officeDocument/2006/math" xmlns:v="urn:schemas-microsoft-com:vml" xmlns:wp14="http://schemas.microsoft.com/office/word/2010/wordprocessingDrawing" xmlns:wp="http://schemas.openxmlformats.org/drawingml/2006/wordprocessingDrawing" xmlns:w10="urn:schemas-microsoft-com:office:word" xmlns:w="http://schemas.openxmlformats.org/wordprocessingml/2006/main" xmlns:w14="http://schemas.microsoft.com/office/word/2010/wordml" xmlns:w15="http://schemas.microsoft.com/office/word/2012/wordml" xmlns:w16cex="http://schemas.microsoft.com/office/word/2018/wordml/cex" xmlns:w16cid="http://schemas.microsoft.com/office/word/2016/wordml/cid" xmlns:w16="http://schemas.microsoft.com/office/word/2018/wordml" xmlns:w16du="http://schemas.microsoft.com/office/word/2023/wordml/word16du" xmlns:w16sdtdh="http://schemas.microsoft.com/office/word/2020/wordml/sdtdatahash" xmlns:w16sdtfl="http://schemas.microsoft.com/office/word/2024/wordml/sdtformatlock" xmlns:w16se="http://schemas.microsoft.com/office/word/2015/wordml/symex" xmlns:wpg="http://schemas.microsoft.com/office/word/2010/wordprocessingGroup" xmlns:wpi="http://schemas.microsoft.com/office/word/2010/wordprocessingInk" xmlns:wne="http://schemas.microsoft.com/office/word/2006/wordml" xmlns:wps="http://schemas.microsoft.com/office/word/2010/wordprocessingShape" mc:Ignorable="w14 w15 w16se w16cid w16 w16cex w16sdtdh w16sdtfl w16du wp14">
   <w:abstractNum w:abstractNumId="0" w15:restartNumberingAfterBreak="0">
+    <w:nsid w:val="142E6646"/>
+    <w:multiLevelType w:val="multilevel"/>
+    <w:tmpl w:val="8ECA51CC"/>
+    <w:lvl w:ilvl="0">
+      <w:start w:val="1"/>
+      <w:numFmt w:val="decimal"/>
+      <w:lvlText w:val="%1."/>
+      <w:lvlJc w:val="left"/>
+      <w:pPr>
+        <w:tabs>
+          <w:tab w:val="num" w:pos="720"/>
+        </w:tabs>
+        <w:ind w:left="720" w:hanging="360"/>
+      </w:pPr>
+    </w:lvl>
+    <w:lvl w:ilvl="1" w:tentative="1">
+      <w:start w:val="1"/>
+      <w:numFmt w:val="decimal"/>
+      <w:lvlText w:val="%2."/>
+      <w:lvlJc w:val="left"/>
+      <w:pPr>
+        <w:tabs>
+          <w:tab w:val="num" w:pos="1440"/>
+        </w:tabs>
+        <w:ind w:left="1440" w:hanging="360"/>
+      </w:pPr>
+    </w:lvl>
+    <w:lvl w:ilvl="2" w:tentative="1">
+      <w:start w:val="1"/>
+      <w:numFmt w:val="decimal"/>
+      <w:lvlText w:val="%3."/>
+      <w:lvlJc w:val="left"/>
+      <w:pPr>
+        <w:tabs>
+          <w:tab w:val="num" w:pos="2160"/>
+        </w:tabs>
+        <w:ind w:left="2160" w:hanging="360"/>
+      </w:pPr>
+    </w:lvl>
+    <w:lvl w:ilvl="3" w:tentative="1">
+      <w:start w:val="1"/>
+      <w:numFmt w:val="decimal"/>
+      <w:lvlText w:val="%4."/>
+      <w:lvlJc w:val="left"/>
+      <w:pPr>
+        <w:tabs>
+          <w:tab w:val="num" w:pos="2880"/>
+        </w:tabs>
+        <w:ind w:left="2880" w:hanging="360"/>
+      </w:pPr>
+    </w:lvl>
+    <w:lvl w:ilvl="4" w:tentative="1">
+      <w:start w:val="1"/>
+      <w:numFmt w:val="decimal"/>
+      <w:lvlText w:val="%5."/>
+      <w:lvlJc w:val="left"/>
+      <w:pPr>
+        <w:tabs>
+          <w:tab w:val="num" w:pos="3600"/>
+        </w:tabs>
+        <w:ind w:left="3600" w:hanging="360"/>
+      </w:pPr>
+    </w:lvl>
+    <w:lvl w:ilvl="5" w:tentative="1">
+      <w:start w:val="1"/>
+      <w:numFmt w:val="decimal"/>
+      <w:lvlText w:val="%6."/>
+      <w:lvlJc w:val="left"/>
+      <w:pPr>
+        <w:tabs>
+          <w:tab w:val="num" w:pos="4320"/>
+        </w:tabs>
+        <w:ind w:left="4320" w:hanging="360"/>
+      </w:pPr>
+    </w:lvl>
+    <w:lvl w:ilvl="6" w:tentative="1">
+      <w:start w:val="1"/>
+      <w:numFmt w:val="decimal"/>
+      <w:lvlText w:val="%7."/>
+      <w:lvlJc w:val="left"/>
+      <w:pPr>
+        <w:tabs>
+          <w:tab w:val="num" w:pos="5040"/>
+        </w:tabs>
+        <w:ind w:left="5040" w:hanging="360"/>
+      </w:pPr>
+    </w:lvl>
+    <w:lvl w:ilvl="7" w:tentative="1">
+      <w:start w:val="1"/>
+      <w:numFmt w:val="decimal"/>
+      <w:lvlText w:val="%8."/>
+      <w:lvlJc w:val="left"/>
+      <w:pPr>
+        <w:tabs>
+          <w:tab w:val="num" w:pos="5760"/>
+        </w:tabs>
+        <w:ind w:left="5760" w:hanging="360"/>
+      </w:pPr>
+    </w:lvl>
+    <w:lvl w:ilvl="8" w:tentative="1">
+      <w:start w:val="1"/>
+      <w:numFmt w:val="decimal"/>
+      <w:lvlText w:val="%9."/>
+      <w:lvlJc w:val="left"/>
+      <w:pPr>
+        <w:tabs>
+          <w:tab w:val="num" w:pos="6480"/>
+        </w:tabs>
+        <w:ind w:left="6480" w:hanging="360"/>
+      </w:pPr>
+    </w:lvl>
+  </w:abstractNum>
+  <w:abstractNum w:abstractNumId="1" w15:restartNumberingAfterBreak="0">
     <w:nsid w:val="1EBD6B54"/>
     <w:multiLevelType w:val="multilevel"/>
     <w:tmpl w:val="AB706198"/>
@@ -6302,7 +5444,7 @@
       </w:rPr>
     </w:lvl>
   </w:abstractNum>
-  <w:abstractNum w:abstractNumId="1" w15:restartNumberingAfterBreak="0">
+  <w:abstractNum w:abstractNumId="2" w15:restartNumberingAfterBreak="0">
     <w:nsid w:val="2B03417D"/>
     <w:multiLevelType w:val="hybridMultilevel"/>
     <w:tmpl w:val="CDD2A302"/>
@@ -6415,7 +5557,7 @@
       </w:rPr>
     </w:lvl>
   </w:abstractNum>
-  <w:abstractNum w:abstractNumId="2" w15:restartNumberingAfterBreak="0">
+  <w:abstractNum w:abstractNumId="3" w15:restartNumberingAfterBreak="0">
     <w:nsid w:val="38DC1670"/>
     <w:multiLevelType w:val="hybridMultilevel"/>
     <w:tmpl w:val="0BE842EC"/>
@@ -6528,7 +5670,7 @@
       </w:rPr>
     </w:lvl>
   </w:abstractNum>
-  <w:abstractNum w:abstractNumId="3" w15:restartNumberingAfterBreak="0">
+  <w:abstractNum w:abstractNumId="4" w15:restartNumberingAfterBreak="0">
     <w:nsid w:val="3E6C6D7E"/>
     <w:multiLevelType w:val="multilevel"/>
     <w:tmpl w:val="7F066CF2"/>
@@ -6641,7 +5783,7 @@
       </w:pPr>
     </w:lvl>
   </w:abstractNum>
-  <w:abstractNum w:abstractNumId="4" w15:restartNumberingAfterBreak="0">
+  <w:abstractNum w:abstractNumId="5" w15:restartNumberingAfterBreak="0">
     <w:nsid w:val="5436629F"/>
     <w:multiLevelType w:val="hybridMultilevel"/>
     <w:tmpl w:val="5190602E"/>
@@ -6730,7 +5872,7 @@
       </w:pPr>
     </w:lvl>
   </w:abstractNum>
-  <w:abstractNum w:abstractNumId="5" w15:restartNumberingAfterBreak="0">
+  <w:abstractNum w:abstractNumId="6" w15:restartNumberingAfterBreak="0">
     <w:nsid w:val="695123E2"/>
     <w:multiLevelType w:val="multilevel"/>
     <w:tmpl w:val="B574CB48"/>
@@ -6879,7 +6021,7 @@
       </w:rPr>
     </w:lvl>
   </w:abstractNum>
-  <w:abstractNum w:abstractNumId="6" w15:restartNumberingAfterBreak="0">
+  <w:abstractNum w:abstractNumId="7" w15:restartNumberingAfterBreak="0">
     <w:nsid w:val="7EF26C7D"/>
     <w:multiLevelType w:val="multilevel"/>
     <w:tmpl w:val="A04645C8"/>
@@ -6992,23 +6134,23 @@
       </w:pPr>
     </w:lvl>
   </w:abstractNum>
-  <w:num w:numId="1">
-    <w:abstractNumId w:val="1"/>
+  <w:num w:numId="1" w16cid:durableId="782500860">
+    <w:abstractNumId w:val="2"/>
   </w:num>
-  <w:num w:numId="2">
-    <w:abstractNumId w:val="4"/>
-  </w:num>
-  <w:num w:numId="3">
+  <w:num w:numId="2" w16cid:durableId="1055620573">
     <w:abstractNumId w:val="5"/>
   </w:num>
-  <w:num w:numId="4">
+  <w:num w:numId="3" w16cid:durableId="2074423383">
     <w:abstractNumId w:val="6"/>
   </w:num>
-  <w:num w:numId="5">
-    <w:abstractNumId w:val="2"/>
+  <w:num w:numId="4" w16cid:durableId="776485836">
+    <w:abstractNumId w:val="7"/>
   </w:num>
-  <w:num w:numId="6">
+  <w:num w:numId="5" w16cid:durableId="1086420587">
     <w:abstractNumId w:val="3"/>
+  </w:num>
+  <w:num w:numId="6" w16cid:durableId="1856798346">
+    <w:abstractNumId w:val="4"/>
     <w:lvlOverride w:ilvl="0">
       <w:startOverride w:val="1"/>
     </w:lvlOverride>
@@ -7037,14 +6179,17 @@
       <w:startOverride w:val="1"/>
     </w:lvlOverride>
   </w:num>
-  <w:num w:numId="7">
+  <w:num w:numId="7" w16cid:durableId="615135497">
+    <w:abstractNumId w:val="1"/>
+  </w:num>
+  <w:num w:numId="8" w16cid:durableId="1044526234">
     <w:abstractNumId w:val="0"/>
   </w:num>
 </w:numbering>
 </file>
 
 <file path=word/styles.xml><?xml version="1.0" encoding="utf-8"?>
-<w:styles xmlns:mc="http://schemas.openxmlformats.org/markup-compatibility/2006" xmlns:r="http://schemas.openxmlformats.org/officeDocument/2006/relationships" xmlns:w="http://schemas.openxmlformats.org/wordprocessingml/2006/main" xmlns:w14="http://schemas.microsoft.com/office/word/2010/wordml" xmlns:w15="http://schemas.microsoft.com/office/word/2012/wordml" xmlns:w16cex="http://schemas.microsoft.com/office/word/2018/wordml/cex" xmlns:w16cid="http://schemas.microsoft.com/office/word/2016/wordml/cid" xmlns:w16="http://schemas.microsoft.com/office/word/2018/wordml" xmlns:w16sdtdh="http://schemas.microsoft.com/office/word/2020/wordml/sdtdatahash" xmlns:w16se="http://schemas.microsoft.com/office/word/2015/wordml/symex" mc:Ignorable="w14 w15 w16se w16cid w16 w16cex w16sdtdh">
+<w:styles xmlns:mc="http://schemas.openxmlformats.org/markup-compatibility/2006" xmlns:r="http://schemas.openxmlformats.org/officeDocument/2006/relationships" xmlns:w="http://schemas.openxmlformats.org/wordprocessingml/2006/main" xmlns:w14="http://schemas.microsoft.com/office/word/2010/wordml" xmlns:w15="http://schemas.microsoft.com/office/word/2012/wordml" xmlns:w16cex="http://schemas.microsoft.com/office/word/2018/wordml/cex" xmlns:w16cid="http://schemas.microsoft.com/office/word/2016/wordml/cid" xmlns:w16="http://schemas.microsoft.com/office/word/2018/wordml" xmlns:w16du="http://schemas.microsoft.com/office/word/2023/wordml/word16du" xmlns:w16sdtdh="http://schemas.microsoft.com/office/word/2020/wordml/sdtdatahash" xmlns:w16sdtfl="http://schemas.microsoft.com/office/word/2024/wordml/sdtformatlock" xmlns:w16se="http://schemas.microsoft.com/office/word/2015/wordml/symex" mc:Ignorable="w14 w15 w16se w16cid w16 w16cex w16sdtdh w16sdtfl w16du">
   <w:docDefaults>
     <w:rPrDefault>
       <w:rPr>
@@ -7445,11 +6590,11 @@
       <w:lang w:val="es-CO"/>
     </w:rPr>
   </w:style>
-  <w:style w:type="paragraph" w:styleId="Heading3">
+  <w:style w:type="paragraph" w:styleId="Ttulo3">
     <w:name w:val="heading 3"/>
     <w:basedOn w:val="Normal"/>
     <w:next w:val="Normal"/>
-    <w:link w:val="Heading3Char"/>
+    <w:link w:val="Ttulo3Car"/>
     <w:uiPriority w:val="9"/>
     <w:semiHidden/>
     <w:unhideWhenUsed/>
@@ -7468,11 +6613,11 @@
       <w:szCs w:val="24"/>
     </w:rPr>
   </w:style>
-  <w:style w:type="paragraph" w:styleId="Heading4">
+  <w:style w:type="paragraph" w:styleId="Ttulo4">
     <w:name w:val="heading 4"/>
     <w:basedOn w:val="Normal"/>
     <w:next w:val="Normal"/>
-    <w:link w:val="Heading4Char"/>
+    <w:link w:val="Ttulo4Car"/>
     <w:uiPriority w:val="9"/>
     <w:semiHidden/>
     <w:unhideWhenUsed/>
@@ -7491,13 +6636,12 @@
       <w:color w:val="2F5496" w:themeColor="accent1" w:themeShade="BF"/>
     </w:rPr>
   </w:style>
-  <w:style w:type="character" w:default="1" w:styleId="DefaultParagraphFont">
+  <w:style w:type="character" w:default="1" w:styleId="Fuentedeprrafopredeter">
     <w:name w:val="Default Paragraph Font"/>
     <w:uiPriority w:val="1"/>
-    <w:semiHidden/>
     <w:unhideWhenUsed/>
   </w:style>
-  <w:style w:type="table" w:default="1" w:styleId="TableNormal">
+  <w:style w:type="table" w:default="1" w:styleId="Tablanormal">
     <w:name w:val="Normal Table"/>
     <w:uiPriority w:val="99"/>
     <w:semiHidden/>
@@ -7512,13 +6656,13 @@
       </w:tblCellMar>
     </w:tblPr>
   </w:style>
-  <w:style w:type="numbering" w:default="1" w:styleId="NoList">
+  <w:style w:type="numbering" w:default="1" w:styleId="Sinlista">
     <w:name w:val="No List"/>
     <w:uiPriority w:val="99"/>
     <w:semiHidden/>
     <w:unhideWhenUsed/>
   </w:style>
-  <w:style w:type="paragraph" w:styleId="ListParagraph">
+  <w:style w:type="paragraph" w:styleId="Prrafodelista">
     <w:name w:val="List Paragraph"/>
     <w:basedOn w:val="Normal"/>
     <w:uiPriority w:val="34"/>
@@ -7529,9 +6673,9 @@
       <w:contextualSpacing/>
     </w:pPr>
   </w:style>
-  <w:style w:type="character" w:styleId="Hyperlink">
+  <w:style w:type="character" w:styleId="Hipervnculo">
     <w:name w:val="Hyperlink"/>
-    <w:basedOn w:val="DefaultParagraphFont"/>
+    <w:basedOn w:val="Fuentedeprrafopredeter"/>
     <w:uiPriority w:val="99"/>
     <w:unhideWhenUsed/>
     <w:rsid w:val="00F970A9"/>
@@ -7540,9 +6684,9 @@
       <w:u w:val="single"/>
     </w:rPr>
   </w:style>
-  <w:style w:type="character" w:styleId="UnresolvedMention">
+  <w:style w:type="character" w:styleId="Mencinsinresolver">
     <w:name w:val="Unresolved Mention"/>
-    <w:basedOn w:val="DefaultParagraphFont"/>
+    <w:basedOn w:val="Fuentedeprrafopredeter"/>
     <w:uiPriority w:val="99"/>
     <w:semiHidden/>
     <w:unhideWhenUsed/>
@@ -7552,10 +6696,10 @@
       <w:shd w:val="clear" w:color="auto" w:fill="E1DFDD"/>
     </w:rPr>
   </w:style>
-  <w:style w:type="character" w:customStyle="1" w:styleId="Heading3Char">
-    <w:name w:val="Heading 3 Char"/>
-    <w:basedOn w:val="DefaultParagraphFont"/>
-    <w:link w:val="Heading3"/>
+  <w:style w:type="character" w:customStyle="1" w:styleId="Ttulo3Car">
+    <w:name w:val="Título 3 Car"/>
+    <w:basedOn w:val="Fuentedeprrafopredeter"/>
+    <w:link w:val="Ttulo3"/>
     <w:uiPriority w:val="9"/>
     <w:semiHidden/>
     <w:rsid w:val="00C218BD"/>
@@ -7566,10 +6710,10 @@
       <w:szCs w:val="24"/>
     </w:rPr>
   </w:style>
-  <w:style w:type="character" w:customStyle="1" w:styleId="Heading4Char">
-    <w:name w:val="Heading 4 Char"/>
-    <w:basedOn w:val="DefaultParagraphFont"/>
-    <w:link w:val="Heading4"/>
+  <w:style w:type="character" w:customStyle="1" w:styleId="Ttulo4Car">
+    <w:name w:val="Título 4 Car"/>
+    <w:basedOn w:val="Fuentedeprrafopredeter"/>
+    <w:link w:val="Ttulo4"/>
     <w:uiPriority w:val="9"/>
     <w:semiHidden/>
     <w:rsid w:val="00C218BD"/>
@@ -7580,9 +6724,9 @@
       <w:color w:val="2F5496" w:themeColor="accent1" w:themeShade="BF"/>
     </w:rPr>
   </w:style>
-  <w:style w:type="table" w:styleId="TableGrid">
+  <w:style w:type="table" w:styleId="Tablaconcuadrcula">
     <w:name w:val="Table Grid"/>
-    <w:basedOn w:val="TableNormal"/>
+    <w:basedOn w:val="Tablanormal"/>
     <w:uiPriority w:val="39"/>
     <w:rsid w:val="00592EBA"/>
     <w:pPr>

</xml_diff>